<commit_message>
Finalize Assignment 3 feedback revisions
</commit_message>
<xml_diff>
--- a/knhanes_hypertension_report.docx
+++ b/knhanes_hypertension_report.docx
@@ -4,27 +4,52 @@
   <w:body>
     <w:p>
       <w:pPr>
-        <w:jc w:val="center"/>
+        <w:spacing w:before="320" w:after="140" w:line="295" w:lineRule="auto"/>
+        <w:jc w:val="both"/>
+        <w:shd w:fill="EAF3FB"/>
+        <w:pBdr>
+          <w:bottom w:val="single" w:sz="10" w:space="4" w:color="B7D7F0"/>
+        </w:pBdr>
       </w:pPr>
       <w:r>
         <w:rPr>
-          <w:rFonts w:ascii="Malgun Gothic" w:hAnsi="Malgun Gothic"/>
+          <w:rFonts w:ascii="Arial" w:hAnsi="Arial" w:eastAsia="Malgun Gothic"/>
           <w:b/>
-          <w:sz w:val="34"/>
+          <w:color w:val="14315C"/>
+          <w:sz w:val="21"/>
         </w:rPr>
         <w:t>KNHANES 데이터를 활용한 젊은 성인 고혈압 위험 예측</w:t>
       </w:r>
     </w:p>
     <w:p>
       <w:pPr>
+        <w:spacing w:after="140" w:line="295" w:lineRule="auto"/>
+        <w:jc w:val="both"/>
+      </w:pPr>
+      <w:r>
+        <w:rPr>
+          <w:rFonts w:ascii="Arial" w:hAnsi="Arial" w:eastAsia="Malgun Gothic"/>
+          <w:b w:val="0"/>
+          <w:color w:val="505050"/>
+          <w:sz w:val="21"/>
+        </w:rPr>
+        <w:t>Advanced Data Analysis Assignment 3 Final Report</w:t>
+      </w:r>
+    </w:p>
+    <w:p>
+      <w:pPr>
+        <w:pStyle w:val="Caption"/>
+        <w:spacing w:before="80" w:after="140"/>
         <w:jc w:val="center"/>
       </w:pPr>
       <w:r>
         <w:rPr>
-          <w:rFonts w:ascii="Malgun Gothic" w:hAnsi="Malgun Gothic"/>
-          <w:sz w:val="22"/>
+          <w:rFonts w:ascii="Arial" w:hAnsi="Arial" w:eastAsia="Malgun Gothic"/>
+          <w:b w:val="0"/>
+          <w:color w:val="5A5A5A"/>
+          <w:sz w:val="18"/>
         </w:rPr>
-        <w:t>Advanced Data Analysis Assignment 3 Final Report</w:t>
+        <w:t>표 1. 팀 구성 및 역할</w:t>
       </w:r>
     </w:p>
     <w:tbl>
@@ -32,6 +57,7 @@
         <w:tblStyle w:val="TableGrid"/>
         <w:tblW w:type="auto" w:w="0"/>
         <w:jc w:val="center"/>
+        <w:tblLayout w:type="autofit"/>
         <w:tblLook w:firstColumn="1" w:firstRow="1" w:lastColumn="0" w:lastRow="0" w:noHBand="0" w:noVBand="1" w:val="04A0"/>
       </w:tblPr>
       <w:tblGrid>
@@ -44,13 +70,18 @@
           <w:tcPr>
             <w:tcW w:type="dxa" w:w="3264"/>
             <w:vAlign w:val="center"/>
+            <w:shd w:fill="D9EAF7"/>
           </w:tcPr>
           <w:p>
+            <w:pPr>
+              <w:spacing w:before="20" w:after="20" w:line="252" w:lineRule="auto"/>
+            </w:pPr>
             <w:r>
               <w:rPr>
-                <w:rFonts w:ascii="Malgun Gothic" w:hAnsi="Malgun Gothic"/>
+                <w:rFonts w:ascii="Arial" w:hAnsi="Arial" w:eastAsia="Malgun Gothic"/>
                 <w:b/>
-                <w:sz w:val="19"/>
+                <w:color w:val="14315C"/>
+                <w:sz w:val="18"/>
               </w:rPr>
               <w:t>이름</w:t>
             </w:r>
@@ -60,13 +91,18 @@
           <w:tcPr>
             <w:tcW w:type="dxa" w:w="3264"/>
             <w:vAlign w:val="center"/>
+            <w:shd w:fill="D9EAF7"/>
           </w:tcPr>
           <w:p>
+            <w:pPr>
+              <w:spacing w:before="20" w:after="20" w:line="252" w:lineRule="auto"/>
+            </w:pPr>
             <w:r>
               <w:rPr>
-                <w:rFonts w:ascii="Malgun Gothic" w:hAnsi="Malgun Gothic"/>
+                <w:rFonts w:ascii="Arial" w:hAnsi="Arial" w:eastAsia="Malgun Gothic"/>
                 <w:b/>
-                <w:sz w:val="19"/>
+                <w:color w:val="14315C"/>
+                <w:sz w:val="18"/>
               </w:rPr>
               <w:t>학번</w:t>
             </w:r>
@@ -76,13 +112,18 @@
           <w:tcPr>
             <w:tcW w:type="dxa" w:w="3264"/>
             <w:vAlign w:val="center"/>
+            <w:shd w:fill="D9EAF7"/>
           </w:tcPr>
           <w:p>
+            <w:pPr>
+              <w:spacing w:before="20" w:after="20" w:line="252" w:lineRule="auto"/>
+            </w:pPr>
             <w:r>
               <w:rPr>
-                <w:rFonts w:ascii="Malgun Gothic" w:hAnsi="Malgun Gothic"/>
+                <w:rFonts w:ascii="Arial" w:hAnsi="Arial" w:eastAsia="Malgun Gothic"/>
                 <w:b/>
-                <w:sz w:val="19"/>
+                <w:color w:val="14315C"/>
+                <w:sz w:val="18"/>
               </w:rPr>
               <w:t>역할</w:t>
             </w:r>
@@ -96,11 +137,15 @@
             <w:vAlign w:val="center"/>
           </w:tcPr>
           <w:p>
+            <w:pPr>
+              <w:spacing w:before="20" w:after="20" w:line="252" w:lineRule="auto"/>
+            </w:pPr>
             <w:r>
               <w:rPr>
-                <w:rFonts w:ascii="Malgun Gothic" w:hAnsi="Malgun Gothic"/>
+                <w:rFonts w:ascii="Arial" w:hAnsi="Arial" w:eastAsia="Malgun Gothic"/>
                 <w:b w:val="0"/>
-                <w:sz w:val="19"/>
+                <w:color w:val="000000"/>
+                <w:sz w:val="18"/>
               </w:rPr>
               <w:t>Jiarui Wu</w:t>
             </w:r>
@@ -112,11 +157,15 @@
             <w:vAlign w:val="center"/>
           </w:tcPr>
           <w:p>
+            <w:pPr>
+              <w:spacing w:before="20" w:after="20" w:line="252" w:lineRule="auto"/>
+            </w:pPr>
             <w:r>
               <w:rPr>
-                <w:rFonts w:ascii="Malgun Gothic" w:hAnsi="Malgun Gothic"/>
+                <w:rFonts w:ascii="Arial" w:hAnsi="Arial" w:eastAsia="Malgun Gothic"/>
                 <w:b w:val="0"/>
-                <w:sz w:val="19"/>
+                <w:color w:val="000000"/>
+                <w:sz w:val="18"/>
               </w:rPr>
               <w:t>2024106039</w:t>
             </w:r>
@@ -128,11 +177,15 @@
             <w:vAlign w:val="center"/>
           </w:tcPr>
           <w:p>
+            <w:pPr>
+              <w:spacing w:before="20" w:after="20" w:line="252" w:lineRule="auto"/>
+            </w:pPr>
             <w:r>
               <w:rPr>
-                <w:rFonts w:ascii="Malgun Gothic" w:hAnsi="Malgun Gothic"/>
+                <w:rFonts w:ascii="Arial" w:hAnsi="Arial" w:eastAsia="Malgun Gothic"/>
                 <w:b w:val="0"/>
-                <w:sz w:val="19"/>
+                <w:color w:val="000000"/>
+                <w:sz w:val="18"/>
               </w:rPr>
               <w:t>데이터 수집 및 전처리</w:t>
             </w:r>
@@ -146,11 +199,15 @@
             <w:vAlign w:val="center"/>
           </w:tcPr>
           <w:p>
+            <w:pPr>
+              <w:spacing w:before="20" w:after="20" w:line="252" w:lineRule="auto"/>
+            </w:pPr>
             <w:r>
               <w:rPr>
-                <w:rFonts w:ascii="Malgun Gothic" w:hAnsi="Malgun Gothic"/>
+                <w:rFonts w:ascii="Arial" w:hAnsi="Arial" w:eastAsia="Malgun Gothic"/>
                 <w:b w:val="0"/>
-                <w:sz w:val="19"/>
+                <w:color w:val="000000"/>
+                <w:sz w:val="18"/>
               </w:rPr>
               <w:t>Micai Wang</w:t>
             </w:r>
@@ -162,11 +219,15 @@
             <w:vAlign w:val="center"/>
           </w:tcPr>
           <w:p>
+            <w:pPr>
+              <w:spacing w:before="20" w:after="20" w:line="252" w:lineRule="auto"/>
+            </w:pPr>
             <w:r>
               <w:rPr>
-                <w:rFonts w:ascii="Malgun Gothic" w:hAnsi="Malgun Gothic"/>
+                <w:rFonts w:ascii="Arial" w:hAnsi="Arial" w:eastAsia="Malgun Gothic"/>
                 <w:b w:val="0"/>
-                <w:sz w:val="19"/>
+                <w:color w:val="000000"/>
+                <w:sz w:val="18"/>
               </w:rPr>
               <w:t>2024106071</w:t>
             </w:r>
@@ -178,11 +239,15 @@
             <w:vAlign w:val="center"/>
           </w:tcPr>
           <w:p>
+            <w:pPr>
+              <w:spacing w:before="20" w:after="20" w:line="252" w:lineRule="auto"/>
+            </w:pPr>
             <w:r>
               <w:rPr>
-                <w:rFonts w:ascii="Malgun Gothic" w:hAnsi="Malgun Gothic"/>
+                <w:rFonts w:ascii="Arial" w:hAnsi="Arial" w:eastAsia="Malgun Gothic"/>
                 <w:b w:val="0"/>
-                <w:sz w:val="19"/>
+                <w:color w:val="000000"/>
+                <w:sz w:val="18"/>
               </w:rPr>
               <w:t>보고서 작성 및 발표</w:t>
             </w:r>
@@ -196,11 +261,15 @@
             <w:vAlign w:val="center"/>
           </w:tcPr>
           <w:p>
+            <w:pPr>
+              <w:spacing w:before="20" w:after="20" w:line="252" w:lineRule="auto"/>
+            </w:pPr>
             <w:r>
               <w:rPr>
-                <w:rFonts w:ascii="Malgun Gothic" w:hAnsi="Malgun Gothic"/>
+                <w:rFonts w:ascii="Arial" w:hAnsi="Arial" w:eastAsia="Malgun Gothic"/>
                 <w:b w:val="0"/>
-                <w:sz w:val="19"/>
+                <w:color w:val="000000"/>
+                <w:sz w:val="18"/>
               </w:rPr>
               <w:t>Vu Thuy Anh Dinh</w:t>
             </w:r>
@@ -212,11 +281,15 @@
             <w:vAlign w:val="center"/>
           </w:tcPr>
           <w:p>
+            <w:pPr>
+              <w:spacing w:before="20" w:after="20" w:line="252" w:lineRule="auto"/>
+            </w:pPr>
             <w:r>
               <w:rPr>
-                <w:rFonts w:ascii="Malgun Gothic" w:hAnsi="Malgun Gothic"/>
+                <w:rFonts w:ascii="Arial" w:hAnsi="Arial" w:eastAsia="Malgun Gothic"/>
                 <w:b w:val="0"/>
-                <w:sz w:val="19"/>
+                <w:color w:val="000000"/>
+                <w:sz w:val="18"/>
               </w:rPr>
               <w:t>2024106125</w:t>
             </w:r>
@@ -228,11 +301,15 @@
             <w:vAlign w:val="center"/>
           </w:tcPr>
           <w:p>
+            <w:pPr>
+              <w:spacing w:before="20" w:after="20" w:line="252" w:lineRule="auto"/>
+            </w:pPr>
             <w:r>
               <w:rPr>
-                <w:rFonts w:ascii="Malgun Gothic" w:hAnsi="Malgun Gothic"/>
+                <w:rFonts w:ascii="Arial" w:hAnsi="Arial" w:eastAsia="Malgun Gothic"/>
                 <w:b w:val="0"/>
-                <w:sz w:val="19"/>
+                <w:color w:val="000000"/>
+                <w:sz w:val="18"/>
               </w:rPr>
               <w:t>EDA, 모델링 및 시각화</w:t>
             </w:r>
@@ -244,34 +321,111 @@
     <w:p>
       <w:pPr>
         <w:pStyle w:val="Heading1"/>
+        <w:spacing w:before="320" w:after="160"/>
+        <w:pBdr>
+          <w:bottom w:val="single" w:sz="6" w:space="4" w:color="9EC5E8"/>
+        </w:pBdr>
       </w:pPr>
       <w:r>
         <w:rPr>
-          <w:rFonts w:ascii="Malgun Gothic" w:hAnsi="Malgun Gothic"/>
+          <w:rFonts w:ascii="Arial" w:hAnsi="Arial" w:eastAsia="Malgun Gothic"/>
           <w:b/>
+          <w:color w:val="14315C"/>
+          <w:sz w:val="28"/>
+        </w:rPr>
+        <w:t>초록</w:t>
+      </w:r>
+    </w:p>
+    <w:p>
+      <w:pPr>
+        <w:spacing w:line="295" w:lineRule="auto" w:after="140"/>
+        <w:shd w:fill="EAF7EF"/>
+        <w:jc w:val="both"/>
+      </w:pPr>
+      <w:r>
+        <w:rPr>
+          <w:rFonts w:ascii="Arial" w:hAnsi="Arial" w:eastAsia="Malgun Gothic"/>
+          <w:b w:val="0"/>
+          <w:sz w:val="21"/>
+        </w:rPr>
+        <w:t>본 보고서는 KNHANES 2017-2023년 자료를 활용하여 19-39세 한국 젊은 성인의 고혈압 위험을 예측한 수업 프로젝트이다. 과제2에서 사용한 140/90 기준은 젊은 성인에서 고혈압군이 너무 적어 모델이 양성 그룹을 학습하기 어려운 문제가 있었다. 따라서 교수님 피드백을 반영하여 ACC/AHA 2017 기준(SBP &gt;= 130 또는 DBP &gt;= 80)을 주분석 target으로 사용하였다. 또한 COVID period와 측정기기 변화가 분리되기 어렵다는 점을 고려하여, 원자료 분석, batch 보정 민감도 분석, 측정 일관 연도 제한분석을 보조적으로 제시하였다. 모델링은 PyCaret workflow를 기반으로 진행하였고, 최종 결과는 성능 지표, feature importance, SHAP, Streamlit 배포를 함께 정리하였다.</w:t>
+      </w:r>
+    </w:p>
+    <w:p>
+      <w:pPr>
+        <w:spacing w:after="140" w:line="295" w:lineRule="auto"/>
+        <w:jc w:val="both"/>
+      </w:pPr>
+      <w:r>
+        <w:rPr>
+          <w:rFonts w:ascii="Arial" w:hAnsi="Arial" w:eastAsia="Malgun Gothic"/>
+          <w:color w:val="464646"/>
+          <w:sz w:val="21"/>
+        </w:rPr>
+        <w:t>주요어: KNHANES, 젊은 성인, 고혈압, PyCaret, SHAP, Streamlit</w:t>
+      </w:r>
+    </w:p>
+    <w:p>
+      <w:pPr>
+        <w:pStyle w:val="Heading1"/>
+        <w:spacing w:before="320" w:after="160"/>
+        <w:jc w:val="left"/>
+        <w:pBdr>
+          <w:bottom w:val="single" w:sz="6" w:space="4" w:color="9EC5E8"/>
+        </w:pBdr>
+      </w:pPr>
+      <w:r>
+        <w:rPr>
+          <w:rFonts w:ascii="Arial" w:hAnsi="Arial" w:eastAsia="Malgun Gothic"/>
+          <w:b/>
+          <w:color w:val="14315C"/>
           <w:sz w:val="28"/>
         </w:rPr>
         <w:t>1. 연구목적</w:t>
       </w:r>
     </w:p>
     <w:p>
+      <w:pPr>
+        <w:spacing w:line="295" w:lineRule="auto" w:after="140"/>
+        <w:jc w:val="both"/>
+      </w:pPr>
       <w:r>
         <w:rPr>
-          <w:rFonts w:ascii="Malgun Gothic" w:hAnsi="Malgun Gothic"/>
+          <w:rFonts w:ascii="Arial" w:hAnsi="Arial" w:eastAsia="Malgun Gothic"/>
           <w:b w:val="0"/>
           <w:sz w:val="21"/>
         </w:rPr>
-        <w:t>본 프로젝트의 연구주제는 KNHANES 2017-2023년 자료를 활용하여 한국 젊은 성인(19-39세)의 고혈압 위험을 예측하는 것이다. 과제2에서는 140/90 기준을 사용했으나 고혈압군 비율이 약 5% 수준으로 낮아 class imbalance 문제가 컸다. 교수님 피드백 이후 ACC/AHA 2017 기준인 SBP &gt;= 130 또는 DBP &gt;= 80을 주분석 target으로 사용하였다.</w:t>
+        <w:t>본 프로젝트의 연구주제는 KNHANES 2017-2023년 자료를 활용하여 한국 젊은 성인(19-39세)의 고혈압 위험을 예측하는 것이다. 처음에는 일반적으로 많이 알려진 140/90 기준을 사용했지만, 젊은 성인 코호트에서는 고혈압군 비율이 약 5% 수준으로 낮아 class imbalance가 크게 나타났다. 이러한 문제는 모델이 고혈압군을 충분히 학습하지 못하고 다수 그룹에 치우칠 가능성을 높인다. 따라서 교수님 피드백 이후 ACC/AHA 2017 기준인 SBP &gt;= 130 또는 DBP &gt;= 80을 주분석 target으로 사용하였다.</w:t>
       </w:r>
     </w:p>
     <w:p>
+      <w:pPr>
+        <w:spacing w:line="295" w:lineRule="auto" w:after="140"/>
+        <w:jc w:val="both"/>
+      </w:pPr>
       <w:r>
         <w:rPr>
-          <w:rFonts w:ascii="Malgun Gothic" w:hAnsi="Malgun Gothic"/>
+          <w:rFonts w:ascii="Arial" w:hAnsi="Arial" w:eastAsia="Malgun Gothic"/>
           <w:b w:val="0"/>
           <w:sz w:val="21"/>
         </w:rPr>
-        <w:t>젊은 성인의 고혈압은 아직 진단되지 않거나 관리가 늦어질 수 있기 때문에, 건강검진 및 설문 변수를 이용한 위험 예측은 예방적 관점에서 의미가 있다. 본 프로젝트는 의학적 진단 모델이 아니라 수업에서 배운 machine learning screening 과정을 적용해 보는 것을 목표로 한다.</w:t>
+        <w:t>젊은 성인의 고혈압은 아직 진단되지 않거나 관리가 늦어질 수 있기 때문에 예방적 관점에서 중요하다. 선행연구에서는 나이, 성별, BMI, 복부비만, 혈당, 지질, 흡연, 음주, 신체활동, 소득·교육수준과 고혈압의 관련성이 보고되었다. 본 프로젝트는 이러한 요인을 건강검진·설문 변수로 구성하고, 수업에서 배운 machine learning screening 과정을 적용해 위험군을 예측해 보는 것을 목표로 한다.</w:t>
+      </w:r>
+    </w:p>
+    <w:p>
+      <w:pPr>
+        <w:pStyle w:val="Caption"/>
+        <w:spacing w:before="80" w:after="140"/>
+        <w:jc w:val="center"/>
+      </w:pPr>
+      <w:r>
+        <w:rPr>
+          <w:rFonts w:ascii="Arial" w:hAnsi="Arial" w:eastAsia="Malgun Gothic"/>
+          <w:b w:val="0"/>
+          <w:color w:val="5A5A5A"/>
+          <w:sz w:val="18"/>
+        </w:rPr>
+        <w:t>표 2. 변수 선정 근거</w:t>
       </w:r>
     </w:p>
     <w:tbl>
@@ -279,6 +433,7 @@
         <w:tblStyle w:val="TableGrid"/>
         <w:tblW w:type="auto" w:w="0"/>
         <w:jc w:val="center"/>
+        <w:tblLayout w:type="autofit"/>
         <w:tblLook w:firstColumn="1" w:firstRow="1" w:lastColumn="0" w:lastRow="0" w:noHBand="0" w:noVBand="1" w:val="04A0"/>
       </w:tblPr>
       <w:tblGrid>
@@ -290,13 +445,18 @@
           <w:tcPr>
             <w:tcW w:type="dxa" w:w="4896"/>
             <w:vAlign w:val="center"/>
+            <w:shd w:fill="D9EAF7"/>
           </w:tcPr>
           <w:p>
+            <w:pPr>
+              <w:spacing w:before="20" w:after="20" w:line="252" w:lineRule="auto"/>
+            </w:pPr>
             <w:r>
               <w:rPr>
-                <w:rFonts w:ascii="Malgun Gothic" w:hAnsi="Malgun Gothic"/>
+                <w:rFonts w:ascii="Arial" w:hAnsi="Arial" w:eastAsia="Malgun Gothic"/>
                 <w:b/>
-                <w:sz w:val="19"/>
+                <w:color w:val="14315C"/>
+                <w:sz w:val="18"/>
               </w:rPr>
               <w:t>변수</w:t>
             </w:r>
@@ -306,13 +466,18 @@
           <w:tcPr>
             <w:tcW w:type="dxa" w:w="4896"/>
             <w:vAlign w:val="center"/>
+            <w:shd w:fill="D9EAF7"/>
           </w:tcPr>
           <w:p>
+            <w:pPr>
+              <w:spacing w:before="20" w:after="20" w:line="252" w:lineRule="auto"/>
+            </w:pPr>
             <w:r>
               <w:rPr>
-                <w:rFonts w:ascii="Malgun Gothic" w:hAnsi="Malgun Gothic"/>
+                <w:rFonts w:ascii="Arial" w:hAnsi="Arial" w:eastAsia="Malgun Gothic"/>
                 <w:b/>
-                <w:sz w:val="19"/>
+                <w:color w:val="14315C"/>
+                <w:sz w:val="18"/>
               </w:rPr>
               <w:t>선행연구 기반 선정 이유</w:t>
             </w:r>
@@ -326,11 +491,15 @@
             <w:vAlign w:val="center"/>
           </w:tcPr>
           <w:p>
+            <w:pPr>
+              <w:spacing w:before="20" w:after="20" w:line="252" w:lineRule="auto"/>
+            </w:pPr>
             <w:r>
               <w:rPr>
-                <w:rFonts w:ascii="Malgun Gothic" w:hAnsi="Malgun Gothic"/>
+                <w:rFonts w:ascii="Arial" w:hAnsi="Arial" w:eastAsia="Malgun Gothic"/>
                 <w:b w:val="0"/>
-                <w:sz w:val="19"/>
+                <w:color w:val="000000"/>
+                <w:sz w:val="18"/>
               </w:rPr>
               <w:t>Age / Sex</w:t>
             </w:r>
@@ -342,11 +511,15 @@
             <w:vAlign w:val="center"/>
           </w:tcPr>
           <w:p>
+            <w:pPr>
+              <w:spacing w:before="20" w:after="20" w:line="252" w:lineRule="auto"/>
+            </w:pPr>
             <w:r>
               <w:rPr>
-                <w:rFonts w:ascii="Malgun Gothic" w:hAnsi="Malgun Gothic"/>
+                <w:rFonts w:ascii="Arial" w:hAnsi="Arial" w:eastAsia="Malgun Gothic"/>
                 <w:b w:val="0"/>
-                <w:sz w:val="19"/>
+                <w:color w:val="000000"/>
+                <w:sz w:val="18"/>
               </w:rPr>
               <w:t>고혈압 유병률은 연령과 성별에 따라 차이가 보고되어 기본 인구학적 변수로 포함하였다.</w:t>
             </w:r>
@@ -360,11 +533,15 @@
             <w:vAlign w:val="center"/>
           </w:tcPr>
           <w:p>
+            <w:pPr>
+              <w:spacing w:before="20" w:after="20" w:line="252" w:lineRule="auto"/>
+            </w:pPr>
             <w:r>
               <w:rPr>
-                <w:rFonts w:ascii="Malgun Gothic" w:hAnsi="Malgun Gothic"/>
+                <w:rFonts w:ascii="Arial" w:hAnsi="Arial" w:eastAsia="Malgun Gothic"/>
                 <w:b w:val="0"/>
-                <w:sz w:val="19"/>
+                <w:color w:val="000000"/>
+                <w:sz w:val="18"/>
               </w:rPr>
               <w:t>BMI / Waist circumference</w:t>
             </w:r>
@@ -376,11 +553,15 @@
             <w:vAlign w:val="center"/>
           </w:tcPr>
           <w:p>
+            <w:pPr>
+              <w:spacing w:before="20" w:after="20" w:line="252" w:lineRule="auto"/>
+            </w:pPr>
             <w:r>
               <w:rPr>
-                <w:rFonts w:ascii="Malgun Gothic" w:hAnsi="Malgun Gothic"/>
+                <w:rFonts w:ascii="Arial" w:hAnsi="Arial" w:eastAsia="Malgun Gothic"/>
                 <w:b w:val="0"/>
-                <w:sz w:val="19"/>
+                <w:color w:val="000000"/>
+                <w:sz w:val="18"/>
               </w:rPr>
               <w:t>비만과 복부비만은 혈압 상승 및 고혈압 위험과 관련이 있어 포함하였다.</w:t>
             </w:r>
@@ -394,11 +575,15 @@
             <w:vAlign w:val="center"/>
           </w:tcPr>
           <w:p>
+            <w:pPr>
+              <w:spacing w:before="20" w:after="20" w:line="252" w:lineRule="auto"/>
+            </w:pPr>
             <w:r>
               <w:rPr>
-                <w:rFonts w:ascii="Malgun Gothic" w:hAnsi="Malgun Gothic"/>
+                <w:rFonts w:ascii="Arial" w:hAnsi="Arial" w:eastAsia="Malgun Gothic"/>
                 <w:b w:val="0"/>
-                <w:sz w:val="19"/>
+                <w:color w:val="000000"/>
+                <w:sz w:val="18"/>
               </w:rPr>
               <w:t>Glucose / HbA1c</w:t>
             </w:r>
@@ -410,11 +595,15 @@
             <w:vAlign w:val="center"/>
           </w:tcPr>
           <w:p>
+            <w:pPr>
+              <w:spacing w:before="20" w:after="20" w:line="252" w:lineRule="auto"/>
+            </w:pPr>
             <w:r>
               <w:rPr>
-                <w:rFonts w:ascii="Malgun Gothic" w:hAnsi="Malgun Gothic"/>
+                <w:rFonts w:ascii="Arial" w:hAnsi="Arial" w:eastAsia="Malgun Gothic"/>
                 <w:b w:val="0"/>
-                <w:sz w:val="19"/>
+                <w:color w:val="000000"/>
+                <w:sz w:val="18"/>
               </w:rPr>
               <w:t>혈당 및 당대사 이상은 고혈압 위험과 함께 나타나는 경우가 있어 포함하였다.</w:t>
             </w:r>
@@ -428,11 +617,15 @@
             <w:vAlign w:val="center"/>
           </w:tcPr>
           <w:p>
+            <w:pPr>
+              <w:spacing w:before="20" w:after="20" w:line="252" w:lineRule="auto"/>
+            </w:pPr>
             <w:r>
               <w:rPr>
-                <w:rFonts w:ascii="Malgun Gothic" w:hAnsi="Malgun Gothic"/>
+                <w:rFonts w:ascii="Arial" w:hAnsi="Arial" w:eastAsia="Malgun Gothic"/>
                 <w:b w:val="0"/>
-                <w:sz w:val="19"/>
+                <w:color w:val="000000"/>
+                <w:sz w:val="18"/>
               </w:rPr>
               <w:t>TG / Total cholesterol</w:t>
             </w:r>
@@ -444,11 +637,15 @@
             <w:vAlign w:val="center"/>
           </w:tcPr>
           <w:p>
+            <w:pPr>
+              <w:spacing w:before="20" w:after="20" w:line="252" w:lineRule="auto"/>
+            </w:pPr>
             <w:r>
               <w:rPr>
-                <w:rFonts w:ascii="Malgun Gothic" w:hAnsi="Malgun Gothic"/>
+                <w:rFonts w:ascii="Arial" w:hAnsi="Arial" w:eastAsia="Malgun Gothic"/>
                 <w:b w:val="0"/>
-                <w:sz w:val="19"/>
+                <w:color w:val="000000"/>
+                <w:sz w:val="18"/>
               </w:rPr>
               <w:t>이상지질혈증 관련 지표는 심혈관 위험과 관련되어 포함하였다.</w:t>
             </w:r>
@@ -462,11 +659,15 @@
             <w:vAlign w:val="center"/>
           </w:tcPr>
           <w:p>
+            <w:pPr>
+              <w:spacing w:before="20" w:after="20" w:line="252" w:lineRule="auto"/>
+            </w:pPr>
             <w:r>
               <w:rPr>
-                <w:rFonts w:ascii="Malgun Gothic" w:hAnsi="Malgun Gothic"/>
+                <w:rFonts w:ascii="Arial" w:hAnsi="Arial" w:eastAsia="Malgun Gothic"/>
                 <w:b w:val="0"/>
-                <w:sz w:val="19"/>
+                <w:color w:val="000000"/>
+                <w:sz w:val="18"/>
               </w:rPr>
               <w:t>Smoking / Drinking / Physical activity / Stress</w:t>
             </w:r>
@@ -478,11 +679,15 @@
             <w:vAlign w:val="center"/>
           </w:tcPr>
           <w:p>
+            <w:pPr>
+              <w:spacing w:before="20" w:after="20" w:line="252" w:lineRule="auto"/>
+            </w:pPr>
             <w:r>
               <w:rPr>
-                <w:rFonts w:ascii="Malgun Gothic" w:hAnsi="Malgun Gothic"/>
+                <w:rFonts w:ascii="Arial" w:hAnsi="Arial" w:eastAsia="Malgun Gothic"/>
                 <w:b w:val="0"/>
-                <w:sz w:val="19"/>
+                <w:color w:val="000000"/>
+                <w:sz w:val="18"/>
               </w:rPr>
               <w:t>생활습관과 스트레스는 고혈압 위험요인으로 알려져 있어 포함하였다.</w:t>
             </w:r>
@@ -496,11 +701,15 @@
             <w:vAlign w:val="center"/>
           </w:tcPr>
           <w:p>
+            <w:pPr>
+              <w:spacing w:before="20" w:after="20" w:line="252" w:lineRule="auto"/>
+            </w:pPr>
             <w:r>
               <w:rPr>
-                <w:rFonts w:ascii="Malgun Gothic" w:hAnsi="Malgun Gothic"/>
+                <w:rFonts w:ascii="Arial" w:hAnsi="Arial" w:eastAsia="Malgun Gothic"/>
                 <w:b w:val="0"/>
-                <w:sz w:val="19"/>
+                <w:color w:val="000000"/>
+                <w:sz w:val="18"/>
               </w:rPr>
               <w:t>Family history</w:t>
             </w:r>
@@ -512,13 +721,59 @@
             <w:vAlign w:val="center"/>
           </w:tcPr>
           <w:p>
+            <w:pPr>
+              <w:spacing w:before="20" w:after="20" w:line="252" w:lineRule="auto"/>
+            </w:pPr>
             <w:r>
               <w:rPr>
-                <w:rFonts w:ascii="Malgun Gothic" w:hAnsi="Malgun Gothic"/>
+                <w:rFonts w:ascii="Arial" w:hAnsi="Arial" w:eastAsia="Malgun Gothic"/>
                 <w:b w:val="0"/>
-                <w:sz w:val="19"/>
+                <w:color w:val="000000"/>
+                <w:sz w:val="18"/>
               </w:rPr>
               <w:t>고혈압 가족력은 개인의 고혈압 위험을 설명하는 데 도움이 되어 포함하였다.</w:t>
+            </w:r>
+          </w:p>
+        </w:tc>
+      </w:tr>
+      <w:tr>
+        <w:tc>
+          <w:tcPr>
+            <w:tcW w:type="dxa" w:w="4896"/>
+            <w:vAlign w:val="center"/>
+          </w:tcPr>
+          <w:p>
+            <w:pPr>
+              <w:spacing w:before="20" w:after="20" w:line="252" w:lineRule="auto"/>
+            </w:pPr>
+            <w:r>
+              <w:rPr>
+                <w:rFonts w:ascii="Arial" w:hAnsi="Arial" w:eastAsia="Malgun Gothic"/>
+                <w:b w:val="0"/>
+                <w:color w:val="000000"/>
+                <w:sz w:val="18"/>
+              </w:rPr>
+              <w:t>Sodium / Potassium intake</w:t>
+            </w:r>
+          </w:p>
+        </w:tc>
+        <w:tc>
+          <w:tcPr>
+            <w:tcW w:type="dxa" w:w="4896"/>
+            <w:vAlign w:val="center"/>
+          </w:tcPr>
+          <w:p>
+            <w:pPr>
+              <w:spacing w:before="20" w:after="20" w:line="252" w:lineRule="auto"/>
+            </w:pPr>
+            <w:r>
+              <w:rPr>
+                <w:rFonts w:ascii="Arial" w:hAnsi="Arial" w:eastAsia="Malgun Gothic"/>
+                <w:b w:val="0"/>
+                <w:color w:val="000000"/>
+                <w:sz w:val="18"/>
+              </w:rPr>
+              <w:t>교수님 피드백에 따라 BMI와 허리둘레 외의 식이 관련 정보를 보완하기 위해 나트륨·칼륨 섭취량을 추가하였다.</w:t>
             </w:r>
           </w:p>
         </w:tc>
@@ -528,24 +783,50 @@
     <w:p>
       <w:pPr>
         <w:pStyle w:val="Heading1"/>
+        <w:spacing w:before="320" w:after="160"/>
+        <w:jc w:val="left"/>
+        <w:pBdr>
+          <w:bottom w:val="single" w:sz="6" w:space="4" w:color="9EC5E8"/>
+        </w:pBdr>
       </w:pPr>
       <w:r>
         <w:rPr>
-          <w:rFonts w:ascii="Malgun Gothic" w:hAnsi="Malgun Gothic"/>
+          <w:rFonts w:ascii="Arial" w:hAnsi="Arial" w:eastAsia="Malgun Gothic"/>
           <w:b/>
+          <w:color w:val="14315C"/>
           <w:sz w:val="28"/>
         </w:rPr>
         <w:t>2. 데이터 수집 및 연구대상자 선정</w:t>
       </w:r>
     </w:p>
     <w:p>
+      <w:pPr>
+        <w:spacing w:line="295" w:lineRule="auto" w:after="140"/>
+        <w:jc w:val="both"/>
+      </w:pPr>
       <w:r>
         <w:rPr>
-          <w:rFonts w:ascii="Malgun Gothic" w:hAnsi="Malgun Gothic"/>
+          <w:rFonts w:ascii="Arial" w:hAnsi="Arial" w:eastAsia="Malgun Gothic"/>
           <w:b w:val="0"/>
           <w:sz w:val="21"/>
         </w:rPr>
-        <w:t>자료는 국민건강영양조사(KNHANES) 2017-2023년 원자료를 사용하였다. 각 연도 SPSS 파일에서 필요한 변수를 선택한 뒤 하나의 데이터프레임으로 병합하였다.</w:t>
+        <w:t>자료는 국민건강영양조사(KNHANES) 2017-2023년 원자료를 사용하였다. 각 연도 SPSS 파일에서 인구사회학, 건강검진, 생활습관, 가족력, 식이 변수를 선택한 뒤 하나의 데이터프레임으로 병합하였다. 연구대상자는 19-39세로 제한하고, 혈압 판정에 필요한 SBP/DBP 측정값이 없는 경우는 target을 정확히 생성하기 어려우므로 제외하였다.</w:t>
+      </w:r>
+    </w:p>
+    <w:p>
+      <w:pPr>
+        <w:pStyle w:val="Caption"/>
+        <w:spacing w:before="80" w:after="140"/>
+        <w:jc w:val="center"/>
+      </w:pPr>
+      <w:r>
+        <w:rPr>
+          <w:rFonts w:ascii="Arial" w:hAnsi="Arial" w:eastAsia="Malgun Gothic"/>
+          <w:b w:val="0"/>
+          <w:color w:val="5A5A5A"/>
+          <w:sz w:val="18"/>
+        </w:rPr>
+        <w:t>표 3. 연구대상자 선정 및 코호트 구성</w:t>
       </w:r>
     </w:p>
     <w:tbl>
@@ -553,6 +834,7 @@
         <w:tblStyle w:val="TableGrid"/>
         <w:tblW w:type="auto" w:w="0"/>
         <w:jc w:val="center"/>
+        <w:tblLayout w:type="autofit"/>
         <w:tblLook w:firstColumn="1" w:firstRow="1" w:lastColumn="0" w:lastRow="0" w:noHBand="0" w:noVBand="1" w:val="04A0"/>
       </w:tblPr>
       <w:tblGrid>
@@ -564,13 +846,18 @@
           <w:tcPr>
             <w:tcW w:type="dxa" w:w="4896"/>
             <w:vAlign w:val="center"/>
+            <w:shd w:fill="D9EAF7"/>
           </w:tcPr>
           <w:p>
+            <w:pPr>
+              <w:spacing w:before="20" w:after="20" w:line="252" w:lineRule="auto"/>
+            </w:pPr>
             <w:r>
               <w:rPr>
-                <w:rFonts w:ascii="Malgun Gothic" w:hAnsi="Malgun Gothic"/>
+                <w:rFonts w:ascii="Arial" w:hAnsi="Arial" w:eastAsia="Malgun Gothic"/>
                 <w:b/>
-                <w:sz w:val="19"/>
+                <w:color w:val="14315C"/>
+                <w:sz w:val="18"/>
               </w:rPr>
               <w:t>항목</w:t>
             </w:r>
@@ -580,13 +867,18 @@
           <w:tcPr>
             <w:tcW w:type="dxa" w:w="4896"/>
             <w:vAlign w:val="center"/>
+            <w:shd w:fill="D9EAF7"/>
           </w:tcPr>
           <w:p>
+            <w:pPr>
+              <w:spacing w:before="20" w:after="20" w:line="252" w:lineRule="auto"/>
+            </w:pPr>
             <w:r>
               <w:rPr>
-                <w:rFonts w:ascii="Malgun Gothic" w:hAnsi="Malgun Gothic"/>
+                <w:rFonts w:ascii="Arial" w:hAnsi="Arial" w:eastAsia="Malgun Gothic"/>
                 <w:b/>
-                <w:sz w:val="19"/>
+                <w:color w:val="14315C"/>
+                <w:sz w:val="18"/>
               </w:rPr>
               <w:t>내용</w:t>
             </w:r>
@@ -600,11 +892,15 @@
             <w:vAlign w:val="center"/>
           </w:tcPr>
           <w:p>
+            <w:pPr>
+              <w:spacing w:before="20" w:after="20" w:line="252" w:lineRule="auto"/>
+            </w:pPr>
             <w:r>
               <w:rPr>
-                <w:rFonts w:ascii="Malgun Gothic" w:hAnsi="Malgun Gothic"/>
+                <w:rFonts w:ascii="Arial" w:hAnsi="Arial" w:eastAsia="Malgun Gothic"/>
                 <w:b w:val="0"/>
-                <w:sz w:val="19"/>
+                <w:color w:val="000000"/>
+                <w:sz w:val="18"/>
               </w:rPr>
               <w:t>자료 출처</w:t>
             </w:r>
@@ -616,11 +912,15 @@
             <w:vAlign w:val="center"/>
           </w:tcPr>
           <w:p>
+            <w:pPr>
+              <w:spacing w:before="20" w:after="20" w:line="252" w:lineRule="auto"/>
+            </w:pPr>
             <w:r>
               <w:rPr>
-                <w:rFonts w:ascii="Malgun Gothic" w:hAnsi="Malgun Gothic"/>
+                <w:rFonts w:ascii="Arial" w:hAnsi="Arial" w:eastAsia="Malgun Gothic"/>
                 <w:b w:val="0"/>
-                <w:sz w:val="19"/>
+                <w:color w:val="000000"/>
+                <w:sz w:val="18"/>
               </w:rPr>
               <w:t>KNHANES 2017-2023</w:t>
             </w:r>
@@ -634,11 +934,15 @@
             <w:vAlign w:val="center"/>
           </w:tcPr>
           <w:p>
+            <w:pPr>
+              <w:spacing w:before="20" w:after="20" w:line="252" w:lineRule="auto"/>
+            </w:pPr>
             <w:r>
               <w:rPr>
-                <w:rFonts w:ascii="Malgun Gothic" w:hAnsi="Malgun Gothic"/>
+                <w:rFonts w:ascii="Arial" w:hAnsi="Arial" w:eastAsia="Malgun Gothic"/>
                 <w:b w:val="0"/>
-                <w:sz w:val="19"/>
+                <w:color w:val="000000"/>
+                <w:sz w:val="18"/>
               </w:rPr>
               <w:t>연구대상</w:t>
             </w:r>
@@ -650,11 +954,15 @@
             <w:vAlign w:val="center"/>
           </w:tcPr>
           <w:p>
+            <w:pPr>
+              <w:spacing w:before="20" w:after="20" w:line="252" w:lineRule="auto"/>
+            </w:pPr>
             <w:r>
               <w:rPr>
-                <w:rFonts w:ascii="Malgun Gothic" w:hAnsi="Malgun Gothic"/>
+                <w:rFonts w:ascii="Arial" w:hAnsi="Arial" w:eastAsia="Malgun Gothic"/>
                 <w:b w:val="0"/>
-                <w:sz w:val="19"/>
+                <w:color w:val="000000"/>
+                <w:sz w:val="18"/>
               </w:rPr>
               <w:t>19-39세 젊은 성인</w:t>
             </w:r>
@@ -668,11 +976,15 @@
             <w:vAlign w:val="center"/>
           </w:tcPr>
           <w:p>
+            <w:pPr>
+              <w:spacing w:before="20" w:after="20" w:line="252" w:lineRule="auto"/>
+            </w:pPr>
             <w:r>
               <w:rPr>
-                <w:rFonts w:ascii="Malgun Gothic" w:hAnsi="Malgun Gothic"/>
+                <w:rFonts w:ascii="Arial" w:hAnsi="Arial" w:eastAsia="Malgun Gothic"/>
                 <w:b w:val="0"/>
-                <w:sz w:val="19"/>
+                <w:color w:val="000000"/>
+                <w:sz w:val="18"/>
               </w:rPr>
               <w:t>제외 기준</w:t>
             </w:r>
@@ -684,11 +996,15 @@
             <w:vAlign w:val="center"/>
           </w:tcPr>
           <w:p>
+            <w:pPr>
+              <w:spacing w:before="20" w:after="20" w:line="252" w:lineRule="auto"/>
+            </w:pPr>
             <w:r>
               <w:rPr>
-                <w:rFonts w:ascii="Malgun Gothic" w:hAnsi="Malgun Gothic"/>
+                <w:rFonts w:ascii="Arial" w:hAnsi="Arial" w:eastAsia="Malgun Gothic"/>
                 <w:b w:val="0"/>
-                <w:sz w:val="19"/>
+                <w:color w:val="000000"/>
+                <w:sz w:val="18"/>
               </w:rPr>
               <w:t>SBP 또는 DBP 결측 대상자 제외</w:t>
             </w:r>
@@ -702,11 +1018,15 @@
             <w:vAlign w:val="center"/>
           </w:tcPr>
           <w:p>
+            <w:pPr>
+              <w:spacing w:before="20" w:after="20" w:line="252" w:lineRule="auto"/>
+            </w:pPr>
             <w:r>
               <w:rPr>
-                <w:rFonts w:ascii="Malgun Gothic" w:hAnsi="Malgun Gothic"/>
+                <w:rFonts w:ascii="Arial" w:hAnsi="Arial" w:eastAsia="Malgun Gothic"/>
                 <w:b w:val="0"/>
-                <w:sz w:val="19"/>
+                <w:color w:val="000000"/>
+                <w:sz w:val="18"/>
               </w:rPr>
               <w:t>최종 분석 대상자 수</w:t>
             </w:r>
@@ -718,11 +1038,15 @@
             <w:vAlign w:val="center"/>
           </w:tcPr>
           <w:p>
+            <w:pPr>
+              <w:spacing w:before="20" w:after="20" w:line="252" w:lineRule="auto"/>
+            </w:pPr>
             <w:r>
               <w:rPr>
-                <w:rFonts w:ascii="Malgun Gothic" w:hAnsi="Malgun Gothic"/>
+                <w:rFonts w:ascii="Arial" w:hAnsi="Arial" w:eastAsia="Malgun Gothic"/>
                 <w:b w:val="0"/>
-                <w:sz w:val="19"/>
+                <w:color w:val="000000"/>
+                <w:sz w:val="18"/>
               </w:rPr>
               <w:t>10,319명</w:t>
             </w:r>
@@ -736,11 +1060,15 @@
             <w:vAlign w:val="center"/>
           </w:tcPr>
           <w:p>
+            <w:pPr>
+              <w:spacing w:before="20" w:after="20" w:line="252" w:lineRule="auto"/>
+            </w:pPr>
             <w:r>
               <w:rPr>
-                <w:rFonts w:ascii="Malgun Gothic" w:hAnsi="Malgun Gothic"/>
+                <w:rFonts w:ascii="Arial" w:hAnsi="Arial" w:eastAsia="Malgun Gothic"/>
                 <w:b w:val="0"/>
-                <w:sz w:val="19"/>
+                <w:color w:val="000000"/>
+                <w:sz w:val="18"/>
               </w:rPr>
               <w:t>Target 정의</w:t>
             </w:r>
@@ -752,11 +1080,15 @@
             <w:vAlign w:val="center"/>
           </w:tcPr>
           <w:p>
+            <w:pPr>
+              <w:spacing w:before="20" w:after="20" w:line="252" w:lineRule="auto"/>
+            </w:pPr>
             <w:r>
               <w:rPr>
-                <w:rFonts w:ascii="Malgun Gothic" w:hAnsi="Malgun Gothic"/>
+                <w:rFonts w:ascii="Arial" w:hAnsi="Arial" w:eastAsia="Malgun Gothic"/>
                 <w:b w:val="0"/>
-                <w:sz w:val="19"/>
+                <w:color w:val="000000"/>
+                <w:sz w:val="18"/>
               </w:rPr>
               <w:t>SBP &gt;= 130 또는 DBP &gt;= 80</w:t>
             </w:r>
@@ -770,11 +1102,15 @@
             <w:vAlign w:val="center"/>
           </w:tcPr>
           <w:p>
+            <w:pPr>
+              <w:spacing w:before="20" w:after="20" w:line="252" w:lineRule="auto"/>
+            </w:pPr>
             <w:r>
               <w:rPr>
-                <w:rFonts w:ascii="Malgun Gothic" w:hAnsi="Malgun Gothic"/>
+                <w:rFonts w:ascii="Arial" w:hAnsi="Arial" w:eastAsia="Malgun Gothic"/>
                 <w:b w:val="0"/>
-                <w:sz w:val="19"/>
+                <w:color w:val="000000"/>
+                <w:sz w:val="18"/>
               </w:rPr>
               <w:t>비고혈압군</w:t>
             </w:r>
@@ -786,11 +1122,15 @@
             <w:vAlign w:val="center"/>
           </w:tcPr>
           <w:p>
+            <w:pPr>
+              <w:spacing w:before="20" w:after="20" w:line="252" w:lineRule="auto"/>
+            </w:pPr>
             <w:r>
               <w:rPr>
-                <w:rFonts w:ascii="Malgun Gothic" w:hAnsi="Malgun Gothic"/>
+                <w:rFonts w:ascii="Arial" w:hAnsi="Arial" w:eastAsia="Malgun Gothic"/>
                 <w:b w:val="0"/>
-                <w:sz w:val="19"/>
+                <w:color w:val="000000"/>
+                <w:sz w:val="18"/>
               </w:rPr>
               <w:t>7,947명</w:t>
             </w:r>
@@ -804,11 +1144,15 @@
             <w:vAlign w:val="center"/>
           </w:tcPr>
           <w:p>
+            <w:pPr>
+              <w:spacing w:before="20" w:after="20" w:line="252" w:lineRule="auto"/>
+            </w:pPr>
             <w:r>
               <w:rPr>
-                <w:rFonts w:ascii="Malgun Gothic" w:hAnsi="Malgun Gothic"/>
+                <w:rFonts w:ascii="Arial" w:hAnsi="Arial" w:eastAsia="Malgun Gothic"/>
                 <w:b w:val="0"/>
-                <w:sz w:val="19"/>
+                <w:color w:val="000000"/>
+                <w:sz w:val="18"/>
               </w:rPr>
               <w:t>고혈압군</w:t>
             </w:r>
@@ -820,11 +1164,15 @@
             <w:vAlign w:val="center"/>
           </w:tcPr>
           <w:p>
+            <w:pPr>
+              <w:spacing w:before="20" w:after="20" w:line="252" w:lineRule="auto"/>
+            </w:pPr>
             <w:r>
               <w:rPr>
-                <w:rFonts w:ascii="Malgun Gothic" w:hAnsi="Malgun Gothic"/>
+                <w:rFonts w:ascii="Arial" w:hAnsi="Arial" w:eastAsia="Malgun Gothic"/>
                 <w:b w:val="0"/>
-                <w:sz w:val="19"/>
+                <w:color w:val="000000"/>
+                <w:sz w:val="18"/>
               </w:rPr>
               <w:t>2,372명 (23.0%)</w:t>
             </w:r>
@@ -836,24 +1184,50 @@
     <w:p>
       <w:pPr>
         <w:pStyle w:val="Heading1"/>
+        <w:spacing w:before="320" w:after="160"/>
+        <w:jc w:val="left"/>
+        <w:pBdr>
+          <w:bottom w:val="single" w:sz="6" w:space="4" w:color="9EC5E8"/>
+        </w:pBdr>
       </w:pPr>
       <w:r>
         <w:rPr>
-          <w:rFonts w:ascii="Malgun Gothic" w:hAnsi="Malgun Gothic"/>
+          <w:rFonts w:ascii="Arial" w:hAnsi="Arial" w:eastAsia="Malgun Gothic"/>
           <w:b/>
+          <w:color w:val="14315C"/>
           <w:sz w:val="28"/>
         </w:rPr>
         <w:t>3. EDA</w:t>
       </w:r>
     </w:p>
     <w:p>
+      <w:pPr>
+        <w:spacing w:line="295" w:lineRule="auto" w:after="140"/>
+        <w:jc w:val="both"/>
+      </w:pPr>
       <w:r>
         <w:rPr>
-          <w:rFonts w:ascii="Malgun Gothic" w:hAnsi="Malgun Gothic"/>
+          <w:rFonts w:ascii="Arial" w:hAnsi="Arial" w:eastAsia="Malgun Gothic"/>
           <w:b w:val="0"/>
           <w:sz w:val="21"/>
         </w:rPr>
-        <w:t>EDA에서는 연도별 대상자 수, covid_period별 분포, target distribution, 주요 수치형 변수의 histogram/boxplot, 결측치 분포, 이상치 분포, 상관분석을 확인하였다.</w:t>
+        <w:t>EDA에서는 모델링 전에 데이터가 어떤 특징을 가지는지를 확인하는 것에 중점을 두었다. 연도별 대상자 수, covid_period별 분포, target distribution, 주요 수치형 변수의 histogram/boxplot, 결측치 분포, 이상치 분포, 상관분석을 확인하였다. 이 과정을 통해 결측 처리 규칙, 제외할 변수, 공선성 가능성을 모델링 전에 검토하였다.</w:t>
+      </w:r>
+    </w:p>
+    <w:p>
+      <w:pPr>
+        <w:pStyle w:val="Caption"/>
+        <w:spacing w:before="80" w:after="140"/>
+        <w:jc w:val="center"/>
+      </w:pPr>
+      <w:r>
+        <w:rPr>
+          <w:rFonts w:ascii="Arial" w:hAnsi="Arial" w:eastAsia="Malgun Gothic"/>
+          <w:b w:val="0"/>
+          <w:color w:val="5A5A5A"/>
+          <w:sz w:val="18"/>
+        </w:rPr>
+        <w:t>표 4. covid_period별 원자료 고혈압 비율</w:t>
       </w:r>
     </w:p>
     <w:tbl>
@@ -861,6 +1235,7 @@
         <w:tblStyle w:val="TableGrid"/>
         <w:tblW w:type="auto" w:w="0"/>
         <w:jc w:val="center"/>
+        <w:tblLayout w:type="autofit"/>
         <w:tblLook w:firstColumn="1" w:firstRow="1" w:lastColumn="0" w:lastRow="0" w:noHBand="0" w:noVBand="1" w:val="04A0"/>
       </w:tblPr>
       <w:tblGrid>
@@ -873,13 +1248,18 @@
           <w:tcPr>
             <w:tcW w:type="dxa" w:w="3264"/>
             <w:vAlign w:val="center"/>
+            <w:shd w:fill="D9EAF7"/>
           </w:tcPr>
           <w:p>
+            <w:pPr>
+              <w:spacing w:before="20" w:after="20" w:line="252" w:lineRule="auto"/>
+            </w:pPr>
             <w:r>
               <w:rPr>
-                <w:rFonts w:ascii="Malgun Gothic" w:hAnsi="Malgun Gothic"/>
+                <w:rFonts w:ascii="Arial" w:hAnsi="Arial" w:eastAsia="Malgun Gothic"/>
                 <w:b/>
-                <w:sz w:val="19"/>
+                <w:color w:val="14315C"/>
+                <w:sz w:val="18"/>
               </w:rPr>
               <w:t>covid_period</w:t>
             </w:r>
@@ -889,13 +1269,18 @@
           <w:tcPr>
             <w:tcW w:type="dxa" w:w="3264"/>
             <w:vAlign w:val="center"/>
+            <w:shd w:fill="D9EAF7"/>
           </w:tcPr>
           <w:p>
+            <w:pPr>
+              <w:spacing w:before="20" w:after="20" w:line="252" w:lineRule="auto"/>
+            </w:pPr>
             <w:r>
               <w:rPr>
-                <w:rFonts w:ascii="Malgun Gothic" w:hAnsi="Malgun Gothic"/>
+                <w:rFonts w:ascii="Arial" w:hAnsi="Arial" w:eastAsia="Malgun Gothic"/>
                 <w:b/>
-                <w:sz w:val="19"/>
+                <w:color w:val="14315C"/>
+                <w:sz w:val="18"/>
               </w:rPr>
               <w:t>대상자 수</w:t>
             </w:r>
@@ -905,13 +1290,18 @@
           <w:tcPr>
             <w:tcW w:type="dxa" w:w="3264"/>
             <w:vAlign w:val="center"/>
+            <w:shd w:fill="D9EAF7"/>
           </w:tcPr>
           <w:p>
+            <w:pPr>
+              <w:spacing w:before="20" w:after="20" w:line="252" w:lineRule="auto"/>
+            </w:pPr>
             <w:r>
               <w:rPr>
-                <w:rFonts w:ascii="Malgun Gothic" w:hAnsi="Malgun Gothic"/>
+                <w:rFonts w:ascii="Arial" w:hAnsi="Arial" w:eastAsia="Malgun Gothic"/>
                 <w:b/>
-                <w:sz w:val="19"/>
+                <w:color w:val="14315C"/>
+                <w:sz w:val="18"/>
               </w:rPr>
               <w:t>고혈압 비율</w:t>
             </w:r>
@@ -925,11 +1315,15 @@
             <w:vAlign w:val="center"/>
           </w:tcPr>
           <w:p>
+            <w:pPr>
+              <w:spacing w:before="20" w:after="20" w:line="252" w:lineRule="auto"/>
+            </w:pPr>
             <w:r>
               <w:rPr>
-                <w:rFonts w:ascii="Malgun Gothic" w:hAnsi="Malgun Gothic"/>
+                <w:rFonts w:ascii="Arial" w:hAnsi="Arial" w:eastAsia="Malgun Gothic"/>
                 <w:b w:val="0"/>
-                <w:sz w:val="19"/>
+                <w:color w:val="000000"/>
+                <w:sz w:val="18"/>
               </w:rPr>
               <w:t>before (2017-2019)</w:t>
             </w:r>
@@ -941,11 +1335,15 @@
             <w:vAlign w:val="center"/>
           </w:tcPr>
           <w:p>
+            <w:pPr>
+              <w:spacing w:before="20" w:after="20" w:line="252" w:lineRule="auto"/>
+            </w:pPr>
             <w:r>
               <w:rPr>
-                <w:rFonts w:ascii="Malgun Gothic" w:hAnsi="Malgun Gothic"/>
+                <w:rFonts w:ascii="Arial" w:hAnsi="Arial" w:eastAsia="Malgun Gothic"/>
                 <w:b w:val="0"/>
-                <w:sz w:val="19"/>
+                <w:color w:val="000000"/>
+                <w:sz w:val="18"/>
               </w:rPr>
               <w:t>4978</w:t>
             </w:r>
@@ -957,11 +1355,15 @@
             <w:vAlign w:val="center"/>
           </w:tcPr>
           <w:p>
+            <w:pPr>
+              <w:spacing w:before="20" w:after="20" w:line="252" w:lineRule="auto"/>
+            </w:pPr>
             <w:r>
               <w:rPr>
-                <w:rFonts w:ascii="Malgun Gothic" w:hAnsi="Malgun Gothic"/>
+                <w:rFonts w:ascii="Arial" w:hAnsi="Arial" w:eastAsia="Malgun Gothic"/>
                 <w:b w:val="0"/>
-                <w:sz w:val="19"/>
+                <w:color w:val="000000"/>
+                <w:sz w:val="18"/>
               </w:rPr>
               <w:t>26.4%</w:t>
             </w:r>
@@ -975,11 +1377,15 @@
             <w:vAlign w:val="center"/>
           </w:tcPr>
           <w:p>
+            <w:pPr>
+              <w:spacing w:before="20" w:after="20" w:line="252" w:lineRule="auto"/>
+            </w:pPr>
             <w:r>
               <w:rPr>
-                <w:rFonts w:ascii="Malgun Gothic" w:hAnsi="Malgun Gothic"/>
+                <w:rFonts w:ascii="Arial" w:hAnsi="Arial" w:eastAsia="Malgun Gothic"/>
                 <w:b w:val="0"/>
-                <w:sz w:val="19"/>
+                <w:color w:val="000000"/>
+                <w:sz w:val="18"/>
               </w:rPr>
               <w:t>during (2020-2021)</w:t>
             </w:r>
@@ -991,11 +1397,15 @@
             <w:vAlign w:val="center"/>
           </w:tcPr>
           <w:p>
+            <w:pPr>
+              <w:spacing w:before="20" w:after="20" w:line="252" w:lineRule="auto"/>
+            </w:pPr>
             <w:r>
               <w:rPr>
-                <w:rFonts w:ascii="Malgun Gothic" w:hAnsi="Malgun Gothic"/>
+                <w:rFonts w:ascii="Arial" w:hAnsi="Arial" w:eastAsia="Malgun Gothic"/>
                 <w:b w:val="0"/>
-                <w:sz w:val="19"/>
+                <w:color w:val="000000"/>
+                <w:sz w:val="18"/>
               </w:rPr>
               <w:t>2832</w:t>
             </w:r>
@@ -1007,11 +1417,15 @@
             <w:vAlign w:val="center"/>
           </w:tcPr>
           <w:p>
+            <w:pPr>
+              <w:spacing w:before="20" w:after="20" w:line="252" w:lineRule="auto"/>
+            </w:pPr>
             <w:r>
               <w:rPr>
-                <w:rFonts w:ascii="Malgun Gothic" w:hAnsi="Malgun Gothic"/>
+                <w:rFonts w:ascii="Arial" w:hAnsi="Arial" w:eastAsia="Malgun Gothic"/>
                 <w:b w:val="0"/>
-                <w:sz w:val="19"/>
+                <w:color w:val="000000"/>
+                <w:sz w:val="18"/>
               </w:rPr>
               <w:t>24.0%</w:t>
             </w:r>
@@ -1025,11 +1439,15 @@
             <w:vAlign w:val="center"/>
           </w:tcPr>
           <w:p>
+            <w:pPr>
+              <w:spacing w:before="20" w:after="20" w:line="252" w:lineRule="auto"/>
+            </w:pPr>
             <w:r>
               <w:rPr>
-                <w:rFonts w:ascii="Malgun Gothic" w:hAnsi="Malgun Gothic"/>
+                <w:rFonts w:ascii="Arial" w:hAnsi="Arial" w:eastAsia="Malgun Gothic"/>
                 <w:b w:val="0"/>
-                <w:sz w:val="19"/>
+                <w:color w:val="000000"/>
+                <w:sz w:val="18"/>
               </w:rPr>
               <w:t>after (2022-2023)</w:t>
             </w:r>
@@ -1041,11 +1459,15 @@
             <w:vAlign w:val="center"/>
           </w:tcPr>
           <w:p>
+            <w:pPr>
+              <w:spacing w:before="20" w:after="20" w:line="252" w:lineRule="auto"/>
+            </w:pPr>
             <w:r>
               <w:rPr>
-                <w:rFonts w:ascii="Malgun Gothic" w:hAnsi="Malgun Gothic"/>
+                <w:rFonts w:ascii="Arial" w:hAnsi="Arial" w:eastAsia="Malgun Gothic"/>
                 <w:b w:val="0"/>
-                <w:sz w:val="19"/>
+                <w:color w:val="000000"/>
+                <w:sz w:val="18"/>
               </w:rPr>
               <w:t>2509</w:t>
             </w:r>
@@ -1057,11 +1479,15 @@
             <w:vAlign w:val="center"/>
           </w:tcPr>
           <w:p>
+            <w:pPr>
+              <w:spacing w:before="20" w:after="20" w:line="252" w:lineRule="auto"/>
+            </w:pPr>
             <w:r>
               <w:rPr>
-                <w:rFonts w:ascii="Malgun Gothic" w:hAnsi="Malgun Gothic"/>
+                <w:rFonts w:ascii="Arial" w:hAnsi="Arial" w:eastAsia="Malgun Gothic"/>
                 <w:b w:val="0"/>
-                <w:sz w:val="19"/>
+                <w:color w:val="000000"/>
+                <w:sz w:val="18"/>
               </w:rPr>
               <w:t>15.1%</w:t>
             </w:r>
@@ -1071,9 +1497,13 @@
     </w:tbl>
     <w:p/>
     <w:p>
+      <w:pPr>
+        <w:spacing w:line="295" w:lineRule="auto" w:after="140"/>
+        <w:jc w:val="both"/>
+      </w:pPr>
       <w:r>
         <w:rPr>
-          <w:rFonts w:ascii="Malgun Gothic" w:hAnsi="Malgun Gothic"/>
+          <w:rFonts w:ascii="Arial" w:hAnsi="Arial" w:eastAsia="Malgun Gothic"/>
           <w:b w:val="0"/>
           <w:sz w:val="21"/>
         </w:rPr>
@@ -1081,9 +1511,13 @@
       </w:r>
     </w:p>
     <w:p>
+      <w:pPr>
+        <w:spacing w:line="295" w:lineRule="auto" w:after="140"/>
+        <w:jc w:val="both"/>
+      </w:pPr>
       <w:r>
         <w:rPr>
-          <w:rFonts w:ascii="Malgun Gothic" w:hAnsi="Malgun Gothic"/>
+          <w:rFonts w:ascii="Arial" w:hAnsi="Arial" w:eastAsia="Malgun Gothic"/>
           <w:b w:val="0"/>
           <w:sz w:val="21"/>
         </w:rPr>
@@ -1093,30 +1527,44 @@
     <w:p>
       <w:pPr>
         <w:pStyle w:val="Heading1"/>
+        <w:spacing w:before="320" w:after="160"/>
+        <w:jc w:val="left"/>
+        <w:pBdr>
+          <w:bottom w:val="single" w:sz="6" w:space="4" w:color="9EC5E8"/>
+        </w:pBdr>
       </w:pPr>
       <w:r>
         <w:rPr>
-          <w:rFonts w:ascii="Malgun Gothic" w:hAnsi="Malgun Gothic"/>
+          <w:rFonts w:ascii="Arial" w:hAnsi="Arial" w:eastAsia="Malgun Gothic"/>
           <w:b/>
+          <w:color w:val="14315C"/>
           <w:sz w:val="28"/>
         </w:rPr>
         <w:t>4. 전처리</w:t>
       </w:r>
     </w:p>
     <w:p>
+      <w:pPr>
+        <w:spacing w:line="295" w:lineRule="auto" w:after="140"/>
+        <w:jc w:val="both"/>
+      </w:pPr>
       <w:r>
         <w:rPr>
-          <w:rFonts w:ascii="Malgun Gothic" w:hAnsi="Malgun Gothic"/>
+          <w:rFonts w:ascii="Arial" w:hAnsi="Arial" w:eastAsia="Malgun Gothic"/>
           <w:b w:val="0"/>
           <w:sz w:val="21"/>
         </w:rPr>
-        <w:t>결측률 30% 이하 변수는 결측치 대체 후 사용하고, 30% 초과 변수는 주분석에서 제외하였다. LDL은 전체 결측률이 약 68%로 높아 주분석에서 제외하였다. HDL은 결측률은 낮지만 2022년 이후 측정 시기별 변화 가능성이 있어 주분석 모델에서는 제외하고 민감도 분석 수준에서만 검토하였다.</w:t>
+        <w:t>결측률 30% 이하 변수는 수업에서 배운 전처리 과정에 따라 결측치 대체 후 사용하고, 30% 초과 변수는 대체한 값이 실제 의미를 갖기 어렵다고 판단하여 주분석에서 제외하였다. 예를 들면 LDL은 전체 결측률이 약 68%로 높아 주분석에서 제외하였다. HDL은 결측률은 낮지만 2022년 이후 batch shift 가능성이 있어 주분석 모델에서는 제외하고 민감도 분석 수준에서 검토하였다. 교수님 피드백에 따라 식이 변수인 나트륨 섭취량(N_NA)과 칼륨 섭취량(N_K)을 추가하였으며, 두 변수의 결측률은 약 14.7%로 30% 기준 이하이므로 결측치 대체 후 모델에 포함하였다.</w:t>
       </w:r>
     </w:p>
     <w:p>
+      <w:pPr>
+        <w:spacing w:line="295" w:lineRule="auto" w:after="140"/>
+        <w:jc w:val="both"/>
+      </w:pPr>
       <w:r>
         <w:rPr>
-          <w:rFonts w:ascii="Malgun Gothic" w:hAnsi="Malgun Gothic"/>
+          <w:rFonts w:ascii="Arial" w:hAnsi="Arial" w:eastAsia="Malgun Gothic"/>
           <w:b w:val="0"/>
           <w:sz w:val="21"/>
         </w:rPr>
@@ -1124,9 +1572,13 @@
       </w:r>
     </w:p>
     <w:p>
+      <w:pPr>
+        <w:spacing w:line="295" w:lineRule="auto" w:after="140"/>
+        <w:jc w:val="both"/>
+      </w:pPr>
       <w:r>
         <w:rPr>
-          <w:rFonts w:ascii="Malgun Gothic" w:hAnsi="Malgun Gothic"/>
+          <w:rFonts w:ascii="Arial" w:hAnsi="Arial" w:eastAsia="Malgun Gothic"/>
           <w:b w:val="0"/>
           <w:sz w:val="21"/>
         </w:rPr>
@@ -1134,26 +1586,52 @@
       </w:r>
     </w:p>
     <w:p>
+      <w:pPr>
+        <w:spacing w:line="295" w:lineRule="auto" w:after="140"/>
+        <w:jc w:val="both"/>
+      </w:pPr>
       <w:r>
         <w:rPr>
-          <w:rFonts w:ascii="Malgun Gothic" w:hAnsi="Malgun Gothic"/>
+          <w:rFonts w:ascii="Arial" w:hAnsi="Arial" w:eastAsia="Malgun Gothic"/>
           <w:b w:val="0"/>
           <w:sz w:val="21"/>
         </w:rPr>
-        <w:t>Class imbalance는 두 단계로 고려하였다. 첫째, 교수님 피드백에 따라 target 기준을 130/80으로 수정하여 양성 class 비율을 약 23%로 높였다. 둘째, PyCaret setup에서 SMOTE를 적용하고, 최종 Logistic Regression pipeline에서는 class_weight='balanced'를 함께 사용하였다.</w:t>
+        <w:t>Class imbalance는 두 단계로 고려하였다. 첫째, 교수님 피드백에 따라 target 기준을 130/80으로 수정하여 양성 class 비율을 약 23%로 높였다. 이는 140/90 기준에서보다 모델이 고혈압군 특징을 배울 기회를 늘리는 것이다. 둘째, PyCaret setup에서 SMOTE를 적용하고, 최종 Logistic Regression pipeline에서 class_weight='balanced'를 사용하여 소수 class 학습 기회를 보완하였다. 다만 이 처리는 정밀도와 재현율 사이의 trade-off가 있으므로 성능 해석에서 함께 살펴보았다.</w:t>
       </w:r>
     </w:p>
     <w:p>
       <w:pPr>
         <w:pStyle w:val="Heading1"/>
+        <w:spacing w:before="320" w:after="160"/>
+        <w:jc w:val="left"/>
+        <w:pBdr>
+          <w:bottom w:val="single" w:sz="6" w:space="4" w:color="9EC5E8"/>
+        </w:pBdr>
       </w:pPr>
       <w:r>
         <w:rPr>
-          <w:rFonts w:ascii="Malgun Gothic" w:hAnsi="Malgun Gothic"/>
+          <w:rFonts w:ascii="Arial" w:hAnsi="Arial" w:eastAsia="Malgun Gothic"/>
           <w:b/>
+          <w:color w:val="14315C"/>
           <w:sz w:val="28"/>
         </w:rPr>
         <w:t>5. 측정 방식 변화 및 민감도 분석</w:t>
+      </w:r>
+    </w:p>
+    <w:p>
+      <w:pPr>
+        <w:pStyle w:val="Caption"/>
+        <w:spacing w:before="80" w:after="140"/>
+        <w:jc w:val="center"/>
+      </w:pPr>
+      <w:r>
+        <w:rPr>
+          <w:rFonts w:ascii="Arial" w:hAnsi="Arial" w:eastAsia="Malgun Gothic"/>
+          <w:b w:val="0"/>
+          <w:color w:val="5A5A5A"/>
+          <w:sz w:val="18"/>
+        </w:rPr>
+        <w:t>표 5. 혈압 측정 방식 변화 관련 민감도 분석 요약</w:t>
       </w:r>
     </w:p>
     <w:tbl>
@@ -1161,6 +1639,7 @@
         <w:tblStyle w:val="TableGrid"/>
         <w:tblW w:type="auto" w:w="0"/>
         <w:jc w:val="center"/>
+        <w:tblLayout w:type="autofit"/>
         <w:tblLook w:firstColumn="1" w:firstRow="1" w:lastColumn="0" w:lastRow="0" w:noHBand="0" w:noVBand="1" w:val="04A0"/>
       </w:tblPr>
       <w:tblGrid>
@@ -1175,13 +1654,18 @@
           <w:tcPr>
             <w:tcW w:type="dxa" w:w="1958"/>
             <w:vAlign w:val="center"/>
+            <w:shd w:fill="D9EAF7"/>
           </w:tcPr>
           <w:p>
+            <w:pPr>
+              <w:spacing w:before="20" w:after="20" w:line="252" w:lineRule="auto"/>
+            </w:pPr>
             <w:r>
               <w:rPr>
-                <w:rFonts w:ascii="Malgun Gothic" w:hAnsi="Malgun Gothic"/>
+                <w:rFonts w:ascii="Arial" w:hAnsi="Arial" w:eastAsia="Malgun Gothic"/>
                 <w:b/>
-                <w:sz w:val="19"/>
+                <w:color w:val="14315C"/>
+                <w:sz w:val="18"/>
               </w:rPr>
               <w:t>분석</w:t>
             </w:r>
@@ -1191,13 +1675,18 @@
           <w:tcPr>
             <w:tcW w:type="dxa" w:w="1958"/>
             <w:vAlign w:val="center"/>
+            <w:shd w:fill="D9EAF7"/>
           </w:tcPr>
           <w:p>
+            <w:pPr>
+              <w:spacing w:before="20" w:after="20" w:line="252" w:lineRule="auto"/>
+            </w:pPr>
             <w:r>
               <w:rPr>
-                <w:rFonts w:ascii="Malgun Gothic" w:hAnsi="Malgun Gothic"/>
+                <w:rFonts w:ascii="Arial" w:hAnsi="Arial" w:eastAsia="Malgun Gothic"/>
                 <w:b/>
-                <w:sz w:val="19"/>
+                <w:color w:val="14315C"/>
+                <w:sz w:val="18"/>
               </w:rPr>
               <w:t>before</w:t>
             </w:r>
@@ -1207,13 +1696,18 @@
           <w:tcPr>
             <w:tcW w:type="dxa" w:w="1958"/>
             <w:vAlign w:val="center"/>
+            <w:shd w:fill="D9EAF7"/>
           </w:tcPr>
           <w:p>
+            <w:pPr>
+              <w:spacing w:before="20" w:after="20" w:line="252" w:lineRule="auto"/>
+            </w:pPr>
             <w:r>
               <w:rPr>
-                <w:rFonts w:ascii="Malgun Gothic" w:hAnsi="Malgun Gothic"/>
+                <w:rFonts w:ascii="Arial" w:hAnsi="Arial" w:eastAsia="Malgun Gothic"/>
                 <w:b/>
-                <w:sz w:val="19"/>
+                <w:color w:val="14315C"/>
+                <w:sz w:val="18"/>
               </w:rPr>
               <w:t>during</w:t>
             </w:r>
@@ -1223,13 +1717,18 @@
           <w:tcPr>
             <w:tcW w:type="dxa" w:w="1958"/>
             <w:vAlign w:val="center"/>
+            <w:shd w:fill="D9EAF7"/>
           </w:tcPr>
           <w:p>
+            <w:pPr>
+              <w:spacing w:before="20" w:after="20" w:line="252" w:lineRule="auto"/>
+            </w:pPr>
             <w:r>
               <w:rPr>
-                <w:rFonts w:ascii="Malgun Gothic" w:hAnsi="Malgun Gothic"/>
+                <w:rFonts w:ascii="Arial" w:hAnsi="Arial" w:eastAsia="Malgun Gothic"/>
                 <w:b/>
-                <w:sz w:val="19"/>
+                <w:color w:val="14315C"/>
+                <w:sz w:val="18"/>
               </w:rPr>
               <w:t>after</w:t>
             </w:r>
@@ -1239,13 +1738,18 @@
           <w:tcPr>
             <w:tcW w:type="dxa" w:w="1958"/>
             <w:vAlign w:val="center"/>
+            <w:shd w:fill="D9EAF7"/>
           </w:tcPr>
           <w:p>
+            <w:pPr>
+              <w:spacing w:before="20" w:after="20" w:line="252" w:lineRule="auto"/>
+            </w:pPr>
             <w:r>
               <w:rPr>
-                <w:rFonts w:ascii="Malgun Gothic" w:hAnsi="Malgun Gothic"/>
+                <w:rFonts w:ascii="Arial" w:hAnsi="Arial" w:eastAsia="Malgun Gothic"/>
                 <w:b/>
-                <w:sz w:val="19"/>
+                <w:color w:val="14315C"/>
+                <w:sz w:val="18"/>
               </w:rPr>
               <w:t>해석</w:t>
             </w:r>
@@ -1259,11 +1763,15 @@
             <w:vAlign w:val="center"/>
           </w:tcPr>
           <w:p>
+            <w:pPr>
+              <w:spacing w:before="20" w:after="20" w:line="252" w:lineRule="auto"/>
+            </w:pPr>
             <w:r>
               <w:rPr>
-                <w:rFonts w:ascii="Malgun Gothic" w:hAnsi="Malgun Gothic"/>
+                <w:rFonts w:ascii="Arial" w:hAnsi="Arial" w:eastAsia="Malgun Gothic"/>
                 <w:b w:val="0"/>
-                <w:sz w:val="19"/>
+                <w:color w:val="000000"/>
+                <w:sz w:val="18"/>
               </w:rPr>
               <w:t>원자료 기준</w:t>
             </w:r>
@@ -1275,11 +1783,15 @@
             <w:vAlign w:val="center"/>
           </w:tcPr>
           <w:p>
+            <w:pPr>
+              <w:spacing w:before="20" w:after="20" w:line="252" w:lineRule="auto"/>
+            </w:pPr>
             <w:r>
               <w:rPr>
-                <w:rFonts w:ascii="Malgun Gothic" w:hAnsi="Malgun Gothic"/>
+                <w:rFonts w:ascii="Arial" w:hAnsi="Arial" w:eastAsia="Malgun Gothic"/>
                 <w:b w:val="0"/>
-                <w:sz w:val="19"/>
+                <w:color w:val="000000"/>
+                <w:sz w:val="18"/>
               </w:rPr>
               <w:t>26.4%</w:t>
             </w:r>
@@ -1291,11 +1803,15 @@
             <w:vAlign w:val="center"/>
           </w:tcPr>
           <w:p>
+            <w:pPr>
+              <w:spacing w:before="20" w:after="20" w:line="252" w:lineRule="auto"/>
+            </w:pPr>
             <w:r>
               <w:rPr>
-                <w:rFonts w:ascii="Malgun Gothic" w:hAnsi="Malgun Gothic"/>
+                <w:rFonts w:ascii="Arial" w:hAnsi="Arial" w:eastAsia="Malgun Gothic"/>
                 <w:b w:val="0"/>
-                <w:sz w:val="19"/>
+                <w:color w:val="000000"/>
+                <w:sz w:val="18"/>
               </w:rPr>
               <w:t>24.0%</w:t>
             </w:r>
@@ -1307,11 +1823,15 @@
             <w:vAlign w:val="center"/>
           </w:tcPr>
           <w:p>
+            <w:pPr>
+              <w:spacing w:before="20" w:after="20" w:line="252" w:lineRule="auto"/>
+            </w:pPr>
             <w:r>
               <w:rPr>
-                <w:rFonts w:ascii="Malgun Gothic" w:hAnsi="Malgun Gothic"/>
+                <w:rFonts w:ascii="Arial" w:hAnsi="Arial" w:eastAsia="Malgun Gothic"/>
                 <w:b w:val="0"/>
-                <w:sz w:val="19"/>
+                <w:color w:val="000000"/>
+                <w:sz w:val="18"/>
               </w:rPr>
               <w:t>15.1%</w:t>
             </w:r>
@@ -1323,11 +1843,15 @@
             <w:vAlign w:val="center"/>
           </w:tcPr>
           <w:p>
+            <w:pPr>
+              <w:spacing w:before="20" w:after="20" w:line="252" w:lineRule="auto"/>
+            </w:pPr>
             <w:r>
               <w:rPr>
-                <w:rFonts w:ascii="Malgun Gothic" w:hAnsi="Malgun Gothic"/>
+                <w:rFonts w:ascii="Arial" w:hAnsi="Arial" w:eastAsia="Malgun Gothic"/>
                 <w:b w:val="0"/>
-                <w:sz w:val="19"/>
+                <w:color w:val="000000"/>
+                <w:sz w:val="18"/>
               </w:rPr>
               <w:t>after period에서 급격한 감소가 보임</w:t>
             </w:r>
@@ -1341,11 +1865,15 @@
             <w:vAlign w:val="center"/>
           </w:tcPr>
           <w:p>
+            <w:pPr>
+              <w:spacing w:before="20" w:after="20" w:line="252" w:lineRule="auto"/>
+            </w:pPr>
             <w:r>
               <w:rPr>
-                <w:rFonts w:ascii="Malgun Gothic" w:hAnsi="Malgun Gothic"/>
+                <w:rFonts w:ascii="Arial" w:hAnsi="Arial" w:eastAsia="Malgun Gothic"/>
                 <w:b w:val="0"/>
-                <w:sz w:val="19"/>
+                <w:color w:val="000000"/>
+                <w:sz w:val="18"/>
               </w:rPr>
               <w:t>DBP 보정 민감도분석</w:t>
             </w:r>
@@ -1357,11 +1885,15 @@
             <w:vAlign w:val="center"/>
           </w:tcPr>
           <w:p>
+            <w:pPr>
+              <w:spacing w:before="20" w:after="20" w:line="252" w:lineRule="auto"/>
+            </w:pPr>
             <w:r>
               <w:rPr>
-                <w:rFonts w:ascii="Malgun Gothic" w:hAnsi="Malgun Gothic"/>
+                <w:rFonts w:ascii="Arial" w:hAnsi="Arial" w:eastAsia="Malgun Gothic"/>
                 <w:b w:val="0"/>
-                <w:sz w:val="19"/>
+                <w:color w:val="000000"/>
+                <w:sz w:val="18"/>
               </w:rPr>
               <w:t>26.4%</w:t>
             </w:r>
@@ -1373,11 +1905,15 @@
             <w:vAlign w:val="center"/>
           </w:tcPr>
           <w:p>
+            <w:pPr>
+              <w:spacing w:before="20" w:after="20" w:line="252" w:lineRule="auto"/>
+            </w:pPr>
             <w:r>
               <w:rPr>
-                <w:rFonts w:ascii="Malgun Gothic" w:hAnsi="Malgun Gothic"/>
+                <w:rFonts w:ascii="Arial" w:hAnsi="Arial" w:eastAsia="Malgun Gothic"/>
                 <w:b w:val="0"/>
-                <w:sz w:val="19"/>
+                <w:color w:val="000000"/>
+                <w:sz w:val="18"/>
               </w:rPr>
               <w:t>27.4%</w:t>
             </w:r>
@@ -1389,11 +1925,15 @@
             <w:vAlign w:val="center"/>
           </w:tcPr>
           <w:p>
+            <w:pPr>
+              <w:spacing w:before="20" w:after="20" w:line="252" w:lineRule="auto"/>
+            </w:pPr>
             <w:r>
               <w:rPr>
-                <w:rFonts w:ascii="Malgun Gothic" w:hAnsi="Malgun Gothic"/>
+                <w:rFonts w:ascii="Arial" w:hAnsi="Arial" w:eastAsia="Malgun Gothic"/>
                 <w:b w:val="0"/>
-                <w:sz w:val="19"/>
+                <w:color w:val="000000"/>
+                <w:sz w:val="18"/>
               </w:rPr>
               <w:t>23.0%</w:t>
             </w:r>
@@ -1405,11 +1945,15 @@
             <w:vAlign w:val="center"/>
           </w:tcPr>
           <w:p>
+            <w:pPr>
+              <w:spacing w:before="20" w:after="20" w:line="252" w:lineRule="auto"/>
+            </w:pPr>
             <w:r>
               <w:rPr>
-                <w:rFonts w:ascii="Malgun Gothic" w:hAnsi="Malgun Gothic"/>
+                <w:rFonts w:ascii="Arial" w:hAnsi="Arial" w:eastAsia="Malgun Gothic"/>
                 <w:b w:val="0"/>
-                <w:sz w:val="19"/>
+                <w:color w:val="000000"/>
+                <w:sz w:val="18"/>
               </w:rPr>
               <w:t>단순 감소 폭이 줄어듦</w:t>
             </w:r>
@@ -1423,11 +1967,15 @@
             <w:vAlign w:val="center"/>
           </w:tcPr>
           <w:p>
+            <w:pPr>
+              <w:spacing w:before="20" w:after="20" w:line="252" w:lineRule="auto"/>
+            </w:pPr>
             <w:r>
               <w:rPr>
-                <w:rFonts w:ascii="Malgun Gothic" w:hAnsi="Malgun Gothic"/>
+                <w:rFonts w:ascii="Arial" w:hAnsi="Arial" w:eastAsia="Malgun Gothic"/>
                 <w:b w:val="0"/>
-                <w:sz w:val="19"/>
+                <w:color w:val="000000"/>
+                <w:sz w:val="18"/>
               </w:rPr>
               <w:t>측정 일관 연도 제한분석</w:t>
             </w:r>
@@ -1439,11 +1987,15 @@
             <w:vAlign w:val="center"/>
           </w:tcPr>
           <w:p>
+            <w:pPr>
+              <w:spacing w:before="20" w:after="20" w:line="252" w:lineRule="auto"/>
+            </w:pPr>
             <w:r>
               <w:rPr>
-                <w:rFonts w:ascii="Malgun Gothic" w:hAnsi="Malgun Gothic"/>
+                <w:rFonts w:ascii="Arial" w:hAnsi="Arial" w:eastAsia="Malgun Gothic"/>
                 <w:b w:val="0"/>
-                <w:sz w:val="19"/>
+                <w:color w:val="000000"/>
+                <w:sz w:val="18"/>
               </w:rPr>
               <w:t>2017-2020: 27.3%</w:t>
             </w:r>
@@ -1455,11 +2007,15 @@
             <w:vAlign w:val="center"/>
           </w:tcPr>
           <w:p>
+            <w:pPr>
+              <w:spacing w:before="20" w:after="20" w:line="252" w:lineRule="auto"/>
+            </w:pPr>
             <w:r>
               <w:rPr>
-                <w:rFonts w:ascii="Malgun Gothic" w:hAnsi="Malgun Gothic"/>
+                <w:rFonts w:ascii="Arial" w:hAnsi="Arial" w:eastAsia="Malgun Gothic"/>
                 <w:b w:val="0"/>
-                <w:sz w:val="19"/>
+                <w:color w:val="000000"/>
+                <w:sz w:val="18"/>
               </w:rPr>
               <w:t>-</w:t>
             </w:r>
@@ -1471,11 +2027,15 @@
             <w:vAlign w:val="center"/>
           </w:tcPr>
           <w:p>
+            <w:pPr>
+              <w:spacing w:before="20" w:after="20" w:line="252" w:lineRule="auto"/>
+            </w:pPr>
             <w:r>
               <w:rPr>
-                <w:rFonts w:ascii="Malgun Gothic" w:hAnsi="Malgun Gothic"/>
+                <w:rFonts w:ascii="Arial" w:hAnsi="Arial" w:eastAsia="Malgun Gothic"/>
                 <w:b w:val="0"/>
-                <w:sz w:val="19"/>
+                <w:color w:val="000000"/>
+                <w:sz w:val="18"/>
               </w:rPr>
               <w:t>2022-2023: 15.1%</w:t>
             </w:r>
@@ -1487,11 +2047,15 @@
             <w:vAlign w:val="center"/>
           </w:tcPr>
           <w:p>
+            <w:pPr>
+              <w:spacing w:before="20" w:after="20" w:line="252" w:lineRule="auto"/>
+            </w:pPr>
             <w:r>
               <w:rPr>
-                <w:rFonts w:ascii="Malgun Gothic" w:hAnsi="Malgun Gothic"/>
+                <w:rFonts w:ascii="Arial" w:hAnsi="Arial" w:eastAsia="Malgun Gothic"/>
                 <w:b w:val="0"/>
-                <w:sz w:val="19"/>
+                <w:color w:val="000000"/>
+                <w:sz w:val="18"/>
               </w:rPr>
               <w:t>측정체계 차이를 따로 고려</w:t>
             </w:r>
@@ -1501,26 +2065,66 @@
     </w:tbl>
     <w:p/>
     <w:p>
+      <w:pPr>
+        <w:spacing w:line="295" w:lineRule="auto" w:after="140"/>
+        <w:jc w:val="both"/>
+      </w:pPr>
       <w:r>
         <w:rPr>
-          <w:rFonts w:ascii="Malgun Gothic" w:hAnsi="Malgun Gothic"/>
+          <w:rFonts w:ascii="Arial" w:hAnsi="Arial" w:eastAsia="Malgun Gothic"/>
           <w:b w:val="0"/>
           <w:sz w:val="21"/>
         </w:rPr>
-        <w:t>DBP 보정 결과는 본분석이 아니라 민감도 분석으로 제시하였다. 이 부분은 COVID 전후 변화라기보다 KNHANES 측정체계 변화에 따른 심혈관·대사 변수의 불연속성으로 해석하는 것이 적절하다.</w:t>
+        <w:t>DBP 보정 결과는 본분석이 아니라 민감도 분석으로 제시하였다. 원자료에서 after period의 고혈압 비율이 낮게 보이는 현상은 COVID 이후 건강상태가 실제로 개선되었다는 결론으로 연결하기 어렵다. 교수님 피드백과 추가 검토 결과를 바탕으로, 이 부분은 COVID 전후 변화라기보다 KNHANES 측정체계 변화에 따른 심혈관·대사 변수의 불연속성으로 해석하는 것이 적절하다. 따라서 보고서에서는 원자료 결과, batch 보정 민감도 결과, 측정 일관 연도 제한분석을 함께 보여주었다.</w:t>
       </w:r>
     </w:p>
     <w:p>
       <w:pPr>
         <w:pStyle w:val="Heading1"/>
+        <w:spacing w:before="320" w:after="160"/>
+        <w:jc w:val="left"/>
+        <w:pBdr>
+          <w:bottom w:val="single" w:sz="6" w:space="4" w:color="9EC5E8"/>
+        </w:pBdr>
       </w:pPr>
       <w:r>
         <w:rPr>
-          <w:rFonts w:ascii="Malgun Gothic" w:hAnsi="Malgun Gothic"/>
+          <w:rFonts w:ascii="Arial" w:hAnsi="Arial" w:eastAsia="Malgun Gothic"/>
           <w:b/>
+          <w:color w:val="14315C"/>
           <w:sz w:val="28"/>
         </w:rPr>
-        <w:t>6. 모델 Screening</w:t>
+        <w:t>6. 교수님 피드백 반영 사항</w:t>
+      </w:r>
+    </w:p>
+    <w:p>
+      <w:pPr>
+        <w:spacing w:line="295" w:lineRule="auto" w:after="140"/>
+        <w:jc w:val="both"/>
+      </w:pPr>
+      <w:r>
+        <w:rPr>
+          <w:rFonts w:ascii="Arial" w:hAnsi="Arial" w:eastAsia="Malgun Gothic"/>
+          <w:b w:val="0"/>
+          <w:sz w:val="21"/>
+        </w:rPr>
+        <w:t>발표 후 교수님께서 주신 피드백은 단순히 변수를 늘리는 것보다, 모델이 어떤 정보를 사용하고 있는지를 설명할 수 있도록 정리하는 데 초점이 있었다. 따라서 식이변수 추가, 시기 변수 반영, 차트 보완, 튜닝 명시, SHAP 해석, 통계적 비교, 웹 기준 변경을 하나씩 확인하였다.</w:t>
+      </w:r>
+    </w:p>
+    <w:p>
+      <w:pPr>
+        <w:pStyle w:val="Caption"/>
+        <w:spacing w:before="80" w:after="140"/>
+        <w:jc w:val="center"/>
+      </w:pPr>
+      <w:r>
+        <w:rPr>
+          <w:rFonts w:ascii="Arial" w:hAnsi="Arial" w:eastAsia="Malgun Gothic"/>
+          <w:b w:val="0"/>
+          <w:color w:val="5A5A5A"/>
+          <w:sz w:val="18"/>
+        </w:rPr>
+        <w:t>표 6. 교수님 피드백 반영 내용</w:t>
       </w:r>
     </w:p>
     <w:tbl>
@@ -1528,6 +2132,449 @@
         <w:tblStyle w:val="TableGrid"/>
         <w:tblW w:type="auto" w:w="0"/>
         <w:jc w:val="center"/>
+        <w:tblLayout w:type="autofit"/>
+        <w:tblLook w:firstColumn="1" w:firstRow="1" w:lastColumn="0" w:lastRow="0" w:noHBand="0" w:noVBand="1" w:val="04A0"/>
+      </w:tblPr>
+      <w:tblGrid>
+        <w:gridCol w:w="4896"/>
+        <w:gridCol w:w="4896"/>
+      </w:tblGrid>
+      <w:tr>
+        <w:tc>
+          <w:tcPr>
+            <w:tcW w:type="dxa" w:w="4896"/>
+            <w:shd w:fill="D9EAF7"/>
+            <w:vAlign w:val="center"/>
+          </w:tcPr>
+          <w:p>
+            <w:pPr>
+              <w:spacing w:before="20" w:after="20" w:line="252" w:lineRule="auto"/>
+            </w:pPr>
+            <w:r>
+              <w:rPr>
+                <w:rFonts w:ascii="Arial" w:hAnsi="Arial" w:eastAsia="Malgun Gothic"/>
+                <w:b/>
+                <w:color w:val="14315C"/>
+                <w:sz w:val="18"/>
+              </w:rPr>
+              <w:t>피드백 항목</w:t>
+            </w:r>
+          </w:p>
+        </w:tc>
+        <w:tc>
+          <w:tcPr>
+            <w:tcW w:type="dxa" w:w="4896"/>
+            <w:shd w:fill="D9EAF7"/>
+            <w:vAlign w:val="center"/>
+          </w:tcPr>
+          <w:p>
+            <w:pPr>
+              <w:spacing w:before="20" w:after="20" w:line="252" w:lineRule="auto"/>
+            </w:pPr>
+            <w:r>
+              <w:rPr>
+                <w:rFonts w:ascii="Arial" w:hAnsi="Arial" w:eastAsia="Malgun Gothic"/>
+                <w:b/>
+                <w:color w:val="14315C"/>
+                <w:sz w:val="18"/>
+              </w:rPr>
+              <w:t>반영 내용</w:t>
+            </w:r>
+          </w:p>
+        </w:tc>
+      </w:tr>
+      <w:tr>
+        <w:tc>
+          <w:tcPr>
+            <w:tcW w:type="dxa" w:w="4896"/>
+            <w:vAlign w:val="center"/>
+          </w:tcPr>
+          <w:p>
+            <w:pPr>
+              <w:spacing w:before="20" w:after="20" w:line="252" w:lineRule="auto"/>
+            </w:pPr>
+            <w:r>
+              <w:rPr>
+                <w:rFonts w:ascii="Arial" w:hAnsi="Arial" w:eastAsia="Malgun Gothic"/>
+                <w:b w:val="0"/>
+                <w:color w:val="000000"/>
+                <w:sz w:val="18"/>
+              </w:rPr>
+              <w:t>식이변수 추가</w:t>
+            </w:r>
+          </w:p>
+        </w:tc>
+        <w:tc>
+          <w:tcPr>
+            <w:tcW w:type="dxa" w:w="4896"/>
+            <w:vAlign w:val="center"/>
+          </w:tcPr>
+          <w:p>
+            <w:pPr>
+              <w:spacing w:before="20" w:after="20" w:line="252" w:lineRule="auto"/>
+            </w:pPr>
+            <w:r>
+              <w:rPr>
+                <w:rFonts w:ascii="Arial" w:hAnsi="Arial" w:eastAsia="Malgun Gothic"/>
+                <w:b w:val="0"/>
+                <w:color w:val="000000"/>
+                <w:sz w:val="18"/>
+              </w:rPr>
+              <w:t>나트륨 섭취량(N_NA)과 칼륨 섭취량(N_K)을 추가하고 모델을 다시 학습하였다. 두 변수의 결측률은 약 14.7%로 30% 기준 이하이다.</w:t>
+            </w:r>
+          </w:p>
+        </w:tc>
+      </w:tr>
+      <w:tr>
+        <w:tc>
+          <w:tcPr>
+            <w:tcW w:type="dxa" w:w="4896"/>
+            <w:vAlign w:val="center"/>
+          </w:tcPr>
+          <w:p>
+            <w:pPr>
+              <w:spacing w:before="20" w:after="20" w:line="252" w:lineRule="auto"/>
+            </w:pPr>
+            <w:r>
+              <w:rPr>
+                <w:rFonts w:ascii="Arial" w:hAnsi="Arial" w:eastAsia="Malgun Gothic"/>
+                <w:b w:val="0"/>
+                <w:color w:val="000000"/>
+                <w:sz w:val="18"/>
+              </w:rPr>
+              <w:t>covid_period 변수</w:t>
+            </w:r>
+          </w:p>
+        </w:tc>
+        <w:tc>
+          <w:tcPr>
+            <w:tcW w:type="dxa" w:w="4896"/>
+            <w:vAlign w:val="center"/>
+          </w:tcPr>
+          <w:p>
+            <w:pPr>
+              <w:spacing w:before="20" w:after="20" w:line="252" w:lineRule="auto"/>
+            </w:pPr>
+            <w:r>
+              <w:rPr>
+                <w:rFonts w:ascii="Arial" w:hAnsi="Arial" w:eastAsia="Malgun Gothic"/>
+                <w:b w:val="0"/>
+                <w:color w:val="000000"/>
+                <w:sz w:val="18"/>
+              </w:rPr>
+              <w:t>모델 feature에 포함하되, COVID의 인과효과가 아니라 조사 시기와 측정환경 변화가 함께 반영된 변수로 제한해서 해석하였다.</w:t>
+            </w:r>
+          </w:p>
+        </w:tc>
+      </w:tr>
+      <w:tr>
+        <w:tc>
+          <w:tcPr>
+            <w:tcW w:type="dxa" w:w="4896"/>
+            <w:vAlign w:val="center"/>
+          </w:tcPr>
+          <w:p>
+            <w:pPr>
+              <w:spacing w:before="20" w:after="20" w:line="252" w:lineRule="auto"/>
+            </w:pPr>
+            <w:r>
+              <w:rPr>
+                <w:rFonts w:ascii="Arial" w:hAnsi="Arial" w:eastAsia="Malgun Gothic"/>
+                <w:b w:val="0"/>
+                <w:color w:val="000000"/>
+                <w:sz w:val="18"/>
+              </w:rPr>
+              <w:t>전·중·후 비교 차트</w:t>
+            </w:r>
+          </w:p>
+        </w:tc>
+        <w:tc>
+          <w:tcPr>
+            <w:tcW w:type="dxa" w:w="4896"/>
+            <w:vAlign w:val="center"/>
+          </w:tcPr>
+          <w:p>
+            <w:pPr>
+              <w:spacing w:before="20" w:after="20" w:line="252" w:lineRule="auto"/>
+            </w:pPr>
+            <w:r>
+              <w:rPr>
+                <w:rFonts w:ascii="Arial" w:hAnsi="Arial" w:eastAsia="Malgun Gothic"/>
+                <w:b w:val="0"/>
+                <w:color w:val="000000"/>
+                <w:sz w:val="18"/>
+              </w:rPr>
+              <w:t>before/during/after 비교는 표뿐 아니라 차트로 제시하였다. after period 감소는 측정 방식 변화 가능성과 함께 해석하였다.</w:t>
+            </w:r>
+          </w:p>
+        </w:tc>
+      </w:tr>
+      <w:tr>
+        <w:tc>
+          <w:tcPr>
+            <w:tcW w:type="dxa" w:w="4896"/>
+            <w:vAlign w:val="center"/>
+          </w:tcPr>
+          <w:p>
+            <w:pPr>
+              <w:spacing w:before="20" w:after="20" w:line="252" w:lineRule="auto"/>
+            </w:pPr>
+            <w:r>
+              <w:rPr>
+                <w:rFonts w:ascii="Arial" w:hAnsi="Arial" w:eastAsia="Malgun Gothic"/>
+                <w:b w:val="0"/>
+                <w:color w:val="000000"/>
+                <w:sz w:val="18"/>
+              </w:rPr>
+              <w:t>모델 비교·성능 비교 차트</w:t>
+            </w:r>
+          </w:p>
+        </w:tc>
+        <w:tc>
+          <w:tcPr>
+            <w:tcW w:type="dxa" w:w="4896"/>
+            <w:vAlign w:val="center"/>
+          </w:tcPr>
+          <w:p>
+            <w:pPr>
+              <w:spacing w:before="20" w:after="20" w:line="252" w:lineRule="auto"/>
+            </w:pPr>
+            <w:r>
+              <w:rPr>
+                <w:rFonts w:ascii="Arial" w:hAnsi="Arial" w:eastAsia="Malgun Gothic"/>
+                <w:b w:val="0"/>
+                <w:color w:val="000000"/>
+                <w:sz w:val="18"/>
+              </w:rPr>
+              <w:t>모델 AUC 비교, Confusion Matrix, ROC Curve, PR Curve, Feature Importance 차트를 새로 생성하였다.</w:t>
+            </w:r>
+          </w:p>
+        </w:tc>
+      </w:tr>
+      <w:tr>
+        <w:tc>
+          <w:tcPr>
+            <w:tcW w:type="dxa" w:w="4896"/>
+            <w:vAlign w:val="center"/>
+          </w:tcPr>
+          <w:p>
+            <w:pPr>
+              <w:spacing w:before="20" w:after="20" w:line="252" w:lineRule="auto"/>
+            </w:pPr>
+            <w:r>
+              <w:rPr>
+                <w:rFonts w:ascii="Arial" w:hAnsi="Arial" w:eastAsia="Malgun Gothic"/>
+                <w:b w:val="0"/>
+                <w:color w:val="000000"/>
+                <w:sz w:val="18"/>
+              </w:rPr>
+              <w:t>하이퍼파라미터 튜닝 명시</w:t>
+            </w:r>
+          </w:p>
+        </w:tc>
+        <w:tc>
+          <w:tcPr>
+            <w:tcW w:type="dxa" w:w="4896"/>
+            <w:vAlign w:val="center"/>
+          </w:tcPr>
+          <w:p>
+            <w:pPr>
+              <w:spacing w:before="20" w:after="20" w:line="252" w:lineRule="auto"/>
+            </w:pPr>
+            <w:r>
+              <w:rPr>
+                <w:rFonts w:ascii="Arial" w:hAnsi="Arial" w:eastAsia="Malgun Gothic"/>
+                <w:b w:val="0"/>
+                <w:color w:val="000000"/>
+                <w:sz w:val="18"/>
+              </w:rPr>
+              <w:t>PyCaret tune_model(..., optimize='AUC', n_iter=10)을 사용한 점을 notebook과 보고서에 명시하였다.</w:t>
+            </w:r>
+          </w:p>
+        </w:tc>
+      </w:tr>
+      <w:tr>
+        <w:tc>
+          <w:tcPr>
+            <w:tcW w:type="dxa" w:w="4896"/>
+            <w:vAlign w:val="center"/>
+          </w:tcPr>
+          <w:p>
+            <w:pPr>
+              <w:spacing w:before="20" w:after="20" w:line="252" w:lineRule="auto"/>
+            </w:pPr>
+            <w:r>
+              <w:rPr>
+                <w:rFonts w:ascii="Arial" w:hAnsi="Arial" w:eastAsia="Malgun Gothic"/>
+                <w:b w:val="0"/>
+                <w:color w:val="000000"/>
+                <w:sz w:val="18"/>
+              </w:rPr>
+              <w:t>SHAP 해석</w:t>
+            </w:r>
+          </w:p>
+        </w:tc>
+        <w:tc>
+          <w:tcPr>
+            <w:tcW w:type="dxa" w:w="4896"/>
+            <w:vAlign w:val="center"/>
+          </w:tcPr>
+          <w:p>
+            <w:pPr>
+              <w:spacing w:before="20" w:after="20" w:line="252" w:lineRule="auto"/>
+            </w:pPr>
+            <w:r>
+              <w:rPr>
+                <w:rFonts w:ascii="Arial" w:hAnsi="Arial" w:eastAsia="Malgun Gothic"/>
+                <w:b w:val="0"/>
+                <w:color w:val="000000"/>
+                <w:sz w:val="18"/>
+              </w:rPr>
+              <w:t>SHAP summary plot을 포함하고, 결과는 인과관계가 아니라 모델 설명용으로 해석하였다.</w:t>
+            </w:r>
+          </w:p>
+        </w:tc>
+      </w:tr>
+      <w:tr>
+        <w:tc>
+          <w:tcPr>
+            <w:tcW w:type="dxa" w:w="4896"/>
+            <w:vAlign w:val="center"/>
+          </w:tcPr>
+          <w:p>
+            <w:pPr>
+              <w:spacing w:before="20" w:after="20" w:line="252" w:lineRule="auto"/>
+            </w:pPr>
+            <w:r>
+              <w:rPr>
+                <w:rFonts w:ascii="Arial" w:hAnsi="Arial" w:eastAsia="Malgun Gothic"/>
+                <w:b w:val="0"/>
+                <w:color w:val="000000"/>
+                <w:sz w:val="18"/>
+              </w:rPr>
+              <w:t>통계적 비교</w:t>
+            </w:r>
+          </w:p>
+        </w:tc>
+        <w:tc>
+          <w:tcPr>
+            <w:tcW w:type="dxa" w:w="4896"/>
+            <w:vAlign w:val="center"/>
+          </w:tcPr>
+          <w:p>
+            <w:pPr>
+              <w:spacing w:before="20" w:after="20" w:line="252" w:lineRule="auto"/>
+            </w:pPr>
+            <w:r>
+              <w:rPr>
+                <w:rFonts w:ascii="Arial" w:hAnsi="Arial" w:eastAsia="Malgun Gothic"/>
+                <w:b w:val="0"/>
+                <w:color w:val="000000"/>
+                <w:sz w:val="18"/>
+              </w:rPr>
+              <w:t>주요 변수의 고혈압군/비고혈압군 차이를 Welch t-test와 chi-square test로 비교하고 p-value를 확인하였다.</w:t>
+            </w:r>
+          </w:p>
+        </w:tc>
+      </w:tr>
+      <w:tr>
+        <w:tc>
+          <w:tcPr>
+            <w:tcW w:type="dxa" w:w="4896"/>
+            <w:vAlign w:val="center"/>
+          </w:tcPr>
+          <w:p>
+            <w:pPr>
+              <w:spacing w:before="20" w:after="20" w:line="252" w:lineRule="auto"/>
+            </w:pPr>
+            <w:r>
+              <w:rPr>
+                <w:rFonts w:ascii="Arial" w:hAnsi="Arial" w:eastAsia="Malgun Gothic"/>
+                <w:b w:val="0"/>
+                <w:color w:val="000000"/>
+                <w:sz w:val="18"/>
+              </w:rPr>
+              <w:t>웹 post-COVID 기준</w:t>
+            </w:r>
+          </w:p>
+        </w:tc>
+        <w:tc>
+          <w:tcPr>
+            <w:tcW w:type="dxa" w:w="4896"/>
+            <w:vAlign w:val="center"/>
+          </w:tcPr>
+          <w:p>
+            <w:pPr>
+              <w:spacing w:before="20" w:after="20" w:line="252" w:lineRule="auto"/>
+            </w:pPr>
+            <w:r>
+              <w:rPr>
+                <w:rFonts w:ascii="Arial" w:hAnsi="Arial" w:eastAsia="Malgun Gothic"/>
+                <w:b w:val="0"/>
+                <w:color w:val="000000"/>
+                <w:sz w:val="18"/>
+              </w:rPr>
+              <w:t>Streamlit은 사용자가 조사 시기를 선택하지 않도록 하고 post-COVID(2022-2023) 측정환경 기준으로 예측하도록 설정하였다.</w:t>
+            </w:r>
+          </w:p>
+        </w:tc>
+      </w:tr>
+    </w:tbl>
+    <w:p>
+      <w:pPr>
+        <w:spacing w:line="295" w:lineRule="auto" w:after="140"/>
+        <w:jc w:val="both"/>
+      </w:pPr>
+      <w:r>
+        <w:rPr>
+          <w:rFonts w:ascii="Arial" w:hAnsi="Arial" w:eastAsia="Malgun Gothic"/>
+          <w:b w:val="0"/>
+          <w:sz w:val="21"/>
+        </w:rPr>
+        <w:t>식이변수 추가 후 최종 모델의 holdout 성능은 Precision 0.409, Recall 0.667, F1 0.507, ROC AUC 0.766, Average Precision 0.516으로 확인되었다. 성능 지표는 단일 수치만 보기보다 정밀도와 재현율의 균형을 함께 해석하였다. 또한 추가된 식이 변수가 고혈압군과 비고혈압군에서 어떻게 다른지 확인하기 위해 Welch t-test를 수행하였다. 나트륨 섭취량(N_NA)은 비고혈압군 3214.0±1872.0, 고혈압군 3807.4±2268.2로 차이가 있었고(p&lt;0.001), 칼륨 섭취량(N_K)은 비고혈압군 2489.0±1213.3, 고혈압군 2724.0±1338.4로 차이가 있었다(p&lt;0.001). 다만 이 결과는 집단 간 분포 차이를 확인한 것으로, 식이요인이 고혈압을 직접 유발한다고 해석하지 않았다.</w:t>
+      </w:r>
+    </w:p>
+    <w:p>
+      <w:pPr>
+        <w:pStyle w:val="Heading1"/>
+        <w:spacing w:before="320" w:after="160"/>
+        <w:jc w:val="left"/>
+        <w:pBdr>
+          <w:bottom w:val="single" w:sz="6" w:space="4" w:color="9EC5E8"/>
+        </w:pBdr>
+      </w:pPr>
+      <w:r>
+        <w:rPr>
+          <w:rFonts w:ascii="Arial" w:hAnsi="Arial" w:eastAsia="Malgun Gothic"/>
+          <w:b/>
+          <w:color w:val="14315C"/>
+          <w:sz w:val="28"/>
+        </w:rPr>
+        <w:t>7. 모델 Screening</w:t>
+      </w:r>
+    </w:p>
+    <w:p>
+      <w:pPr>
+        <w:pStyle w:val="Caption"/>
+        <w:spacing w:before="80" w:after="140"/>
+        <w:jc w:val="center"/>
+      </w:pPr>
+      <w:r>
+        <w:rPr>
+          <w:rFonts w:ascii="Arial" w:hAnsi="Arial" w:eastAsia="Malgun Gothic"/>
+          <w:b w:val="0"/>
+          <w:color w:val="5A5A5A"/>
+          <w:sz w:val="18"/>
+        </w:rPr>
+        <w:t>표 7. 모델별 성능 비교</w:t>
+      </w:r>
+    </w:p>
+    <w:tbl>
+      <w:tblPr>
+        <w:tblStyle w:val="TableGrid"/>
+        <w:tblW w:type="auto" w:w="0"/>
+        <w:jc w:val="center"/>
+        <w:tblLayout w:type="autofit"/>
         <w:tblLook w:firstColumn="1" w:firstRow="1" w:lastColumn="0" w:lastRow="0" w:noHBand="0" w:noVBand="1" w:val="04A0"/>
       </w:tblPr>
       <w:tblGrid>
@@ -1543,13 +2590,18 @@
           <w:tcPr>
             <w:tcW w:type="dxa" w:w="1632"/>
             <w:vAlign w:val="center"/>
+            <w:shd w:fill="D9EAF7"/>
           </w:tcPr>
           <w:p>
+            <w:pPr>
+              <w:spacing w:before="20" w:after="20" w:line="252" w:lineRule="auto"/>
+            </w:pPr>
             <w:r>
               <w:rPr>
-                <w:rFonts w:ascii="Malgun Gothic" w:hAnsi="Malgun Gothic"/>
+                <w:rFonts w:ascii="Arial" w:hAnsi="Arial" w:eastAsia="Malgun Gothic"/>
                 <w:b/>
-                <w:sz w:val="19"/>
+                <w:color w:val="14315C"/>
+                <w:sz w:val="18"/>
               </w:rPr>
               <w:t>모델</w:t>
             </w:r>
@@ -1559,13 +2611,18 @@
           <w:tcPr>
             <w:tcW w:type="dxa" w:w="1632"/>
             <w:vAlign w:val="center"/>
+            <w:shd w:fill="D9EAF7"/>
           </w:tcPr>
           <w:p>
+            <w:pPr>
+              <w:spacing w:before="20" w:after="20" w:line="252" w:lineRule="auto"/>
+            </w:pPr>
             <w:r>
               <w:rPr>
-                <w:rFonts w:ascii="Malgun Gothic" w:hAnsi="Malgun Gothic"/>
+                <w:rFonts w:ascii="Arial" w:hAnsi="Arial" w:eastAsia="Malgun Gothic"/>
                 <w:b/>
-                <w:sz w:val="19"/>
+                <w:color w:val="14315C"/>
+                <w:sz w:val="18"/>
               </w:rPr>
               <w:t>Accuracy</w:t>
             </w:r>
@@ -1575,13 +2632,18 @@
           <w:tcPr>
             <w:tcW w:type="dxa" w:w="1632"/>
             <w:vAlign w:val="center"/>
+            <w:shd w:fill="D9EAF7"/>
           </w:tcPr>
           <w:p>
+            <w:pPr>
+              <w:spacing w:before="20" w:after="20" w:line="252" w:lineRule="auto"/>
+            </w:pPr>
             <w:r>
               <w:rPr>
-                <w:rFonts w:ascii="Malgun Gothic" w:hAnsi="Malgun Gothic"/>
+                <w:rFonts w:ascii="Arial" w:hAnsi="Arial" w:eastAsia="Malgun Gothic"/>
                 <w:b/>
-                <w:sz w:val="19"/>
+                <w:color w:val="14315C"/>
+                <w:sz w:val="18"/>
               </w:rPr>
               <w:t>AUC</w:t>
             </w:r>
@@ -1591,13 +2653,18 @@
           <w:tcPr>
             <w:tcW w:type="dxa" w:w="1632"/>
             <w:vAlign w:val="center"/>
+            <w:shd w:fill="D9EAF7"/>
           </w:tcPr>
           <w:p>
+            <w:pPr>
+              <w:spacing w:before="20" w:after="20" w:line="252" w:lineRule="auto"/>
+            </w:pPr>
             <w:r>
               <w:rPr>
-                <w:rFonts w:ascii="Malgun Gothic" w:hAnsi="Malgun Gothic"/>
+                <w:rFonts w:ascii="Arial" w:hAnsi="Arial" w:eastAsia="Malgun Gothic"/>
                 <w:b/>
-                <w:sz w:val="19"/>
+                <w:color w:val="14315C"/>
+                <w:sz w:val="18"/>
               </w:rPr>
               <w:t>Recall</w:t>
             </w:r>
@@ -1607,13 +2674,18 @@
           <w:tcPr>
             <w:tcW w:type="dxa" w:w="1632"/>
             <w:vAlign w:val="center"/>
+            <w:shd w:fill="D9EAF7"/>
           </w:tcPr>
           <w:p>
+            <w:pPr>
+              <w:spacing w:before="20" w:after="20" w:line="252" w:lineRule="auto"/>
+            </w:pPr>
             <w:r>
               <w:rPr>
-                <w:rFonts w:ascii="Malgun Gothic" w:hAnsi="Malgun Gothic"/>
+                <w:rFonts w:ascii="Arial" w:hAnsi="Arial" w:eastAsia="Malgun Gothic"/>
                 <w:b/>
-                <w:sz w:val="19"/>
+                <w:color w:val="14315C"/>
+                <w:sz w:val="18"/>
               </w:rPr>
               <w:t>Precision</w:t>
             </w:r>
@@ -1623,13 +2695,18 @@
           <w:tcPr>
             <w:tcW w:type="dxa" w:w="1632"/>
             <w:vAlign w:val="center"/>
+            <w:shd w:fill="D9EAF7"/>
           </w:tcPr>
           <w:p>
+            <w:pPr>
+              <w:spacing w:before="20" w:after="20" w:line="252" w:lineRule="auto"/>
+            </w:pPr>
             <w:r>
               <w:rPr>
-                <w:rFonts w:ascii="Malgun Gothic" w:hAnsi="Malgun Gothic"/>
+                <w:rFonts w:ascii="Arial" w:hAnsi="Arial" w:eastAsia="Malgun Gothic"/>
                 <w:b/>
-                <w:sz w:val="19"/>
+                <w:color w:val="14315C"/>
+                <w:sz w:val="18"/>
               </w:rPr>
               <w:t>F1</w:t>
             </w:r>
@@ -1640,13 +2717,18 @@
         <w:tc>
           <w:tcPr>
             <w:tcW w:type="dxa" w:w="1632"/>
+            <w:vAlign w:val="center"/>
           </w:tcPr>
           <w:p>
+            <w:pPr>
+              <w:spacing w:before="20" w:after="20" w:line="252" w:lineRule="auto"/>
+            </w:pPr>
             <w:r>
               <w:rPr>
-                <w:rFonts w:ascii="Malgun Gothic" w:hAnsi="Malgun Gothic"/>
+                <w:rFonts w:ascii="Arial" w:hAnsi="Arial" w:eastAsia="Malgun Gothic"/>
                 <w:b w:val="0"/>
-                <w:sz w:val="19"/>
+                <w:color w:val="000000"/>
+                <w:sz w:val="18"/>
               </w:rPr>
               <w:t>Logistic Regression</w:t>
             </w:r>
@@ -1655,75 +2737,100 @@
         <w:tc>
           <w:tcPr>
             <w:tcW w:type="dxa" w:w="1632"/>
+            <w:vAlign w:val="center"/>
           </w:tcPr>
           <w:p>
+            <w:pPr>
+              <w:spacing w:before="20" w:after="20" w:line="252" w:lineRule="auto"/>
+            </w:pPr>
             <w:r>
               <w:rPr>
-                <w:rFonts w:ascii="Malgun Gothic" w:hAnsi="Malgun Gothic"/>
+                <w:rFonts w:ascii="Arial" w:hAnsi="Arial" w:eastAsia="Malgun Gothic"/>
                 <w:b w:val="0"/>
-                <w:sz w:val="19"/>
+                <w:color w:val="000000"/>
+                <w:sz w:val="18"/>
               </w:rPr>
-              <w:t>0.7146</w:t>
+              <w:t>0.7158</w:t>
             </w:r>
           </w:p>
         </w:tc>
         <w:tc>
           <w:tcPr>
             <w:tcW w:type="dxa" w:w="1632"/>
+            <w:vAlign w:val="center"/>
           </w:tcPr>
           <w:p>
+            <w:pPr>
+              <w:spacing w:before="20" w:after="20" w:line="252" w:lineRule="auto"/>
+            </w:pPr>
             <w:r>
               <w:rPr>
-                <w:rFonts w:ascii="Malgun Gothic" w:hAnsi="Malgun Gothic"/>
+                <w:rFonts w:ascii="Arial" w:hAnsi="Arial" w:eastAsia="Malgun Gothic"/>
                 <w:b w:val="0"/>
-                <w:sz w:val="19"/>
+                <w:color w:val="000000"/>
+                <w:sz w:val="18"/>
               </w:rPr>
-              <w:t>0.7855</w:t>
+              <w:t>0.7867</w:t>
             </w:r>
           </w:p>
         </w:tc>
         <w:tc>
           <w:tcPr>
             <w:tcW w:type="dxa" w:w="1632"/>
+            <w:vAlign w:val="center"/>
           </w:tcPr>
           <w:p>
+            <w:pPr>
+              <w:spacing w:before="20" w:after="20" w:line="252" w:lineRule="auto"/>
+            </w:pPr>
             <w:r>
               <w:rPr>
-                <w:rFonts w:ascii="Malgun Gothic" w:hAnsi="Malgun Gothic"/>
+                <w:rFonts w:ascii="Arial" w:hAnsi="Arial" w:eastAsia="Malgun Gothic"/>
                 <w:b w:val="0"/>
-                <w:sz w:val="19"/>
+                <w:color w:val="000000"/>
+                <w:sz w:val="18"/>
               </w:rPr>
-              <w:t>0.7160</w:t>
+              <w:t>0.7208</w:t>
             </w:r>
           </w:p>
         </w:tc>
         <w:tc>
           <w:tcPr>
             <w:tcW w:type="dxa" w:w="1632"/>
+            <w:vAlign w:val="center"/>
           </w:tcPr>
           <w:p>
+            <w:pPr>
+              <w:spacing w:before="20" w:after="20" w:line="252" w:lineRule="auto"/>
+            </w:pPr>
             <w:r>
               <w:rPr>
-                <w:rFonts w:ascii="Malgun Gothic" w:hAnsi="Malgun Gothic"/>
+                <w:rFonts w:ascii="Arial" w:hAnsi="Arial" w:eastAsia="Malgun Gothic"/>
                 <w:b w:val="0"/>
-                <w:sz w:val="19"/>
+                <w:color w:val="000000"/>
+                <w:sz w:val="18"/>
               </w:rPr>
-              <w:t>0.4278</w:t>
+              <w:t>0.4296</w:t>
             </w:r>
           </w:p>
         </w:tc>
         <w:tc>
           <w:tcPr>
             <w:tcW w:type="dxa" w:w="1632"/>
+            <w:vAlign w:val="center"/>
           </w:tcPr>
           <w:p>
+            <w:pPr>
+              <w:spacing w:before="20" w:after="20" w:line="252" w:lineRule="auto"/>
+            </w:pPr>
             <w:r>
               <w:rPr>
-                <w:rFonts w:ascii="Malgun Gothic" w:hAnsi="Malgun Gothic"/>
+                <w:rFonts w:ascii="Arial" w:hAnsi="Arial" w:eastAsia="Malgun Gothic"/>
                 <w:b w:val="0"/>
-                <w:sz w:val="19"/>
+                <w:color w:val="000000"/>
+                <w:sz w:val="18"/>
               </w:rPr>
-              <w:t>0.5354</w:t>
+              <w:t>0.5382</w:t>
             </w:r>
           </w:p>
         </w:tc>
@@ -1732,13 +2839,140 @@
         <w:tc>
           <w:tcPr>
             <w:tcW w:type="dxa" w:w="1632"/>
+            <w:vAlign w:val="center"/>
           </w:tcPr>
           <w:p>
+            <w:pPr>
+              <w:spacing w:before="20" w:after="20" w:line="252" w:lineRule="auto"/>
+            </w:pPr>
             <w:r>
               <w:rPr>
-                <w:rFonts w:ascii="Malgun Gothic" w:hAnsi="Malgun Gothic"/>
+                <w:rFonts w:ascii="Arial" w:hAnsi="Arial" w:eastAsia="Malgun Gothic"/>
                 <w:b w:val="0"/>
-                <w:sz w:val="19"/>
+                <w:color w:val="000000"/>
+                <w:sz w:val="18"/>
+              </w:rPr>
+              <w:t>Random Forest Classifier</w:t>
+            </w:r>
+          </w:p>
+        </w:tc>
+        <w:tc>
+          <w:tcPr>
+            <w:tcW w:type="dxa" w:w="1632"/>
+            <w:vAlign w:val="center"/>
+          </w:tcPr>
+          <w:p>
+            <w:pPr>
+              <w:spacing w:before="20" w:after="20" w:line="252" w:lineRule="auto"/>
+            </w:pPr>
+            <w:r>
+              <w:rPr>
+                <w:rFonts w:ascii="Arial" w:hAnsi="Arial" w:eastAsia="Malgun Gothic"/>
+                <w:b w:val="0"/>
+                <w:color w:val="000000"/>
+                <w:sz w:val="18"/>
+              </w:rPr>
+              <w:t>0.7958</w:t>
+            </w:r>
+          </w:p>
+        </w:tc>
+        <w:tc>
+          <w:tcPr>
+            <w:tcW w:type="dxa" w:w="1632"/>
+            <w:vAlign w:val="center"/>
+          </w:tcPr>
+          <w:p>
+            <w:pPr>
+              <w:spacing w:before="20" w:after="20" w:line="252" w:lineRule="auto"/>
+            </w:pPr>
+            <w:r>
+              <w:rPr>
+                <w:rFonts w:ascii="Arial" w:hAnsi="Arial" w:eastAsia="Malgun Gothic"/>
+                <w:b w:val="0"/>
+                <w:color w:val="000000"/>
+                <w:sz w:val="18"/>
+              </w:rPr>
+              <w:t>0.7788</w:t>
+            </w:r>
+          </w:p>
+        </w:tc>
+        <w:tc>
+          <w:tcPr>
+            <w:tcW w:type="dxa" w:w="1632"/>
+            <w:vAlign w:val="center"/>
+          </w:tcPr>
+          <w:p>
+            <w:pPr>
+              <w:spacing w:before="20" w:after="20" w:line="252" w:lineRule="auto"/>
+            </w:pPr>
+            <w:r>
+              <w:rPr>
+                <w:rFonts w:ascii="Arial" w:hAnsi="Arial" w:eastAsia="Malgun Gothic"/>
+                <w:b w:val="0"/>
+                <w:color w:val="000000"/>
+                <w:sz w:val="18"/>
+              </w:rPr>
+              <w:t>0.3609</w:t>
+            </w:r>
+          </w:p>
+        </w:tc>
+        <w:tc>
+          <w:tcPr>
+            <w:tcW w:type="dxa" w:w="1632"/>
+            <w:vAlign w:val="center"/>
+          </w:tcPr>
+          <w:p>
+            <w:pPr>
+              <w:spacing w:before="20" w:after="20" w:line="252" w:lineRule="auto"/>
+            </w:pPr>
+            <w:r>
+              <w:rPr>
+                <w:rFonts w:ascii="Arial" w:hAnsi="Arial" w:eastAsia="Malgun Gothic"/>
+                <w:b w:val="0"/>
+                <w:color w:val="000000"/>
+                <w:sz w:val="18"/>
+              </w:rPr>
+              <w:t>0.5919</w:t>
+            </w:r>
+          </w:p>
+        </w:tc>
+        <w:tc>
+          <w:tcPr>
+            <w:tcW w:type="dxa" w:w="1632"/>
+            <w:vAlign w:val="center"/>
+          </w:tcPr>
+          <w:p>
+            <w:pPr>
+              <w:spacing w:before="20" w:after="20" w:line="252" w:lineRule="auto"/>
+            </w:pPr>
+            <w:r>
+              <w:rPr>
+                <w:rFonts w:ascii="Arial" w:hAnsi="Arial" w:eastAsia="Malgun Gothic"/>
+                <w:b w:val="0"/>
+                <w:color w:val="000000"/>
+                <w:sz w:val="18"/>
+              </w:rPr>
+              <w:t>0.4479</w:t>
+            </w:r>
+          </w:p>
+        </w:tc>
+      </w:tr>
+      <w:tr>
+        <w:tc>
+          <w:tcPr>
+            <w:tcW w:type="dxa" w:w="1632"/>
+            <w:vAlign w:val="center"/>
+          </w:tcPr>
+          <w:p>
+            <w:pPr>
+              <w:spacing w:before="20" w:after="20" w:line="252" w:lineRule="auto"/>
+            </w:pPr>
+            <w:r>
+              <w:rPr>
+                <w:rFonts w:ascii="Arial" w:hAnsi="Arial" w:eastAsia="Malgun Gothic"/>
+                <w:b w:val="0"/>
+                <w:color w:val="000000"/>
+                <w:sz w:val="18"/>
               </w:rPr>
               <w:t>CatBoost Classifier</w:t>
             </w:r>
@@ -1747,75 +2981,100 @@
         <w:tc>
           <w:tcPr>
             <w:tcW w:type="dxa" w:w="1632"/>
+            <w:vAlign w:val="center"/>
           </w:tcPr>
           <w:p>
+            <w:pPr>
+              <w:spacing w:before="20" w:after="20" w:line="252" w:lineRule="auto"/>
+            </w:pPr>
             <w:r>
               <w:rPr>
-                <w:rFonts w:ascii="Malgun Gothic" w:hAnsi="Malgun Gothic"/>
+                <w:rFonts w:ascii="Arial" w:hAnsi="Arial" w:eastAsia="Malgun Gothic"/>
                 <w:b w:val="0"/>
-                <w:sz w:val="19"/>
+                <w:color w:val="000000"/>
+                <w:sz w:val="18"/>
               </w:rPr>
-              <w:t>0.7921</w:t>
+              <w:t>0.7914</w:t>
             </w:r>
           </w:p>
         </w:tc>
         <w:tc>
           <w:tcPr>
             <w:tcW w:type="dxa" w:w="1632"/>
+            <w:vAlign w:val="center"/>
           </w:tcPr>
           <w:p>
+            <w:pPr>
+              <w:spacing w:before="20" w:after="20" w:line="252" w:lineRule="auto"/>
+            </w:pPr>
             <w:r>
               <w:rPr>
-                <w:rFonts w:ascii="Malgun Gothic" w:hAnsi="Malgun Gothic"/>
+                <w:rFonts w:ascii="Arial" w:hAnsi="Arial" w:eastAsia="Malgun Gothic"/>
                 <w:b w:val="0"/>
-                <w:sz w:val="19"/>
+                <w:color w:val="000000"/>
+                <w:sz w:val="18"/>
               </w:rPr>
-              <w:t>0.7772</w:t>
+              <w:t>0.7756</w:t>
             </w:r>
           </w:p>
         </w:tc>
         <w:tc>
           <w:tcPr>
             <w:tcW w:type="dxa" w:w="1632"/>
+            <w:vAlign w:val="center"/>
           </w:tcPr>
           <w:p>
+            <w:pPr>
+              <w:spacing w:before="20" w:after="20" w:line="252" w:lineRule="auto"/>
+            </w:pPr>
             <w:r>
               <w:rPr>
-                <w:rFonts w:ascii="Malgun Gothic" w:hAnsi="Malgun Gothic"/>
+                <w:rFonts w:ascii="Arial" w:hAnsi="Arial" w:eastAsia="Malgun Gothic"/>
                 <w:b w:val="0"/>
-                <w:sz w:val="19"/>
+                <w:color w:val="000000"/>
+                <w:sz w:val="18"/>
               </w:rPr>
-              <w:t>0.3483</w:t>
+              <w:t>0.3498</w:t>
             </w:r>
           </w:p>
         </w:tc>
         <w:tc>
           <w:tcPr>
             <w:tcW w:type="dxa" w:w="1632"/>
+            <w:vAlign w:val="center"/>
           </w:tcPr>
           <w:p>
+            <w:pPr>
+              <w:spacing w:before="20" w:after="20" w:line="252" w:lineRule="auto"/>
+            </w:pPr>
             <w:r>
               <w:rPr>
-                <w:rFonts w:ascii="Malgun Gothic" w:hAnsi="Malgun Gothic"/>
+                <w:rFonts w:ascii="Arial" w:hAnsi="Arial" w:eastAsia="Malgun Gothic"/>
                 <w:b w:val="0"/>
-                <w:sz w:val="19"/>
+                <w:color w:val="000000"/>
+                <w:sz w:val="18"/>
               </w:rPr>
-              <w:t>0.5807</w:t>
+              <w:t>0.5763</w:t>
             </w:r>
           </w:p>
         </w:tc>
         <w:tc>
           <w:tcPr>
             <w:tcW w:type="dxa" w:w="1632"/>
+            <w:vAlign w:val="center"/>
           </w:tcPr>
           <w:p>
+            <w:pPr>
+              <w:spacing w:before="20" w:after="20" w:line="252" w:lineRule="auto"/>
+            </w:pPr>
             <w:r>
               <w:rPr>
-                <w:rFonts w:ascii="Malgun Gothic" w:hAnsi="Malgun Gothic"/>
+                <w:rFonts w:ascii="Arial" w:hAnsi="Arial" w:eastAsia="Malgun Gothic"/>
                 <w:b w:val="0"/>
-                <w:sz w:val="19"/>
+                <w:color w:val="000000"/>
+                <w:sz w:val="18"/>
               </w:rPr>
-              <w:t>0.4350</w:t>
+              <w:t>0.4352</w:t>
             </w:r>
           </w:p>
         </w:tc>
@@ -1824,13 +3083,18 @@
         <w:tc>
           <w:tcPr>
             <w:tcW w:type="dxa" w:w="1632"/>
+            <w:vAlign w:val="center"/>
           </w:tcPr>
           <w:p>
+            <w:pPr>
+              <w:spacing w:before="20" w:after="20" w:line="252" w:lineRule="auto"/>
+            </w:pPr>
             <w:r>
               <w:rPr>
-                <w:rFonts w:ascii="Malgun Gothic" w:hAnsi="Malgun Gothic"/>
+                <w:rFonts w:ascii="Arial" w:hAnsi="Arial" w:eastAsia="Malgun Gothic"/>
                 <w:b w:val="0"/>
-                <w:sz w:val="19"/>
+                <w:color w:val="000000"/>
+                <w:sz w:val="18"/>
               </w:rPr>
               <w:t>Light Gradient Boosting Machine</w:t>
             </w:r>
@@ -1839,75 +3103,100 @@
         <w:tc>
           <w:tcPr>
             <w:tcW w:type="dxa" w:w="1632"/>
+            <w:vAlign w:val="center"/>
           </w:tcPr>
           <w:p>
+            <w:pPr>
+              <w:spacing w:before="20" w:after="20" w:line="252" w:lineRule="auto"/>
+            </w:pPr>
             <w:r>
               <w:rPr>
-                <w:rFonts w:ascii="Malgun Gothic" w:hAnsi="Malgun Gothic"/>
+                <w:rFonts w:ascii="Arial" w:hAnsi="Arial" w:eastAsia="Malgun Gothic"/>
                 <w:b w:val="0"/>
-                <w:sz w:val="19"/>
+                <w:color w:val="000000"/>
+                <w:sz w:val="18"/>
               </w:rPr>
-              <w:t>0.7958</w:t>
+              <w:t>0.7943</w:t>
             </w:r>
           </w:p>
         </w:tc>
         <w:tc>
           <w:tcPr>
             <w:tcW w:type="dxa" w:w="1632"/>
+            <w:vAlign w:val="center"/>
           </w:tcPr>
           <w:p>
+            <w:pPr>
+              <w:spacing w:before="20" w:after="20" w:line="252" w:lineRule="auto"/>
+            </w:pPr>
             <w:r>
               <w:rPr>
-                <w:rFonts w:ascii="Malgun Gothic" w:hAnsi="Malgun Gothic"/>
+                <w:rFonts w:ascii="Arial" w:hAnsi="Arial" w:eastAsia="Malgun Gothic"/>
                 <w:b w:val="0"/>
-                <w:sz w:val="19"/>
+                <w:color w:val="000000"/>
+                <w:sz w:val="18"/>
               </w:rPr>
-              <w:t>0.7746</w:t>
+              <w:t>0.7727</w:t>
             </w:r>
           </w:p>
         </w:tc>
         <w:tc>
           <w:tcPr>
             <w:tcW w:type="dxa" w:w="1632"/>
+            <w:vAlign w:val="center"/>
           </w:tcPr>
           <w:p>
+            <w:pPr>
+              <w:spacing w:before="20" w:after="20" w:line="252" w:lineRule="auto"/>
+            </w:pPr>
             <w:r>
               <w:rPr>
-                <w:rFonts w:ascii="Malgun Gothic" w:hAnsi="Malgun Gothic"/>
+                <w:rFonts w:ascii="Arial" w:hAnsi="Arial" w:eastAsia="Malgun Gothic"/>
                 <w:b w:val="0"/>
-                <w:sz w:val="19"/>
+                <w:color w:val="000000"/>
+                <w:sz w:val="18"/>
               </w:rPr>
-              <w:t>0.3593</w:t>
+              <w:t>0.3604</w:t>
             </w:r>
           </w:p>
         </w:tc>
         <w:tc>
           <w:tcPr>
             <w:tcW w:type="dxa" w:w="1632"/>
+            <w:vAlign w:val="center"/>
           </w:tcPr>
           <w:p>
+            <w:pPr>
+              <w:spacing w:before="20" w:after="20" w:line="252" w:lineRule="auto"/>
+            </w:pPr>
             <w:r>
               <w:rPr>
-                <w:rFonts w:ascii="Malgun Gothic" w:hAnsi="Malgun Gothic"/>
+                <w:rFonts w:ascii="Arial" w:hAnsi="Arial" w:eastAsia="Malgun Gothic"/>
                 <w:b w:val="0"/>
-                <w:sz w:val="19"/>
+                <w:color w:val="000000"/>
+                <w:sz w:val="18"/>
               </w:rPr>
-              <w:t>0.5922</w:t>
+              <w:t>0.5849</w:t>
             </w:r>
           </w:p>
         </w:tc>
         <w:tc>
           <w:tcPr>
             <w:tcW w:type="dxa" w:w="1632"/>
+            <w:vAlign w:val="center"/>
           </w:tcPr>
           <w:p>
+            <w:pPr>
+              <w:spacing w:before="20" w:after="20" w:line="252" w:lineRule="auto"/>
+            </w:pPr>
             <w:r>
               <w:rPr>
-                <w:rFonts w:ascii="Malgun Gothic" w:hAnsi="Malgun Gothic"/>
+                <w:rFonts w:ascii="Arial" w:hAnsi="Arial" w:eastAsia="Malgun Gothic"/>
                 <w:b w:val="0"/>
-                <w:sz w:val="19"/>
+                <w:color w:val="000000"/>
+                <w:sz w:val="18"/>
               </w:rPr>
-              <w:t>0.4469</w:t>
+              <w:t>0.4456</w:t>
             </w:r>
           </w:p>
         </w:tc>
@@ -1916,105 +3205,18 @@
         <w:tc>
           <w:tcPr>
             <w:tcW w:type="dxa" w:w="1632"/>
+            <w:vAlign w:val="center"/>
           </w:tcPr>
           <w:p>
+            <w:pPr>
+              <w:spacing w:before="20" w:after="20" w:line="252" w:lineRule="auto"/>
+            </w:pPr>
             <w:r>
               <w:rPr>
-                <w:rFonts w:ascii="Malgun Gothic" w:hAnsi="Malgun Gothic"/>
+                <w:rFonts w:ascii="Arial" w:hAnsi="Arial" w:eastAsia="Malgun Gothic"/>
                 <w:b w:val="0"/>
-                <w:sz w:val="19"/>
-              </w:rPr>
-              <w:t>Random Forest Classifier</w:t>
-            </w:r>
-          </w:p>
-        </w:tc>
-        <w:tc>
-          <w:tcPr>
-            <w:tcW w:type="dxa" w:w="1632"/>
-          </w:tcPr>
-          <w:p>
-            <w:r>
-              <w:rPr>
-                <w:rFonts w:ascii="Malgun Gothic" w:hAnsi="Malgun Gothic"/>
-                <w:b w:val="0"/>
-                <w:sz w:val="19"/>
-              </w:rPr>
-              <w:t>0.7906</w:t>
-            </w:r>
-          </w:p>
-        </w:tc>
-        <w:tc>
-          <w:tcPr>
-            <w:tcW w:type="dxa" w:w="1632"/>
-          </w:tcPr>
-          <w:p>
-            <w:r>
-              <w:rPr>
-                <w:rFonts w:ascii="Malgun Gothic" w:hAnsi="Malgun Gothic"/>
-                <w:b w:val="0"/>
-                <w:sz w:val="19"/>
-              </w:rPr>
-              <w:t>0.7740</w:t>
-            </w:r>
-          </w:p>
-        </w:tc>
-        <w:tc>
-          <w:tcPr>
-            <w:tcW w:type="dxa" w:w="1632"/>
-          </w:tcPr>
-          <w:p>
-            <w:r>
-              <w:rPr>
-                <w:rFonts w:ascii="Malgun Gothic" w:hAnsi="Malgun Gothic"/>
-                <w:b w:val="0"/>
-                <w:sz w:val="19"/>
-              </w:rPr>
-              <w:t>0.3393</w:t>
-            </w:r>
-          </w:p>
-        </w:tc>
-        <w:tc>
-          <w:tcPr>
-            <w:tcW w:type="dxa" w:w="1632"/>
-          </w:tcPr>
-          <w:p>
-            <w:r>
-              <w:rPr>
-                <w:rFonts w:ascii="Malgun Gothic" w:hAnsi="Malgun Gothic"/>
-                <w:b w:val="0"/>
-                <w:sz w:val="19"/>
-              </w:rPr>
-              <w:t>0.5750</w:t>
-            </w:r>
-          </w:p>
-        </w:tc>
-        <w:tc>
-          <w:tcPr>
-            <w:tcW w:type="dxa" w:w="1632"/>
-          </w:tcPr>
-          <w:p>
-            <w:r>
-              <w:rPr>
-                <w:rFonts w:ascii="Malgun Gothic" w:hAnsi="Malgun Gothic"/>
-                <w:b w:val="0"/>
-                <w:sz w:val="19"/>
-              </w:rPr>
-              <w:t>0.4266</w:t>
-            </w:r>
-          </w:p>
-        </w:tc>
-      </w:tr>
-      <w:tr>
-        <w:tc>
-          <w:tcPr>
-            <w:tcW w:type="dxa" w:w="1632"/>
-          </w:tcPr>
-          <w:p>
-            <w:r>
-              <w:rPr>
-                <w:rFonts w:ascii="Malgun Gothic" w:hAnsi="Malgun Gothic"/>
-                <w:b w:val="0"/>
-                <w:sz w:val="19"/>
+                <w:color w:val="000000"/>
+                <w:sz w:val="18"/>
               </w:rPr>
               <w:t>Extreme Gradient Boosting</w:t>
             </w:r>
@@ -2023,75 +3225,100 @@
         <w:tc>
           <w:tcPr>
             <w:tcW w:type="dxa" w:w="1632"/>
+            <w:vAlign w:val="center"/>
           </w:tcPr>
           <w:p>
+            <w:pPr>
+              <w:spacing w:before="20" w:after="20" w:line="252" w:lineRule="auto"/>
+            </w:pPr>
             <w:r>
               <w:rPr>
-                <w:rFonts w:ascii="Malgun Gothic" w:hAnsi="Malgun Gothic"/>
+                <w:rFonts w:ascii="Arial" w:hAnsi="Arial" w:eastAsia="Malgun Gothic"/>
                 <w:b w:val="0"/>
-                <w:sz w:val="19"/>
+                <w:color w:val="000000"/>
+                <w:sz w:val="18"/>
               </w:rPr>
-              <w:t>0.7845</w:t>
+              <w:t>0.7828</w:t>
             </w:r>
           </w:p>
         </w:tc>
         <w:tc>
           <w:tcPr>
             <w:tcW w:type="dxa" w:w="1632"/>
+            <w:vAlign w:val="center"/>
           </w:tcPr>
           <w:p>
+            <w:pPr>
+              <w:spacing w:before="20" w:after="20" w:line="252" w:lineRule="auto"/>
+            </w:pPr>
             <w:r>
               <w:rPr>
-                <w:rFonts w:ascii="Malgun Gothic" w:hAnsi="Malgun Gothic"/>
+                <w:rFonts w:ascii="Arial" w:hAnsi="Arial" w:eastAsia="Malgun Gothic"/>
                 <w:b w:val="0"/>
-                <w:sz w:val="19"/>
+                <w:color w:val="000000"/>
+                <w:sz w:val="18"/>
               </w:rPr>
-              <w:t>0.7497</w:t>
+              <w:t>0.7499</w:t>
             </w:r>
           </w:p>
         </w:tc>
         <w:tc>
           <w:tcPr>
             <w:tcW w:type="dxa" w:w="1632"/>
+            <w:vAlign w:val="center"/>
           </w:tcPr>
           <w:p>
+            <w:pPr>
+              <w:spacing w:before="20" w:after="20" w:line="252" w:lineRule="auto"/>
+            </w:pPr>
             <w:r>
               <w:rPr>
-                <w:rFonts w:ascii="Malgun Gothic" w:hAnsi="Malgun Gothic"/>
+                <w:rFonts w:ascii="Arial" w:hAnsi="Arial" w:eastAsia="Malgun Gothic"/>
                 <w:b w:val="0"/>
-                <w:sz w:val="19"/>
+                <w:color w:val="000000"/>
+                <w:sz w:val="18"/>
               </w:rPr>
-              <w:t>0.3588</w:t>
+              <w:t>0.3614</w:t>
             </w:r>
           </w:p>
         </w:tc>
         <w:tc>
           <w:tcPr>
             <w:tcW w:type="dxa" w:w="1632"/>
+            <w:vAlign w:val="center"/>
           </w:tcPr>
           <w:p>
+            <w:pPr>
+              <w:spacing w:before="20" w:after="20" w:line="252" w:lineRule="auto"/>
+            </w:pPr>
             <w:r>
               <w:rPr>
-                <w:rFonts w:ascii="Malgun Gothic" w:hAnsi="Malgun Gothic"/>
+                <w:rFonts w:ascii="Arial" w:hAnsi="Arial" w:eastAsia="Malgun Gothic"/>
                 <w:b w:val="0"/>
-                <w:sz w:val="19"/>
+                <w:color w:val="000000"/>
+                <w:sz w:val="18"/>
               </w:rPr>
-              <w:t>0.5473</w:t>
+              <w:t>0.5408</w:t>
             </w:r>
           </w:p>
         </w:tc>
         <w:tc>
           <w:tcPr>
             <w:tcW w:type="dxa" w:w="1632"/>
+            <w:vAlign w:val="center"/>
           </w:tcPr>
           <w:p>
+            <w:pPr>
+              <w:spacing w:before="20" w:after="20" w:line="252" w:lineRule="auto"/>
+            </w:pPr>
             <w:r>
               <w:rPr>
-                <w:rFonts w:ascii="Malgun Gothic" w:hAnsi="Malgun Gothic"/>
+                <w:rFonts w:ascii="Arial" w:hAnsi="Arial" w:eastAsia="Malgun Gothic"/>
                 <w:b w:val="0"/>
-                <w:sz w:val="19"/>
+                <w:color w:val="000000"/>
+                <w:sz w:val="18"/>
               </w:rPr>
-              <w:t>0.4330</w:t>
+              <w:t>0.4331</w:t>
             </w:r>
           </w:p>
         </w:tc>
@@ -2099,19 +3326,28 @@
     </w:tbl>
     <w:p/>
     <w:p>
+      <w:pPr>
+        <w:spacing w:line="295" w:lineRule="auto" w:after="140"/>
+        <w:jc w:val="both"/>
+      </w:pPr>
       <w:r>
         <w:rPr>
-          <w:rFonts w:ascii="Malgun Gothic" w:hAnsi="Malgun Gothic"/>
+          <w:rFonts w:ascii="Arial" w:hAnsi="Arial" w:eastAsia="Malgun Gothic"/>
+          <w:b w:val="0"/>
           <w:sz w:val="21"/>
         </w:rPr>
-        <w:t>PyCaret workflow인 setup() → compare_models() → 상위 모델 선택 → tune_model() → plot_model() → SHAP 해석 순서로 모델링을 진행하였다. Logistic Regression, Random Forest, LightGBM, XGBoost, CatBoost를 비교하였고, AUC 기준 상위 3개 모델은 Logistic Regression, CatBoost, LightGBM이었다.</w:t>
+        <w:t>모델링은 교수님 수업 workflow에 맞추어 PyCaret을 중심으로 진행하였다. 구체적으로 setup()에서 전처리와 class imbalance 처리를 설정하고, compare_models()로 Logistic Regression, Random Forest, LightGBM, XGBoost, CatBoost를 비교하였다. 이후 AUC 기준 상위 3개 모델을 확인하고, tune_model()로 최종 모델을 보완하였다. 교수님 피드백 이후에는 식이 변수(N_NA, N_K)를 포함한 데이터로 모델을 다시 학습하고, 모델 비교·성능 비교를 표와 차트로 함께 제시하였다.</w:t>
       </w:r>
     </w:p>
     <w:p>
       <w:pPr>
+        <w:spacing w:before="80" w:after="60"/>
         <w:jc w:val="center"/>
       </w:pPr>
       <w:r>
+        <w:rPr>
+          <w:sz w:val="20"/>
+        </w:rPr>
         <w:drawing>
           <ns2:inline>
             <ns2:extent cx="5303520" cy="3030583"/>
@@ -2148,47 +3384,81 @@
     </w:p>
     <w:p>
       <w:pPr>
+        <w:pStyle w:val="Caption"/>
+        <w:spacing w:before="80" w:after="140"/>
         <w:jc w:val="center"/>
       </w:pPr>
       <w:r>
         <w:rPr>
-          <w:rFonts w:ascii="Malgun Gothic" w:hAnsi="Malgun Gothic"/>
+          <w:rFonts w:ascii="Arial" w:hAnsi="Arial" w:eastAsia="Malgun Gothic"/>
           <w:b w:val="0"/>
-          <w:sz w:val="19"/>
+          <w:color w:val="5A5A5A"/>
+          <w:sz w:val="18"/>
         </w:rPr>
-        <w:t>Figure 1. Model comparison by AUC</w:t>
+        <w:t>표 8. 최종 모델 Confusion Matrix</w:t>
       </w:r>
     </w:p>
     <w:p>
       <w:pPr>
         <w:pStyle w:val="Heading1"/>
+        <w:spacing w:before="320" w:after="160"/>
+        <w:jc w:val="left"/>
+        <w:pBdr>
+          <w:bottom w:val="single" w:sz="6" w:space="4" w:color="9EC5E8"/>
+        </w:pBdr>
       </w:pPr>
       <w:r>
         <w:rPr>
-          <w:rFonts w:ascii="Malgun Gothic" w:hAnsi="Malgun Gothic"/>
+          <w:rFonts w:ascii="Arial" w:hAnsi="Arial" w:eastAsia="Malgun Gothic"/>
           <w:b/>
+          <w:color w:val="14315C"/>
           <w:sz w:val="28"/>
         </w:rPr>
-        <w:t>7. 최종 모델 구현</w:t>
+        <w:t>8. 최종 모델 구현</w:t>
       </w:r>
     </w:p>
     <w:p>
+      <w:pPr>
+        <w:spacing w:line="295" w:lineRule="auto" w:after="140"/>
+        <w:jc w:val="both"/>
+      </w:pPr>
       <w:r>
         <w:rPr>
-          <w:rFonts w:ascii="Malgun Gothic" w:hAnsi="Malgun Gothic"/>
+          <w:rFonts w:ascii="Arial" w:hAnsi="Arial" w:eastAsia="Malgun Gothic"/>
           <w:b w:val="0"/>
           <w:sz w:val="21"/>
         </w:rPr>
-        <w:t>최종 모델은 PyCaret에서 tuning한 Logistic Regression으로 선정하였다. AUC가 가장 높고 recall이 안정적이며 coefficient 기반 해석이 가능하기 때문에 수업 발표에서 설명하기 적절하다고 판단하였다.</w:t>
+        <w:t>최종 모델은 PyCaret에서 tuning한 Logistic Regression으로 선정하였다. 더 복잡한 tree-based 모델도 함께 비교했지만, Logistic Regression은 AUC가 가장 높고 recall이 안정적이며 coefficient 기반 해석이 가능하다는 장점이 있었다. 본 프로젝트는 최고 정확도만을 추구하기보다, 수업 발표에서 모델의 판단 근거를 설명할 수 있는지를 중요하게 고려하였다.</w:t>
       </w:r>
     </w:p>
     <w:p>
+      <w:pPr>
+        <w:spacing w:line="295" w:lineRule="auto" w:after="140"/>
+        <w:jc w:val="both"/>
+      </w:pPr>
       <w:r>
         <w:rPr>
-          <w:rFonts w:ascii="Malgun Gothic" w:hAnsi="Malgun Gothic"/>
+          <w:rFonts w:ascii="Arial" w:hAnsi="Arial" w:eastAsia="Malgun Gothic"/>
+          <w:b w:val="0"/>
           <w:sz w:val="21"/>
         </w:rPr>
-        <w:t>PyCaret setup()에서 결측치 대체, scaling, categorical encoding, class imbalance 처리를 설정하였다. Class imbalance는 SMOTE와 최종 Logistic Regression의 class_weight='balanced'를 함께 사용하였다. Hyperparameter tuning은 tune_model(tuned_best_model, optimize='AUC') 방식으로 수행하였다.</w:t>
+        <w:t>PyCaret setup()에서 결측치 대체, scaling, categorical encoding, class imbalance 처리를 파이프라인 내에서 진행하였다. 이렇게 한 이유는 train/test split 이후 전처리가 수행되도록 하여 data leakage를 줄이기 위해서이다. Hyperparameter tuning은 tune_model(tuned_best_model, optimize='AUC', n_iter=10) 방식으로 수행하였고, 이 과정을 보고서와 발표에서 명시하였다.</w:t>
+      </w:r>
+    </w:p>
+    <w:p>
+      <w:pPr>
+        <w:pStyle w:val="Caption"/>
+        <w:spacing w:before="80" w:after="140"/>
+        <w:jc w:val="center"/>
+      </w:pPr>
+      <w:r>
+        <w:rPr>
+          <w:rFonts w:ascii="Arial" w:hAnsi="Arial" w:eastAsia="Malgun Gothic"/>
+          <w:b w:val="0"/>
+          <w:color w:val="5A5A5A"/>
+          <w:sz w:val="18"/>
+        </w:rPr>
+        <w:t>표 9. 최종 모델 성능 지표</w:t>
       </w:r>
     </w:p>
     <w:tbl>
@@ -2196,6 +3466,7 @@
         <w:tblStyle w:val="TableGrid"/>
         <w:tblW w:type="auto" w:w="0"/>
         <w:jc w:val="center"/>
+        <w:tblLayout w:type="autofit"/>
         <w:tblLook w:firstColumn="1" w:firstRow="1" w:lastColumn="0" w:lastRow="0" w:noHBand="0" w:noVBand="1" w:val="04A0"/>
       </w:tblPr>
       <w:tblGrid>
@@ -2208,13 +3479,18 @@
           <w:tcPr>
             <w:tcW w:type="dxa" w:w="3264"/>
             <w:vAlign w:val="center"/>
+            <w:shd w:fill="D9EAF7"/>
           </w:tcPr>
           <w:p>
+            <w:pPr>
+              <w:spacing w:before="20" w:after="20" w:line="252" w:lineRule="auto"/>
+            </w:pPr>
             <w:r>
               <w:rPr>
-                <w:rFonts w:ascii="Malgun Gothic" w:hAnsi="Malgun Gothic"/>
-                <w:b w:val="0"/>
-                <w:sz w:val="19"/>
+                <w:rFonts w:ascii="Arial" w:hAnsi="Arial" w:eastAsia="Malgun Gothic"/>
+                <w:b/>
+                <w:color w:val="14315C"/>
+                <w:sz w:val="18"/>
               </w:rPr>
               <w:t>Actual / Predicted</w:t>
             </w:r>
@@ -2224,13 +3500,18 @@
           <w:tcPr>
             <w:tcW w:type="dxa" w:w="3264"/>
             <w:vAlign w:val="center"/>
+            <w:shd w:fill="D9EAF7"/>
           </w:tcPr>
           <w:p>
+            <w:pPr>
+              <w:spacing w:before="20" w:after="20" w:line="252" w:lineRule="auto"/>
+            </w:pPr>
             <w:r>
               <w:rPr>
-                <w:rFonts w:ascii="Malgun Gothic" w:hAnsi="Malgun Gothic"/>
-                <w:b w:val="0"/>
-                <w:sz w:val="19"/>
+                <w:rFonts w:ascii="Arial" w:hAnsi="Arial" w:eastAsia="Malgun Gothic"/>
+                <w:b/>
+                <w:color w:val="14315C"/>
+                <w:sz w:val="18"/>
               </w:rPr>
               <w:t>Predicted 0</w:t>
             </w:r>
@@ -2240,13 +3521,18 @@
           <w:tcPr>
             <w:tcW w:type="dxa" w:w="3264"/>
             <w:vAlign w:val="center"/>
+            <w:shd w:fill="D9EAF7"/>
           </w:tcPr>
           <w:p>
+            <w:pPr>
+              <w:spacing w:before="20" w:after="20" w:line="252" w:lineRule="auto"/>
+            </w:pPr>
             <w:r>
               <w:rPr>
-                <w:rFonts w:ascii="Malgun Gothic" w:hAnsi="Malgun Gothic"/>
-                <w:b w:val="0"/>
-                <w:sz w:val="19"/>
+                <w:rFonts w:ascii="Arial" w:hAnsi="Arial" w:eastAsia="Malgun Gothic"/>
+                <w:b/>
+                <w:color w:val="14315C"/>
+                <w:sz w:val="18"/>
               </w:rPr>
               <w:t>Predicted 1</w:t>
             </w:r>
@@ -2260,11 +3546,15 @@
             <w:vAlign w:val="center"/>
           </w:tcPr>
           <w:p>
+            <w:pPr>
+              <w:spacing w:before="20" w:after="20" w:line="252" w:lineRule="auto"/>
+            </w:pPr>
             <w:r>
               <w:rPr>
-                <w:rFonts w:ascii="Malgun Gothic" w:hAnsi="Malgun Gothic"/>
+                <w:rFonts w:ascii="Arial" w:hAnsi="Arial" w:eastAsia="Malgun Gothic"/>
                 <w:b w:val="0"/>
-                <w:sz w:val="19"/>
+                <w:color w:val="000000"/>
+                <w:sz w:val="18"/>
               </w:rPr>
               <w:t>Actual 0</w:t>
             </w:r>
@@ -2276,13 +3566,17 @@
             <w:vAlign w:val="center"/>
           </w:tcPr>
           <w:p>
+            <w:pPr>
+              <w:spacing w:before="20" w:after="20" w:line="252" w:lineRule="auto"/>
+            </w:pPr>
             <w:r>
               <w:rPr>
-                <w:rFonts w:ascii="Malgun Gothic" w:hAnsi="Malgun Gothic"/>
+                <w:rFonts w:ascii="Arial" w:hAnsi="Arial" w:eastAsia="Malgun Gothic"/>
                 <w:b w:val="0"/>
-                <w:sz w:val="19"/>
+                <w:color w:val="000000"/>
+                <w:sz w:val="18"/>
               </w:rPr>
-              <w:t>1133</w:t>
+              <w:t>1134</w:t>
             </w:r>
           </w:p>
         </w:tc>
@@ -2292,13 +3586,17 @@
             <w:vAlign w:val="center"/>
           </w:tcPr>
           <w:p>
+            <w:pPr>
+              <w:spacing w:before="20" w:after="20" w:line="252" w:lineRule="auto"/>
+            </w:pPr>
             <w:r>
               <w:rPr>
-                <w:rFonts w:ascii="Malgun Gothic" w:hAnsi="Malgun Gothic"/>
+                <w:rFonts w:ascii="Arial" w:hAnsi="Arial" w:eastAsia="Malgun Gothic"/>
                 <w:b w:val="0"/>
-                <w:sz w:val="19"/>
+                <w:color w:val="000000"/>
+                <w:sz w:val="18"/>
               </w:rPr>
-              <w:t>457</w:t>
+              <w:t>456</w:t>
             </w:r>
           </w:p>
         </w:tc>
@@ -2310,11 +3608,15 @@
             <w:vAlign w:val="center"/>
           </w:tcPr>
           <w:p>
+            <w:pPr>
+              <w:spacing w:before="20" w:after="20" w:line="252" w:lineRule="auto"/>
+            </w:pPr>
             <w:r>
               <w:rPr>
-                <w:rFonts w:ascii="Malgun Gothic" w:hAnsi="Malgun Gothic"/>
+                <w:rFonts w:ascii="Arial" w:hAnsi="Arial" w:eastAsia="Malgun Gothic"/>
                 <w:b w:val="0"/>
-                <w:sz w:val="19"/>
+                <w:color w:val="000000"/>
+                <w:sz w:val="18"/>
               </w:rPr>
               <w:t>Actual 1</w:t>
             </w:r>
@@ -2326,13 +3628,17 @@
             <w:vAlign w:val="center"/>
           </w:tcPr>
           <w:p>
+            <w:pPr>
+              <w:spacing w:before="20" w:after="20" w:line="252" w:lineRule="auto"/>
+            </w:pPr>
             <w:r>
               <w:rPr>
-                <w:rFonts w:ascii="Malgun Gothic" w:hAnsi="Malgun Gothic"/>
+                <w:rFonts w:ascii="Arial" w:hAnsi="Arial" w:eastAsia="Malgun Gothic"/>
                 <w:b w:val="0"/>
-                <w:sz w:val="19"/>
+                <w:color w:val="000000"/>
+                <w:sz w:val="18"/>
               </w:rPr>
-              <w:t>161</w:t>
+              <w:t>158</w:t>
             </w:r>
           </w:p>
         </w:tc>
@@ -2342,24 +3648,45 @@
             <w:vAlign w:val="center"/>
           </w:tcPr>
           <w:p>
+            <w:pPr>
+              <w:spacing w:before="20" w:after="20" w:line="252" w:lineRule="auto"/>
+            </w:pPr>
             <w:r>
               <w:rPr>
-                <w:rFonts w:ascii="Malgun Gothic" w:hAnsi="Malgun Gothic"/>
+                <w:rFonts w:ascii="Arial" w:hAnsi="Arial" w:eastAsia="Malgun Gothic"/>
                 <w:b w:val="0"/>
-                <w:sz w:val="19"/>
+                <w:color w:val="000000"/>
+                <w:sz w:val="18"/>
               </w:rPr>
-              <w:t>313</w:t>
+              <w:t>316</w:t>
             </w:r>
           </w:p>
         </w:tc>
       </w:tr>
     </w:tbl>
     <w:p/>
+    <w:p>
+      <w:pPr>
+        <w:pStyle w:val="Caption"/>
+        <w:spacing w:before="80" w:after="140"/>
+        <w:jc w:val="center"/>
+      </w:pPr>
+      <w:r>
+        <w:rPr>
+          <w:rFonts w:ascii="Arial" w:hAnsi="Arial" w:eastAsia="Malgun Gothic"/>
+          <w:b w:val="0"/>
+          <w:color w:val="5A5A5A"/>
+          <w:sz w:val="18"/>
+        </w:rPr>
+        <w:t>그림 1. 모델별 AUC 비교</w:t>
+      </w:r>
+    </w:p>
     <w:tbl>
       <w:tblPr>
         <w:tblStyle w:val="TableGrid"/>
         <w:tblW w:type="auto" w:w="0"/>
         <w:jc w:val="center"/>
+        <w:tblLayout w:type="autofit"/>
         <w:tblLook w:firstColumn="1" w:firstRow="1" w:lastColumn="0" w:lastRow="0" w:noHBand="0" w:noVBand="1" w:val="04A0"/>
       </w:tblPr>
       <w:tblGrid>
@@ -2371,13 +3698,18 @@
           <w:tcPr>
             <w:tcW w:type="dxa" w:w="4896"/>
             <w:vAlign w:val="center"/>
+            <w:shd w:fill="D9EAF7"/>
           </w:tcPr>
           <w:p>
+            <w:pPr>
+              <w:spacing w:before="20" w:after="20" w:line="252" w:lineRule="auto"/>
+            </w:pPr>
             <w:r>
               <w:rPr>
-                <w:rFonts w:ascii="Malgun Gothic" w:hAnsi="Malgun Gothic"/>
+                <w:rFonts w:ascii="Arial" w:hAnsi="Arial" w:eastAsia="Malgun Gothic"/>
                 <w:b/>
-                <w:sz w:val="19"/>
+                <w:color w:val="14315C"/>
+                <w:sz w:val="18"/>
               </w:rPr>
               <w:t>지표</w:t>
             </w:r>
@@ -2387,13 +3719,18 @@
           <w:tcPr>
             <w:tcW w:type="dxa" w:w="4896"/>
             <w:vAlign w:val="center"/>
+            <w:shd w:fill="D9EAF7"/>
           </w:tcPr>
           <w:p>
+            <w:pPr>
+              <w:spacing w:before="20" w:after="20" w:line="252" w:lineRule="auto"/>
+            </w:pPr>
             <w:r>
               <w:rPr>
-                <w:rFonts w:ascii="Malgun Gothic" w:hAnsi="Malgun Gothic"/>
+                <w:rFonts w:ascii="Arial" w:hAnsi="Arial" w:eastAsia="Malgun Gothic"/>
                 <w:b/>
-                <w:sz w:val="19"/>
+                <w:color w:val="14315C"/>
+                <w:sz w:val="18"/>
               </w:rPr>
               <w:t>값</w:t>
             </w:r>
@@ -2407,11 +3744,15 @@
             <w:vAlign w:val="center"/>
           </w:tcPr>
           <w:p>
+            <w:pPr>
+              <w:spacing w:before="20" w:after="20" w:line="252" w:lineRule="auto"/>
+            </w:pPr>
             <w:r>
               <w:rPr>
-                <w:rFonts w:ascii="Malgun Gothic" w:hAnsi="Malgun Gothic"/>
+                <w:rFonts w:ascii="Arial" w:hAnsi="Arial" w:eastAsia="Malgun Gothic"/>
                 <w:b w:val="0"/>
-                <w:sz w:val="19"/>
+                <w:color w:val="000000"/>
+                <w:sz w:val="18"/>
               </w:rPr>
               <w:t>Precision</w:t>
             </w:r>
@@ -2423,13 +3764,17 @@
             <w:vAlign w:val="center"/>
           </w:tcPr>
           <w:p>
+            <w:pPr>
+              <w:spacing w:before="20" w:after="20" w:line="252" w:lineRule="auto"/>
+            </w:pPr>
             <w:r>
               <w:rPr>
-                <w:rFonts w:ascii="Malgun Gothic" w:hAnsi="Malgun Gothic"/>
+                <w:rFonts w:ascii="Arial" w:hAnsi="Arial" w:eastAsia="Malgun Gothic"/>
                 <w:b w:val="0"/>
-                <w:sz w:val="19"/>
+                <w:color w:val="000000"/>
+                <w:sz w:val="18"/>
               </w:rPr>
-              <w:t>0.406</w:t>
+              <w:t>0.409</w:t>
             </w:r>
           </w:p>
         </w:tc>
@@ -2441,11 +3786,15 @@
             <w:vAlign w:val="center"/>
           </w:tcPr>
           <w:p>
+            <w:pPr>
+              <w:spacing w:before="20" w:after="20" w:line="252" w:lineRule="auto"/>
+            </w:pPr>
             <w:r>
               <w:rPr>
-                <w:rFonts w:ascii="Malgun Gothic" w:hAnsi="Malgun Gothic"/>
+                <w:rFonts w:ascii="Arial" w:hAnsi="Arial" w:eastAsia="Malgun Gothic"/>
                 <w:b w:val="0"/>
-                <w:sz w:val="19"/>
+                <w:color w:val="000000"/>
+                <w:sz w:val="18"/>
               </w:rPr>
               <w:t>Recall</w:t>
             </w:r>
@@ -2457,13 +3806,17 @@
             <w:vAlign w:val="center"/>
           </w:tcPr>
           <w:p>
+            <w:pPr>
+              <w:spacing w:before="20" w:after="20" w:line="252" w:lineRule="auto"/>
+            </w:pPr>
             <w:r>
               <w:rPr>
-                <w:rFonts w:ascii="Malgun Gothic" w:hAnsi="Malgun Gothic"/>
+                <w:rFonts w:ascii="Arial" w:hAnsi="Arial" w:eastAsia="Malgun Gothic"/>
                 <w:b w:val="0"/>
-                <w:sz w:val="19"/>
+                <w:color w:val="000000"/>
+                <w:sz w:val="18"/>
               </w:rPr>
-              <w:t>0.660</w:t>
+              <w:t>0.667</w:t>
             </w:r>
           </w:p>
         </w:tc>
@@ -2475,11 +3828,15 @@
             <w:vAlign w:val="center"/>
           </w:tcPr>
           <w:p>
+            <w:pPr>
+              <w:spacing w:before="20" w:after="20" w:line="252" w:lineRule="auto"/>
+            </w:pPr>
             <w:r>
               <w:rPr>
-                <w:rFonts w:ascii="Malgun Gothic" w:hAnsi="Malgun Gothic"/>
+                <w:rFonts w:ascii="Arial" w:hAnsi="Arial" w:eastAsia="Malgun Gothic"/>
                 <w:b w:val="0"/>
-                <w:sz w:val="19"/>
+                <w:color w:val="000000"/>
+                <w:sz w:val="18"/>
               </w:rPr>
               <w:t>F1</w:t>
             </w:r>
@@ -2491,13 +3848,17 @@
             <w:vAlign w:val="center"/>
           </w:tcPr>
           <w:p>
+            <w:pPr>
+              <w:spacing w:before="20" w:after="20" w:line="252" w:lineRule="auto"/>
+            </w:pPr>
             <w:r>
               <w:rPr>
-                <w:rFonts w:ascii="Malgun Gothic" w:hAnsi="Malgun Gothic"/>
+                <w:rFonts w:ascii="Arial" w:hAnsi="Arial" w:eastAsia="Malgun Gothic"/>
                 <w:b w:val="0"/>
-                <w:sz w:val="19"/>
+                <w:color w:val="000000"/>
+                <w:sz w:val="18"/>
               </w:rPr>
-              <w:t>0.503</w:t>
+              <w:t>0.507</w:t>
             </w:r>
           </w:p>
         </w:tc>
@@ -2509,11 +3870,15 @@
             <w:vAlign w:val="center"/>
           </w:tcPr>
           <w:p>
+            <w:pPr>
+              <w:spacing w:before="20" w:after="20" w:line="252" w:lineRule="auto"/>
+            </w:pPr>
             <w:r>
               <w:rPr>
-                <w:rFonts w:ascii="Malgun Gothic" w:hAnsi="Malgun Gothic"/>
+                <w:rFonts w:ascii="Arial" w:hAnsi="Arial" w:eastAsia="Malgun Gothic"/>
                 <w:b w:val="0"/>
-                <w:sz w:val="19"/>
+                <w:color w:val="000000"/>
+                <w:sz w:val="18"/>
               </w:rPr>
               <w:t>ROC AUC</w:t>
             </w:r>
@@ -2525,13 +3890,17 @@
             <w:vAlign w:val="center"/>
           </w:tcPr>
           <w:p>
+            <w:pPr>
+              <w:spacing w:before="20" w:after="20" w:line="252" w:lineRule="auto"/>
+            </w:pPr>
             <w:r>
               <w:rPr>
-                <w:rFonts w:ascii="Malgun Gothic" w:hAnsi="Malgun Gothic"/>
+                <w:rFonts w:ascii="Arial" w:hAnsi="Arial" w:eastAsia="Malgun Gothic"/>
                 <w:b w:val="0"/>
-                <w:sz w:val="19"/>
+                <w:color w:val="000000"/>
+                <w:sz w:val="18"/>
               </w:rPr>
-              <w:t>0.765</w:t>
+              <w:t>0.766</w:t>
             </w:r>
           </w:p>
         </w:tc>
@@ -2543,11 +3912,15 @@
             <w:vAlign w:val="center"/>
           </w:tcPr>
           <w:p>
+            <w:pPr>
+              <w:spacing w:before="20" w:after="20" w:line="252" w:lineRule="auto"/>
+            </w:pPr>
             <w:r>
               <w:rPr>
-                <w:rFonts w:ascii="Malgun Gothic" w:hAnsi="Malgun Gothic"/>
+                <w:rFonts w:ascii="Arial" w:hAnsi="Arial" w:eastAsia="Malgun Gothic"/>
                 <w:b w:val="0"/>
-                <w:sz w:val="19"/>
+                <w:color w:val="000000"/>
+                <w:sz w:val="18"/>
               </w:rPr>
               <w:t>Average Precision</w:t>
             </w:r>
@@ -2559,13 +3932,17 @@
             <w:vAlign w:val="center"/>
           </w:tcPr>
           <w:p>
+            <w:pPr>
+              <w:spacing w:before="20" w:after="20" w:line="252" w:lineRule="auto"/>
+            </w:pPr>
             <w:r>
               <w:rPr>
-                <w:rFonts w:ascii="Malgun Gothic" w:hAnsi="Malgun Gothic"/>
+                <w:rFonts w:ascii="Arial" w:hAnsi="Arial" w:eastAsia="Malgun Gothic"/>
                 <w:b w:val="0"/>
-                <w:sz w:val="19"/>
+                <w:color w:val="000000"/>
+                <w:sz w:val="18"/>
               </w:rPr>
-              <w:t>0.511</w:t>
+              <w:t>0.516</w:t>
             </w:r>
           </w:p>
         </w:tc>
@@ -2577,11 +3954,15 @@
             <w:vAlign w:val="center"/>
           </w:tcPr>
           <w:p>
+            <w:pPr>
+              <w:spacing w:before="20" w:after="20" w:line="252" w:lineRule="auto"/>
+            </w:pPr>
             <w:r>
               <w:rPr>
-                <w:rFonts w:ascii="Malgun Gothic" w:hAnsi="Malgun Gothic"/>
+                <w:rFonts w:ascii="Arial" w:hAnsi="Arial" w:eastAsia="Malgun Gothic"/>
                 <w:b w:val="0"/>
-                <w:sz w:val="19"/>
+                <w:color w:val="000000"/>
+                <w:sz w:val="18"/>
               </w:rPr>
               <w:t>Predicted positive rate</w:t>
             </w:r>
@@ -2593,13 +3974,17 @@
             <w:vAlign w:val="center"/>
           </w:tcPr>
           <w:p>
+            <w:pPr>
+              <w:spacing w:before="20" w:after="20" w:line="252" w:lineRule="auto"/>
+            </w:pPr>
             <w:r>
               <w:rPr>
-                <w:rFonts w:ascii="Malgun Gothic" w:hAnsi="Malgun Gothic"/>
+                <w:rFonts w:ascii="Arial" w:hAnsi="Arial" w:eastAsia="Malgun Gothic"/>
                 <w:b w:val="0"/>
-                <w:sz w:val="19"/>
+                <w:color w:val="000000"/>
+                <w:sz w:val="18"/>
               </w:rPr>
-              <w:t>37.3%</w:t>
+              <w:t>37.4%</w:t>
             </w:r>
           </w:p>
         </w:tc>
@@ -2608,9 +3993,13 @@
     <w:p/>
     <w:p>
       <w:pPr>
+        <w:spacing w:before="80" w:after="60"/>
         <w:jc w:val="center"/>
       </w:pPr>
       <w:r>
+        <w:rPr>
+          <w:sz w:val="20"/>
+        </w:rPr>
         <w:drawing>
           <ns2:inline>
             <ns2:extent cx="4389120" cy="3706368"/>
@@ -2647,22 +4036,29 @@
     </w:p>
     <w:p>
       <w:pPr>
+        <w:pStyle w:val="Caption"/>
+        <w:spacing w:before="80" w:after="140"/>
         <w:jc w:val="center"/>
       </w:pPr>
       <w:r>
         <w:rPr>
-          <w:rFonts w:ascii="Malgun Gothic" w:hAnsi="Malgun Gothic"/>
+          <w:rFonts w:ascii="Arial" w:hAnsi="Arial" w:eastAsia="Malgun Gothic"/>
           <w:b w:val="0"/>
-          <w:sz w:val="19"/>
+          <w:color w:val="5A5A5A"/>
+          <w:sz w:val="18"/>
         </w:rPr>
-        <w:t>Figure 2. Final model confusion matrix</w:t>
+        <w:t>그림 2. 최종 모델 Confusion Matrix</w:t>
       </w:r>
     </w:p>
     <w:p>
       <w:pPr>
+        <w:spacing w:before="80" w:after="60"/>
         <w:jc w:val="center"/>
       </w:pPr>
       <w:r>
+        <w:rPr>
+          <w:sz w:val="20"/>
+        </w:rPr>
         <w:drawing>
           <ns2:inline>
             <ns2:extent cx="4389120" cy="3511296"/>
@@ -2699,22 +4095,29 @@
     </w:p>
     <w:p>
       <w:pPr>
+        <w:pStyle w:val="Caption"/>
+        <w:spacing w:before="80" w:after="140"/>
         <w:jc w:val="center"/>
       </w:pPr>
       <w:r>
         <w:rPr>
-          <w:rFonts w:ascii="Malgun Gothic" w:hAnsi="Malgun Gothic"/>
+          <w:rFonts w:ascii="Arial" w:hAnsi="Arial" w:eastAsia="Malgun Gothic"/>
           <w:b w:val="0"/>
-          <w:sz w:val="19"/>
+          <w:color w:val="5A5A5A"/>
+          <w:sz w:val="18"/>
         </w:rPr>
-        <w:t>Figure 3. Final model ROC curve</w:t>
+        <w:t>그림 3. 최종 모델 ROC Curve</w:t>
       </w:r>
     </w:p>
     <w:p>
       <w:pPr>
+        <w:spacing w:before="80" w:after="60"/>
         <w:jc w:val="center"/>
       </w:pPr>
       <w:r>
+        <w:rPr>
+          <w:sz w:val="20"/>
+        </w:rPr>
         <w:drawing>
           <ns2:inline>
             <ns2:extent cx="4389120" cy="3511296"/>
@@ -2751,22 +4154,29 @@
     </w:p>
     <w:p>
       <w:pPr>
+        <w:pStyle w:val="Caption"/>
+        <w:spacing w:before="80" w:after="140"/>
         <w:jc w:val="center"/>
       </w:pPr>
       <w:r>
         <w:rPr>
-          <w:rFonts w:ascii="Malgun Gothic" w:hAnsi="Malgun Gothic"/>
+          <w:rFonts w:ascii="Arial" w:hAnsi="Arial" w:eastAsia="Malgun Gothic"/>
           <w:b w:val="0"/>
-          <w:sz w:val="19"/>
+          <w:color w:val="5A5A5A"/>
+          <w:sz w:val="18"/>
         </w:rPr>
-        <w:t>Figure 4. Final model Precision-Recall curve</w:t>
+        <w:t>그림 4. 최종 모델 Precision-Recall Curve</w:t>
       </w:r>
     </w:p>
     <w:p>
       <w:pPr>
+        <w:spacing w:before="80" w:after="60"/>
         <w:jc w:val="center"/>
       </w:pPr>
       <w:r>
+        <w:rPr>
+          <w:sz w:val="20"/>
+        </w:rPr>
         <w:drawing>
           <ns2:inline>
             <ns2:extent cx="4754880" cy="3169920"/>
@@ -2803,22 +4213,29 @@
     </w:p>
     <w:p>
       <w:pPr>
+        <w:pStyle w:val="Caption"/>
+        <w:spacing w:before="80" w:after="140"/>
         <w:jc w:val="center"/>
       </w:pPr>
       <w:r>
         <w:rPr>
-          <w:rFonts w:ascii="Malgun Gothic" w:hAnsi="Malgun Gothic"/>
+          <w:rFonts w:ascii="Arial" w:hAnsi="Arial" w:eastAsia="Malgun Gothic"/>
           <w:b w:val="0"/>
-          <w:sz w:val="19"/>
+          <w:color w:val="5A5A5A"/>
+          <w:sz w:val="18"/>
         </w:rPr>
-        <w:t>Figure 5. Learning curve</w:t>
+        <w:t>그림 5. Learning Curve</w:t>
       </w:r>
     </w:p>
     <w:p>
       <w:pPr>
+        <w:spacing w:before="80" w:after="60"/>
         <w:jc w:val="center"/>
       </w:pPr>
       <w:r>
+        <w:rPr>
+          <w:sz w:val="20"/>
+        </w:rPr>
         <w:drawing>
           <ns2:inline>
             <ns2:extent cx="4754880" cy="3169920"/>
@@ -2855,45 +4272,62 @@
     </w:p>
     <w:p>
       <w:pPr>
+        <w:pStyle w:val="Caption"/>
+        <w:spacing w:before="80" w:after="140"/>
         <w:jc w:val="center"/>
       </w:pPr>
       <w:r>
         <w:rPr>
-          <w:rFonts w:ascii="Malgun Gothic" w:hAnsi="Malgun Gothic"/>
+          <w:rFonts w:ascii="Arial" w:hAnsi="Arial" w:eastAsia="Malgun Gothic"/>
           <w:b w:val="0"/>
-          <w:sz w:val="19"/>
+          <w:color w:val="5A5A5A"/>
+          <w:sz w:val="18"/>
         </w:rPr>
-        <w:t>Figure 6. Validation curve</w:t>
+        <w:t>그림 6. Validation Curve</w:t>
       </w:r>
     </w:p>
     <w:p>
+      <w:pPr>
+        <w:spacing w:line="295" w:lineRule="auto" w:after="140"/>
+        <w:jc w:val="both"/>
+      </w:pPr>
       <w:r>
         <w:rPr>
-          <w:rFonts w:ascii="Malgun Gothic" w:hAnsi="Malgun Gothic"/>
+          <w:rFonts w:ascii="Arial" w:hAnsi="Arial" w:eastAsia="Malgun Gothic"/>
           <w:b w:val="0"/>
           <w:sz w:val="21"/>
         </w:rPr>
-        <w:t>Learning curve와 validation curve를 통해 overfitting 가능성을 보조적으로 확인하였다. 또한 5-fold cross validation과 Logistic Regression regularization을 사용하여 모델이 train set에만 과하게 맞춰지지 않도록 하였다.</w:t>
+        <w:t>Learning curve와 validation curve는 모델이 학습데이터에만 과도하게 맞춰지는지 확인하기 위한 보조 자료로 사용하였다. Learning curve에서 train 성능과 validation 성능의 간격이 크게 벌어지지 않는지 확인하고, validation curve로 Logistic Regression의 regularization 강도가 성능에 미치는 영향을 살펴보았다. 또한 5-fold cross validation과 Logistic Regression regularization을 사용하여 overfitting을 완화하려고 하였다.</w:t>
       </w:r>
     </w:p>
     <w:p>
       <w:pPr>
         <w:pStyle w:val="Heading1"/>
+        <w:spacing w:before="320" w:after="160"/>
+        <w:jc w:val="left"/>
+        <w:pBdr>
+          <w:bottom w:val="single" w:sz="6" w:space="4" w:color="9EC5E8"/>
+        </w:pBdr>
       </w:pPr>
       <w:r>
         <w:rPr>
-          <w:rFonts w:ascii="Malgun Gothic" w:hAnsi="Malgun Gothic"/>
+          <w:rFonts w:ascii="Arial" w:hAnsi="Arial" w:eastAsia="Malgun Gothic"/>
           <w:b/>
+          <w:color w:val="14315C"/>
           <w:sz w:val="28"/>
         </w:rPr>
-        <w:t>8. Feature Importance 및 SHAP</w:t>
+        <w:t>9. Feature Importance 및 SHAP</w:t>
       </w:r>
     </w:p>
     <w:p>
       <w:pPr>
+        <w:spacing w:before="80" w:after="60"/>
         <w:jc w:val="center"/>
       </w:pPr>
       <w:r>
+        <w:rPr>
+          <w:sz w:val="20"/>
+        </w:rPr>
         <w:drawing>
           <ns2:inline>
             <ns2:extent cx="5303520" cy="3314700"/>
@@ -2930,22 +4364,29 @@
     </w:p>
     <w:p>
       <w:pPr>
+        <w:pStyle w:val="Caption"/>
+        <w:spacing w:before="80" w:after="140"/>
         <w:jc w:val="center"/>
       </w:pPr>
       <w:r>
         <w:rPr>
-          <w:rFonts w:ascii="Malgun Gothic" w:hAnsi="Malgun Gothic"/>
+          <w:rFonts w:ascii="Arial" w:hAnsi="Arial" w:eastAsia="Malgun Gothic"/>
           <w:b w:val="0"/>
-          <w:sz w:val="19"/>
+          <w:color w:val="5A5A5A"/>
+          <w:sz w:val="18"/>
         </w:rPr>
-        <w:t>Figure 7. Logistic Regression feature importance</w:t>
+        <w:t>그림 7. Logistic Regression Feature Importance</w:t>
       </w:r>
     </w:p>
     <w:p>
       <w:pPr>
+        <w:spacing w:before="80" w:after="60"/>
         <w:jc w:val="center"/>
       </w:pPr>
       <w:r>
+        <w:rPr>
+          <w:sz w:val="20"/>
+        </w:rPr>
         <w:drawing>
           <ns2:inline>
             <ns2:extent cx="5303520" cy="5034081"/>
@@ -2982,54 +4423,75 @@
     </w:p>
     <w:p>
       <w:pPr>
+        <w:pStyle w:val="Caption"/>
+        <w:spacing w:before="80" w:after="140"/>
         <w:jc w:val="center"/>
       </w:pPr>
       <w:r>
         <w:rPr>
-          <w:rFonts w:ascii="Malgun Gothic" w:hAnsi="Malgun Gothic"/>
+          <w:rFonts w:ascii="Arial" w:hAnsi="Arial" w:eastAsia="Malgun Gothic"/>
           <w:b w:val="0"/>
-          <w:sz w:val="19"/>
+          <w:color w:val="5A5A5A"/>
+          <w:sz w:val="18"/>
         </w:rPr>
-        <w:t>Figure 8. SHAP summary plot</w:t>
+        <w:t>그림 8. SHAP Summary Plot</w:t>
       </w:r>
     </w:p>
     <w:p>
+      <w:pPr>
+        <w:spacing w:line="295" w:lineRule="auto" w:after="140"/>
+        <w:jc w:val="both"/>
+      </w:pPr>
       <w:r>
         <w:rPr>
-          <w:rFonts w:ascii="Malgun Gothic" w:hAnsi="Malgun Gothic"/>
+          <w:rFonts w:ascii="Arial" w:hAnsi="Arial" w:eastAsia="Malgun Gothic"/>
           <w:b w:val="0"/>
           <w:sz w:val="21"/>
         </w:rPr>
-        <w:t>Feature importance와 SHAP 모두 인과관계로 해석하지 않는다. 두 결과는 모델이 예측할 때 어떤 변수를 상대적으로 많이 참고했는지 설명하는 도구로 사용하였다. 상위 변수에는 sex, waist circumference, BMI, family history, age 등이 포함되었다.</w:t>
+        <w:t>Feature importance와 SHAP 결과는 모델이 예측할 때 어떤 변수를 상대적으로 많이 참고했는지를 설명하기 위한 도구로 사용하였다. 두 분석 결과를 인과관계로 해석하지 않고, 선행연구에서 알려진 고혈압 관련 요인과 비교하는 수준에서 검토하였다. 상위 변수에는 sex, waist circumference, BMI, family history, age 등이 포함되었고, 추가한 식이 변수(N_NA, N_K)도 모델 feature에 포함되었다. SHAP 결과에서 칼륨 섭취량이 일부 기여를 보였지만, 이는 데이터 내 패턴을 설명하는 의미로 제한하였다.</w:t>
       </w:r>
     </w:p>
     <w:p>
       <w:pPr>
         <w:pStyle w:val="Heading1"/>
+        <w:spacing w:before="320" w:after="160"/>
+        <w:jc w:val="left"/>
+        <w:pBdr>
+          <w:bottom w:val="single" w:sz="6" w:space="4" w:color="9EC5E8"/>
+        </w:pBdr>
       </w:pPr>
       <w:r>
         <w:rPr>
-          <w:rFonts w:ascii="Malgun Gothic" w:hAnsi="Malgun Gothic"/>
+          <w:rFonts w:ascii="Arial" w:hAnsi="Arial" w:eastAsia="Malgun Gothic"/>
           <w:b/>
+          <w:color w:val="14315C"/>
           <w:sz w:val="28"/>
         </w:rPr>
-        <w:t>9. 웹 배포</w:t>
+        <w:t>10. 웹 배포</w:t>
       </w:r>
     </w:p>
     <w:p>
+      <w:pPr>
+        <w:spacing w:line="295" w:lineRule="auto" w:after="140"/>
+        <w:jc w:val="both"/>
+      </w:pPr>
       <w:r>
         <w:rPr>
-          <w:rFonts w:ascii="Malgun Gothic" w:hAnsi="Malgun Gothic"/>
+          <w:rFonts w:ascii="Arial" w:hAnsi="Arial" w:eastAsia="Malgun Gothic"/>
           <w:b w:val="0"/>
           <w:sz w:val="21"/>
         </w:rPr>
-        <w:t>Streamlit을 사용하여 간단한 예측 인터페이스를 만들었다. 사용자는 나이, 성별, BMI, 허리둘레, 혈당, HbA1c, 생활습관, 가족력 등의 값을 입력하고 고혈압 위험 예측 결과를 확인할 수 있다. 또한 예측 결과가 도움이 되었는지 표시하고 추가 의견을 남길 수 있다.</w:t>
+        <w:t>Streamlit을 사용하여 사용자가 직접 값을 입력하고 예측 결과를 확인할 수 있는 간단한 웹 인터페이스를 구현하였다. 사용자는 나이, 성별, BMI, 허리둘레, 혈당, HbA1c, 총콜레스테롤, 나트륨·칼륨 섭취량, 생활습관, 가족력 등을 입력할 수 있다. 웹 예측은 교수님 피드백에 따라 post-COVID(2022-2023) 측정환경 기준으로 설정하였다. 의학 용어가 낯선 사용자를 위해 tooltip을 추가하고, 예측 결과에 따라 혈압 확인 권장 문구를 제시하였다.</w:t>
       </w:r>
     </w:p>
     <w:p>
+      <w:pPr>
+        <w:spacing w:line="295" w:lineRule="auto" w:after="140"/>
+        <w:jc w:val="both"/>
+      </w:pPr>
       <w:r>
         <w:rPr>
-          <w:rFonts w:ascii="Malgun Gothic" w:hAnsi="Malgun Gothic"/>
+          <w:rFonts w:ascii="Arial" w:hAnsi="Arial" w:eastAsia="Malgun Gothic"/>
           <w:b w:val="0"/>
           <w:sz w:val="21"/>
         </w:rPr>
@@ -3038,9 +4500,13 @@
     </w:p>
     <w:p>
       <w:pPr>
+        <w:spacing w:before="80" w:after="60"/>
         <w:jc w:val="center"/>
       </w:pPr>
       <w:r>
+        <w:rPr>
+          <w:sz w:val="20"/>
+        </w:rPr>
         <w:drawing>
           <ns2:inline>
             <ns2:extent cx="5303520" cy="4659022"/>
@@ -3077,22 +4543,29 @@
     </w:p>
     <w:p>
       <w:pPr>
+        <w:pStyle w:val="Caption"/>
+        <w:spacing w:before="80" w:after="140"/>
         <w:jc w:val="center"/>
       </w:pPr>
       <w:r>
         <w:rPr>
-          <w:rFonts w:ascii="Malgun Gothic" w:hAnsi="Malgun Gothic"/>
+          <w:rFonts w:ascii="Arial" w:hAnsi="Arial" w:eastAsia="Malgun Gothic"/>
           <w:b w:val="0"/>
-          <w:sz w:val="19"/>
+          <w:color w:val="5A5A5A"/>
+          <w:sz w:val="18"/>
         </w:rPr>
-        <w:t>Figure 9. Streamlit prediction interface</w:t>
+        <w:t>그림 9. Streamlit 예측 입력 화면</w:t>
       </w:r>
     </w:p>
     <w:p>
       <w:pPr>
+        <w:spacing w:before="80" w:after="60"/>
         <w:jc w:val="center"/>
       </w:pPr>
       <w:r>
+        <w:rPr>
+          <w:sz w:val="20"/>
+        </w:rPr>
         <w:drawing>
           <ns2:inline>
             <ns2:extent cx="5303520" cy="4659022"/>
@@ -3129,22 +4602,29 @@
     </w:p>
     <w:p>
       <w:pPr>
+        <w:pStyle w:val="Caption"/>
+        <w:spacing w:before="80" w:after="140"/>
         <w:jc w:val="center"/>
       </w:pPr>
       <w:r>
         <w:rPr>
-          <w:rFonts w:ascii="Malgun Gothic" w:hAnsi="Malgun Gothic"/>
+          <w:rFonts w:ascii="Arial" w:hAnsi="Arial" w:eastAsia="Malgun Gothic"/>
           <w:b w:val="0"/>
-          <w:sz w:val="19"/>
+          <w:color w:val="5A5A5A"/>
+          <w:sz w:val="18"/>
         </w:rPr>
-        <w:t>Figure 10. Streamlit prediction result</w:t>
+        <w:t>그림 10. Streamlit 예측 결과 화면</w:t>
       </w:r>
     </w:p>
     <w:p>
       <w:pPr>
+        <w:spacing w:before="80" w:after="60"/>
         <w:jc w:val="center"/>
       </w:pPr>
       <w:r>
+        <w:rPr>
+          <w:sz w:val="20"/>
+        </w:rPr>
         <w:drawing>
           <ns2:inline>
             <ns2:extent cx="5303520" cy="4659022"/>
@@ -3181,44 +4661,76 @@
     </w:p>
     <w:p>
       <w:pPr>
+        <w:pStyle w:val="Caption"/>
+        <w:spacing w:before="80" w:after="140"/>
         <w:jc w:val="center"/>
       </w:pPr>
       <w:r>
         <w:rPr>
-          <w:rFonts w:ascii="Malgun Gothic" w:hAnsi="Malgun Gothic"/>
+          <w:rFonts w:ascii="Arial" w:hAnsi="Arial" w:eastAsia="Malgun Gothic"/>
           <w:b w:val="0"/>
-          <w:sz w:val="19"/>
+          <w:color w:val="5A5A5A"/>
+          <w:sz w:val="18"/>
         </w:rPr>
-        <w:t>Figure 11. Streamlit user feedback saved</w:t>
+        <w:t>그림 11. Streamlit 사용자 피드백 저장 화면</w:t>
       </w:r>
     </w:p>
     <w:p>
       <w:pPr>
         <w:pStyle w:val="Heading1"/>
+        <w:spacing w:before="320" w:after="160"/>
+        <w:jc w:val="left"/>
+        <w:pBdr>
+          <w:bottom w:val="single" w:sz="6" w:space="4" w:color="9EC5E8"/>
+        </w:pBdr>
       </w:pPr>
       <w:r>
         <w:rPr>
-          <w:rFonts w:ascii="Malgun Gothic" w:hAnsi="Malgun Gothic"/>
+          <w:rFonts w:ascii="Arial" w:hAnsi="Arial" w:eastAsia="Malgun Gothic"/>
           <w:b/>
+          <w:color w:val="14315C"/>
           <w:sz w:val="28"/>
         </w:rPr>
-        <w:t>10. 논의</w:t>
+        <w:t>11. 논의</w:t>
       </w:r>
     </w:p>
     <w:p>
+      <w:pPr>
+        <w:spacing w:line="295" w:lineRule="auto" w:after="140"/>
+        <w:shd w:fill="FFF7E6"/>
+        <w:jc w:val="both"/>
+      </w:pPr>
       <w:r>
         <w:rPr>
-          <w:rFonts w:ascii="Malgun Gothic" w:hAnsi="Malgun Gothic"/>
+          <w:rFonts w:ascii="Arial" w:hAnsi="Arial" w:eastAsia="Malgun Gothic"/>
           <w:b w:val="0"/>
           <w:sz w:val="21"/>
         </w:rPr>
-        <w:t>본 프로젝트는 130/80 기준을 사용하면서 class imbalance를 완화하고, 고혈압 관련 변수를 추가하여 예측 모델을 구성하였다. 최종 모델은 고혈압군을 일정 수준 탐지했지만 false positive도 존재하므로 precision과 recall의 trade-off를 함께 해석해야 한다.</w:t>
+        <w:t>주요 결과 요약: 130/80 기준 적용 후 양성 class 비율이 증가하여 모델 학습 문제가 완화되었다. 나트륨·칼륨 섭취량은 고혈압군과 비고혈압군 사이에서 통계적 차이를 보였고, 최종 Logistic Regression 모델은 ROC AUC 0.766, Recall 0.667을 보였다. 다만 측정체계 변화와 covid_period 해석은 주요 한계로 남아 있다.</w:t>
       </w:r>
     </w:p>
     <w:p>
+      <w:pPr>
+        <w:spacing w:line="295" w:lineRule="auto" w:after="140"/>
+        <w:jc w:val="both"/>
+      </w:pPr>
       <w:r>
         <w:rPr>
-          <w:rFonts w:ascii="Malgun Gothic" w:hAnsi="Malgun Gothic"/>
+          <w:rFonts w:ascii="Arial" w:hAnsi="Arial" w:eastAsia="Malgun Gothic"/>
+          <w:b w:val="0"/>
+          <w:sz w:val="21"/>
+        </w:rPr>
+        <w:t>본 프로젝트는 130/80 기준을 사용하면서 class imbalance를 완화하고, 고혈압 관련 변수와 식이 변수(N_NA, N_K)를 추가하여 예측 모델을 구성하였다. 최종 모델은 고혈압군을 일정 수준 탐지하지만 false positive도 존재하므로 precision과 recall의 trade-off를 함께 해석해야 한다. 즉, 이 모델은 의학적 확정 진단이 아니라 위험군을 선별하고 추가 확인을 유도하는 교육용 screening 모델로 이해하는 것이 적절하다.</w:t>
+      </w:r>
+    </w:p>
+    <w:p>
+      <w:pPr>
+        <w:spacing w:line="295" w:lineRule="auto" w:after="140"/>
+        <w:jc w:val="both"/>
+      </w:pPr>
+      <w:r>
+        <w:rPr>
+          <w:rFonts w:ascii="Arial" w:hAnsi="Arial" w:eastAsia="Malgun Gothic"/>
           <w:b w:val="0"/>
           <w:sz w:val="21"/>
         </w:rPr>
@@ -3226,55 +4738,79 @@
       </w:r>
     </w:p>
     <w:p>
+      <w:pPr>
+        <w:spacing w:line="295" w:lineRule="auto" w:after="140"/>
+        <w:jc w:val="both"/>
+      </w:pPr>
       <w:r>
         <w:rPr>
-          <w:rFonts w:ascii="Malgun Gothic" w:hAnsi="Malgun Gothic"/>
+          <w:rFonts w:ascii="Arial" w:hAnsi="Arial" w:eastAsia="Malgun Gothic"/>
           <w:b w:val="0"/>
           <w:sz w:val="21"/>
         </w:rPr>
-        <w:t>한계점으로는 단순 결측치 대체, 수업 과제 수준의 hyperparameter tuning, KNHANES 측정체계 변화, 의료 진단이 아닌 screening 목적이라는 점이 있다. 향후에는 threshold 조정, 외부 검증, 제한 연도 모델 비교 등을 추가로 검토할 수 있다.</w:t>
+        <w:t>한계점으로는 단순 결측치 대체, 수업 과제 수준의 hyperparameter tuning, KNHANES 측정체계 변화, 의료 진단이 아닌 screening 목적이라는 점이 있다. 특히 covid_period는 COVID-19 자체의 영향이 아니라 조사 시기와 측정환경 변화가 함께 반영된 변수로 해석해야 한다. 향후에는 threshold 조정, 외부 검증, 측정 일관 연도만을 사용한 모델 비교, 피드백 데이터 축적 후 앱 설명 문구 개선을 추가로 검토할 수 있다.</w:t>
       </w:r>
     </w:p>
     <w:p>
       <w:pPr>
         <w:pStyle w:val="Heading1"/>
+        <w:spacing w:before="320" w:after="160"/>
+        <w:jc w:val="left"/>
+        <w:pBdr>
+          <w:bottom w:val="single" w:sz="6" w:space="4" w:color="9EC5E8"/>
+        </w:pBdr>
       </w:pPr>
       <w:r>
         <w:rPr>
-          <w:rFonts w:ascii="Malgun Gothic" w:hAnsi="Malgun Gothic"/>
+          <w:rFonts w:ascii="Arial" w:hAnsi="Arial" w:eastAsia="Malgun Gothic"/>
           <w:b/>
+          <w:color w:val="14315C"/>
           <w:sz w:val="28"/>
         </w:rPr>
-        <w:t>11. 결론</w:t>
+        <w:t>12. 결론</w:t>
       </w:r>
     </w:p>
     <w:p>
+      <w:pPr>
+        <w:spacing w:line="295" w:lineRule="auto" w:after="140"/>
+        <w:jc w:val="both"/>
+      </w:pPr>
       <w:r>
         <w:rPr>
-          <w:rFonts w:ascii="Malgun Gothic" w:hAnsi="Malgun Gothic"/>
+          <w:rFonts w:ascii="Arial" w:hAnsi="Arial" w:eastAsia="Malgun Gothic"/>
           <w:b w:val="0"/>
           <w:sz w:val="21"/>
         </w:rPr>
-        <w:t>본 프로젝트에서는 KNHANES 2017-2023 자료를 사용하여 19-39세 젊은 성인의 고혈압 위험을 예측하였다. 교수님 피드백을 반영하여 130/80 기준을 사용하고, 추가 고혈압 관련 변수, class imbalance 처리, leakage 방지, SHAP 해석, Streamlit 배포까지 수행하였다.</w:t>
+        <w:t>본 프로젝트에서는 KNHANES 2017-2023 자료를 사용하여 19-39세 젊은 성인의 고혈압 위험을 예측하였다. 교수님 피드백을 반영하여 130/80 기준을 사용하고, 식이 변수 추가, class imbalance 처리, leakage 방지, 통계적 비교, SHAP 해석, Streamlit 배포까지 수행하였다. 최종 모델은 현실 의료 진단 도구라기보다, 수업에서 배운 전처리-모델비교-튜닝-해석-배포 과정을 하나의 예측 프로젝트로 연결한 결과로 볼 수 있다.</w:t>
       </w:r>
     </w:p>
     <w:p>
       <w:pPr>
         <w:pStyle w:val="Heading1"/>
+        <w:spacing w:before="320" w:after="160"/>
+        <w:jc w:val="left"/>
+        <w:pBdr>
+          <w:bottom w:val="single" w:sz="6" w:space="4" w:color="9EC5E8"/>
+        </w:pBdr>
       </w:pPr>
       <w:r>
         <w:rPr>
-          <w:rFonts w:ascii="Malgun Gothic" w:hAnsi="Malgun Gothic"/>
+          <w:rFonts w:ascii="Arial" w:hAnsi="Arial" w:eastAsia="Malgun Gothic"/>
           <w:b/>
+          <w:color w:val="14315C"/>
           <w:sz w:val="28"/>
         </w:rPr>
-        <w:t>12. 참고문헌</w:t>
+        <w:t>13. 참고문헌</w:t>
       </w:r>
     </w:p>
     <w:p>
+      <w:pPr>
+        <w:spacing w:line="295" w:lineRule="auto" w:after="140"/>
+        <w:jc w:val="both"/>
+      </w:pPr>
       <w:r>
         <w:rPr>
-          <w:rFonts w:ascii="Malgun Gothic" w:hAnsi="Malgun Gothic"/>
+          <w:rFonts w:ascii="Arial" w:hAnsi="Arial" w:eastAsia="Malgun Gothic"/>
           <w:b w:val="0"/>
           <w:sz w:val="21"/>
         </w:rPr>
@@ -3282,9 +4818,13 @@
       </w:r>
     </w:p>
     <w:p>
+      <w:pPr>
+        <w:spacing w:line="295" w:lineRule="auto" w:after="140"/>
+        <w:jc w:val="both"/>
+      </w:pPr>
       <w:r>
         <w:rPr>
-          <w:rFonts w:ascii="Malgun Gothic" w:hAnsi="Malgun Gothic"/>
+          <w:rFonts w:ascii="Arial" w:hAnsi="Arial" w:eastAsia="Malgun Gothic"/>
           <w:b w:val="0"/>
           <w:sz w:val="21"/>
         </w:rPr>
@@ -3292,9 +4832,13 @@
       </w:r>
     </w:p>
     <w:p>
+      <w:pPr>
+        <w:spacing w:line="295" w:lineRule="auto" w:after="140"/>
+        <w:jc w:val="both"/>
+      </w:pPr>
       <w:r>
         <w:rPr>
-          <w:rFonts w:ascii="Malgun Gothic" w:hAnsi="Malgun Gothic"/>
+          <w:rFonts w:ascii="Arial" w:hAnsi="Arial" w:eastAsia="Malgun Gothic"/>
           <w:b w:val="0"/>
           <w:sz w:val="21"/>
         </w:rPr>
@@ -3302,9 +4846,13 @@
       </w:r>
     </w:p>
     <w:p>
+      <w:pPr>
+        <w:spacing w:line="295" w:lineRule="auto" w:after="140"/>
+        <w:jc w:val="both"/>
+      </w:pPr>
       <w:r>
         <w:rPr>
-          <w:rFonts w:ascii="Malgun Gothic" w:hAnsi="Malgun Gothic"/>
+          <w:rFonts w:ascii="Arial" w:hAnsi="Arial" w:eastAsia="Malgun Gothic"/>
           <w:b w:val="0"/>
           <w:sz w:val="21"/>
         </w:rPr>
@@ -3312,9 +4860,13 @@
       </w:r>
     </w:p>
     <w:p>
+      <w:pPr>
+        <w:spacing w:line="295" w:lineRule="auto" w:after="140"/>
+        <w:jc w:val="both"/>
+      </w:pPr>
       <w:r>
         <w:rPr>
-          <w:rFonts w:ascii="Malgun Gothic" w:hAnsi="Malgun Gothic"/>
+          <w:rFonts w:ascii="Arial" w:hAnsi="Arial" w:eastAsia="Malgun Gothic"/>
           <w:b w:val="0"/>
           <w:sz w:val="21"/>
         </w:rPr>
@@ -3322,9 +4874,13 @@
       </w:r>
     </w:p>
     <w:p>
+      <w:pPr>
+        <w:spacing w:line="295" w:lineRule="auto" w:after="140"/>
+        <w:jc w:val="both"/>
+      </w:pPr>
       <w:r>
         <w:rPr>
-          <w:rFonts w:ascii="Malgun Gothic" w:hAnsi="Malgun Gothic"/>
+          <w:rFonts w:ascii="Arial" w:hAnsi="Arial" w:eastAsia="Malgun Gothic"/>
           <w:b w:val="0"/>
           <w:sz w:val="21"/>
         </w:rPr>
@@ -3332,9 +4888,13 @@
       </w:r>
     </w:p>
     <w:p>
+      <w:pPr>
+        <w:spacing w:line="295" w:lineRule="auto" w:after="140"/>
+        <w:jc w:val="both"/>
+      </w:pPr>
       <w:r>
         <w:rPr>
-          <w:rFonts w:ascii="Malgun Gothic" w:hAnsi="Malgun Gothic"/>
+          <w:rFonts w:ascii="Arial" w:hAnsi="Arial" w:eastAsia="Malgun Gothic"/>
           <w:b w:val="0"/>
           <w:sz w:val="21"/>
         </w:rPr>
@@ -3342,6 +4902,7 @@
       </w:r>
     </w:p>
     <w:sectPr>
+      <w:footerReference w:type="default" ns5:id="rId20"/>
       <w:pgSz w:w="12240" w:h="15840"/>
       <w:pgMar w:top="1080" w:right="1224" w:bottom="1080" w:left="1224" w:header="720" w:footer="720" w:gutter="0"/>
       <w:cols w:space="720"/>
@@ -3349,6 +4910,27 @@
     </w:sectPr>
   </w:body>
 </w:document>
+</file>
+
+<file path=word/footer1.xml><?xml version="1.0" encoding="utf-8"?>
+<w:ftr xmlns:m="http://schemas.openxmlformats.org/officeDocument/2006/math" xmlns:mc="http://schemas.openxmlformats.org/markup-compatibility/2006" xmlns:mo="http://schemas.microsoft.com/office/mac/office/2008/main" xmlns:mv="urn:schemas-microsoft-com:mac:vml" xmlns:o="urn:schemas-microsoft-com:office:office" xmlns:r="http://schemas.openxmlformats.org/officeDocument/2006/relationships" xmlns:v="urn:schemas-microsoft-com:vml" xmlns:w10="urn:schemas-microsoft-com:office:word" xmlns:w14="http://schemas.microsoft.com/office/word/2010/wordml" xmlns:w="http://schemas.openxmlformats.org/wordprocessingml/2006/main" xmlns:wne="http://schemas.microsoft.com/office/word/2006/wordml" xmlns:wp14="http://schemas.microsoft.com/office/word/2010/wordprocessingDrawing" xmlns:wp="http://schemas.openxmlformats.org/drawingml/2006/wordprocessingDrawing" xmlns:wpc="http://schemas.microsoft.com/office/word/2010/wordprocessingCanvas" xmlns:wpg="http://schemas.microsoft.com/office/word/2010/wordprocessingGroup" xmlns:wpi="http://schemas.microsoft.com/office/word/2010/wordprocessingInk" xmlns:wps="http://schemas.microsoft.com/office/word/2010/wordprocessingShape" mc:Ignorable="w14 wp14">
+  <w:p>
+    <w:pPr>
+      <w:pStyle w:val="Footer"/>
+      <w:jc w:val="center"/>
+    </w:pPr>
+    <w:r>
+      <w:rPr>
+        <w:rFonts w:ascii="Arial" w:hAnsi="Arial" w:eastAsia="Malgun Gothic"/>
+        <w:color w:val="646464"/>
+        <w:sz w:val="18"/>
+      </w:rPr>
+      <w:fldChar w:fldCharType="begin"/>
+      <w:instrText xml:space="preserve">PAGE</w:instrText>
+      <w:fldChar w:fldCharType="end"/>
+    </w:r>
+  </w:p>
+</w:ftr>
 </file>
 
 <file path=word/numbering.xml><?xml version="1.0" encoding="utf-8"?>
@@ -3714,6 +5296,14 @@
     <w:name w:val="Normal"/>
     <w:qFormat/>
     <w:rsid w:val="00FC693F"/>
+    <w:pPr>
+      <w:spacing w:line="283" w:lineRule="auto" w:after="120"/>
+      <w:ind w:firstLine="0"/>
+    </w:pPr>
+    <w:rPr>
+      <w:rFonts w:ascii="Arial" w:hAnsi="Arial" w:eastAsia="Malgun Gothic"/>
+      <w:sz w:val="21"/>
+    </w:rPr>
   </w:style>
   <w:style w:type="paragraph" w:styleId="Header">
     <w:name w:val="header"/>
@@ -3770,14 +5360,14 @@
     <w:pPr>
       <w:keepNext/>
       <w:keepLines/>
-      <w:spacing w:before="480" w:after="0"/>
+      <w:spacing w:before="280" w:after="140"/>
       <w:outlineLvl w:val="0"/>
     </w:pPr>
     <w:rPr>
-      <w:rFonts w:asciiTheme="majorHAnsi" w:eastAsiaTheme="majorEastAsia" w:hAnsiTheme="majorHAnsi" w:cstheme="majorBidi"/>
+      <w:rFonts w:asciiTheme="majorHAnsi" w:eastAsiaTheme="majorEastAsia" w:hAnsiTheme="majorHAnsi" w:cstheme="majorBidi" w:ascii="Arial" w:hAnsi="Arial" w:eastAsia="Malgun Gothic"/>
       <w:b/>
       <w:bCs/>
-      <w:color w:val="365F91" w:themeColor="accent1" w:themeShade="BF"/>
+      <w:color w:val="14315C"/>
       <w:sz w:val="28"/>
       <w:szCs w:val="28"/>
     </w:rPr>
@@ -3794,15 +5384,15 @@
     <w:pPr>
       <w:keepNext/>
       <w:keepLines/>
-      <w:spacing w:before="200" w:after="0"/>
+      <w:spacing w:before="280" w:after="140"/>
       <w:outlineLvl w:val="1"/>
     </w:pPr>
     <w:rPr>
-      <w:rFonts w:asciiTheme="majorHAnsi" w:eastAsiaTheme="majorEastAsia" w:hAnsiTheme="majorHAnsi" w:cstheme="majorBidi"/>
+      <w:rFonts w:asciiTheme="majorHAnsi" w:eastAsiaTheme="majorEastAsia" w:hAnsiTheme="majorHAnsi" w:cstheme="majorBidi" w:ascii="Arial" w:hAnsi="Arial" w:eastAsia="Malgun Gothic"/>
       <w:b/>
       <w:bCs/>
-      <w:color w:val="4F81BD" w:themeColor="accent1"/>
-      <w:sz w:val="26"/>
+      <w:color w:val="14315C"/>
+      <w:sz w:val="24"/>
       <w:szCs w:val="26"/>
     </w:rPr>
   </w:style>
@@ -4502,12 +6092,15 @@
     <w:qFormat/>
     <w:rsid w:val="00FC693F"/>
     <w:pPr>
-      <w:spacing w:line="240" w:lineRule="auto"/>
+      <w:spacing w:line="240" w:lineRule="auto" w:before="60" w:after="160"/>
+      <w:jc w:val="center"/>
     </w:pPr>
     <w:rPr>
+      <w:rFonts w:ascii="Arial" w:hAnsi="Arial" w:eastAsia="Malgun Gothic"/>
       <w:b/>
       <w:bCs/>
-      <w:color w:val="4F81BD" w:themeColor="accent1"/>
+      <w:i w:val="0"/>
+      <w:color w:val="5A5A5A"/>
       <w:sz w:val="18"/>
       <w:szCs w:val="18"/>
     </w:rPr>

</xml_diff>